<commit_message>
docs: sync 50 entities ERD, SQL schema 50 tables, clean BM02 template
</commit_message>
<xml_diff>
--- a/docs/docs/SWP490_R2_BM02_Self_Review_Report_1.docx
+++ b/docs/docs/SWP490_R2_BM02_Self_Review_Report_1.docx
@@ -1373,19 +1373,7 @@
             </w:tcMar>
           </w:tcPr>
           <w:p>
-            <w:r>
-              <w:rPr>
-                <w:rFonts w:ascii="Calibri" w:cs="Calibri" w:eastAsia="Calibri" w:hAnsi="Calibri"/>
-                <w:b w:val="false"/>
-                <w:bCs w:val="false"/>
-                <w:i/>
-                <w:iCs/>
-                <w:color w:val="666666"/>
-                <w:sz w:val="19"/>
-                <w:szCs w:val="19"/>
-              </w:rPr>
-              <w:t xml:space="preserve">SR-01</w:t>
-            </w:r>
+            <w:r/>
           </w:p>
         </w:tc>
         <w:tc>
@@ -1405,19 +1393,7 @@
             </w:tcMar>
           </w:tcPr>
           <w:p>
-            <w:r>
-              <w:rPr>
-                <w:rFonts w:ascii="Calibri" w:cs="Calibri" w:eastAsia="Calibri" w:hAnsi="Calibri"/>
-                <w:b w:val="false"/>
-                <w:bCs w:val="false"/>
-                <w:i/>
-                <w:iCs/>
-                <w:color w:val="666666"/>
-                <w:sz w:val="19"/>
-                <w:szCs w:val="19"/>
-              </w:rPr>
-              <w:t xml:space="preserve">Data</w:t>
-            </w:r>
+            <w:r/>
           </w:p>
         </w:tc>
         <w:tc>
@@ -1437,19 +1413,7 @@
             </w:tcMar>
           </w:tcPr>
           <w:p>
-            <w:r>
-              <w:rPr>
-                <w:rFonts w:ascii="Calibri" w:cs="Calibri" w:eastAsia="Calibri" w:hAnsi="Calibri"/>
-                <w:b w:val="false"/>
-                <w:bCs w:val="false"/>
-                <w:i/>
-                <w:iCs/>
-                <w:color w:val="666666"/>
-                <w:sz w:val="19"/>
-                <w:szCs w:val="19"/>
-              </w:rPr>
-              <w:t xml:space="preserve">SDD §4 ERD</w:t>
-            </w:r>
+            <w:r/>
           </w:p>
         </w:tc>
         <w:tc>
@@ -1469,19 +1433,7 @@
             </w:tcMar>
           </w:tcPr>
           <w:p>
-            <w:r>
-              <w:rPr>
-                <w:rFonts w:ascii="Calibri" w:cs="Calibri" w:eastAsia="Calibri" w:hAnsi="Calibri"/>
-                <w:b w:val="false"/>
-                <w:bCs w:val="false"/>
-                <w:i/>
-                <w:iCs/>
-                <w:color w:val="666666"/>
-                <w:sz w:val="19"/>
-                <w:szCs w:val="19"/>
-              </w:rPr>
-              <w:t xml:space="preserve">Entity Voucher used in code but missing from ERD</w:t>
-            </w:r>
+            <w:r/>
           </w:p>
         </w:tc>
         <w:tc>
@@ -1501,19 +1453,7 @@
             </w:tcMar>
           </w:tcPr>
           <w:p>
-            <w:r>
-              <w:rPr>
-                <w:rFonts w:ascii="Calibri" w:cs="Calibri" w:eastAsia="Calibri" w:hAnsi="Calibri"/>
-                <w:b w:val="false"/>
-                <w:bCs w:val="false"/>
-                <w:i/>
-                <w:iCs/>
-                <w:color w:val="666666"/>
-                <w:sz w:val="19"/>
-                <w:szCs w:val="19"/>
-              </w:rPr>
-              <w:t xml:space="preserve">High</w:t>
-            </w:r>
+            <w:r/>
           </w:p>
         </w:tc>
         <w:tc>
@@ -1533,19 +1473,7 @@
             </w:tcMar>
           </w:tcPr>
           <w:p>
-            <w:r>
-              <w:rPr>
-                <w:rFonts w:ascii="Calibri" w:cs="Calibri" w:eastAsia="Calibri" w:hAnsi="Calibri"/>
-                <w:b w:val="false"/>
-                <w:bCs w:val="false"/>
-                <w:i/>
-                <w:iCs/>
-                <w:color w:val="666666"/>
-                <w:sz w:val="19"/>
-                <w:szCs w:val="19"/>
-              </w:rPr>
-              <w:t xml:space="preserve">Voucher.java</w:t>
-            </w:r>
+            <w:r/>
           </w:p>
         </w:tc>
         <w:tc>
@@ -1565,19 +1493,7 @@
             </w:tcMar>
           </w:tcPr>
           <w:p>
-            <w:r>
-              <w:rPr>
-                <w:rFonts w:ascii="Calibri" w:cs="Calibri" w:eastAsia="Calibri" w:hAnsi="Calibri"/>
-                <w:b w:val="false"/>
-                <w:bCs w:val="false"/>
-                <w:i/>
-                <w:iCs/>
-                <w:color w:val="666666"/>
-                <w:sz w:val="19"/>
-                <w:szCs w:val="19"/>
-              </w:rPr>
-              <w:t xml:space="preserve">Fixed – commit a1b2c3d</w:t>
-            </w:r>
+            <w:r/>
           </w:p>
         </w:tc>
       </w:tr>
@@ -1599,18 +1515,7 @@
             </w:tcMar>
           </w:tcPr>
           <w:p>
-            <w:r>
-              <w:rPr>
-                <w:rFonts w:ascii="Calibri" w:cs="Calibri" w:eastAsia="Calibri" w:hAnsi="Calibri"/>
-                <w:b w:val="false"/>
-                <w:bCs w:val="false"/>
-                <w:i w:val="false"/>
-                <w:iCs w:val="false"/>
-                <w:sz w:val="19"/>
-                <w:szCs w:val="19"/>
-              </w:rPr>
-              <w:t xml:space="preserve"/>
-            </w:r>
+            <w:r/>
           </w:p>
         </w:tc>
         <w:tc>
@@ -1630,18 +1535,7 @@
             </w:tcMar>
           </w:tcPr>
           <w:p>
-            <w:r>
-              <w:rPr>
-                <w:rFonts w:ascii="Calibri" w:cs="Calibri" w:eastAsia="Calibri" w:hAnsi="Calibri"/>
-                <w:b w:val="false"/>
-                <w:bCs w:val="false"/>
-                <w:i w:val="false"/>
-                <w:iCs w:val="false"/>
-                <w:sz w:val="19"/>
-                <w:szCs w:val="19"/>
-              </w:rPr>
-              <w:t xml:space="preserve"/>
-            </w:r>
+            <w:r/>
           </w:p>
         </w:tc>
         <w:tc>
@@ -1661,18 +1555,7 @@
             </w:tcMar>
           </w:tcPr>
           <w:p>
-            <w:r>
-              <w:rPr>
-                <w:rFonts w:ascii="Calibri" w:cs="Calibri" w:eastAsia="Calibri" w:hAnsi="Calibri"/>
-                <w:b w:val="false"/>
-                <w:bCs w:val="false"/>
-                <w:i w:val="false"/>
-                <w:iCs w:val="false"/>
-                <w:sz w:val="19"/>
-                <w:szCs w:val="19"/>
-              </w:rPr>
-              <w:t xml:space="preserve"/>
-            </w:r>
+            <w:r/>
           </w:p>
         </w:tc>
         <w:tc>
@@ -1692,18 +1575,7 @@
             </w:tcMar>
           </w:tcPr>
           <w:p>
-            <w:r>
-              <w:rPr>
-                <w:rFonts w:ascii="Calibri" w:cs="Calibri" w:eastAsia="Calibri" w:hAnsi="Calibri"/>
-                <w:b w:val="false"/>
-                <w:bCs w:val="false"/>
-                <w:i w:val="false"/>
-                <w:iCs w:val="false"/>
-                <w:sz w:val="19"/>
-                <w:szCs w:val="19"/>
-              </w:rPr>
-              <w:t xml:space="preserve"/>
-            </w:r>
+            <w:r/>
           </w:p>
         </w:tc>
         <w:tc>
@@ -1723,18 +1595,7 @@
             </w:tcMar>
           </w:tcPr>
           <w:p>
-            <w:r>
-              <w:rPr>
-                <w:rFonts w:ascii="Calibri" w:cs="Calibri" w:eastAsia="Calibri" w:hAnsi="Calibri"/>
-                <w:b w:val="false"/>
-                <w:bCs w:val="false"/>
-                <w:i w:val="false"/>
-                <w:iCs w:val="false"/>
-                <w:sz w:val="19"/>
-                <w:szCs w:val="19"/>
-              </w:rPr>
-              <w:t xml:space="preserve"/>
-            </w:r>
+            <w:r/>
           </w:p>
         </w:tc>
         <w:tc>
@@ -1754,18 +1615,7 @@
             </w:tcMar>
           </w:tcPr>
           <w:p>
-            <w:r>
-              <w:rPr>
-                <w:rFonts w:ascii="Calibri" w:cs="Calibri" w:eastAsia="Calibri" w:hAnsi="Calibri"/>
-                <w:b w:val="false"/>
-                <w:bCs w:val="false"/>
-                <w:i w:val="false"/>
-                <w:iCs w:val="false"/>
-                <w:sz w:val="19"/>
-                <w:szCs w:val="19"/>
-              </w:rPr>
-              <w:t xml:space="preserve"/>
-            </w:r>
+            <w:r/>
           </w:p>
         </w:tc>
         <w:tc>
@@ -1785,18 +1635,7 @@
             </w:tcMar>
           </w:tcPr>
           <w:p>
-            <w:r>
-              <w:rPr>
-                <w:rFonts w:ascii="Calibri" w:cs="Calibri" w:eastAsia="Calibri" w:hAnsi="Calibri"/>
-                <w:b w:val="false"/>
-                <w:bCs w:val="false"/>
-                <w:i w:val="false"/>
-                <w:iCs w:val="false"/>
-                <w:sz w:val="19"/>
-                <w:szCs w:val="19"/>
-              </w:rPr>
-              <w:t xml:space="preserve"/>
-            </w:r>
+            <w:r/>
           </w:p>
         </w:tc>
       </w:tr>
@@ -1818,18 +1657,7 @@
             </w:tcMar>
           </w:tcPr>
           <w:p>
-            <w:r>
-              <w:rPr>
-                <w:rFonts w:ascii="Calibri" w:cs="Calibri" w:eastAsia="Calibri" w:hAnsi="Calibri"/>
-                <w:b w:val="false"/>
-                <w:bCs w:val="false"/>
-                <w:i w:val="false"/>
-                <w:iCs w:val="false"/>
-                <w:sz w:val="19"/>
-                <w:szCs w:val="19"/>
-              </w:rPr>
-              <w:t xml:space="preserve"/>
-            </w:r>
+            <w:r/>
           </w:p>
         </w:tc>
         <w:tc>
@@ -1849,18 +1677,7 @@
             </w:tcMar>
           </w:tcPr>
           <w:p>
-            <w:r>
-              <w:rPr>
-                <w:rFonts w:ascii="Calibri" w:cs="Calibri" w:eastAsia="Calibri" w:hAnsi="Calibri"/>
-                <w:b w:val="false"/>
-                <w:bCs w:val="false"/>
-                <w:i w:val="false"/>
-                <w:iCs w:val="false"/>
-                <w:sz w:val="19"/>
-                <w:szCs w:val="19"/>
-              </w:rPr>
-              <w:t xml:space="preserve"/>
-            </w:r>
+            <w:r/>
           </w:p>
         </w:tc>
         <w:tc>
@@ -1880,18 +1697,7 @@
             </w:tcMar>
           </w:tcPr>
           <w:p>
-            <w:r>
-              <w:rPr>
-                <w:rFonts w:ascii="Calibri" w:cs="Calibri" w:eastAsia="Calibri" w:hAnsi="Calibri"/>
-                <w:b w:val="false"/>
-                <w:bCs w:val="false"/>
-                <w:i w:val="false"/>
-                <w:iCs w:val="false"/>
-                <w:sz w:val="19"/>
-                <w:szCs w:val="19"/>
-              </w:rPr>
-              <w:t xml:space="preserve"/>
-            </w:r>
+            <w:r/>
           </w:p>
         </w:tc>
         <w:tc>
@@ -1911,18 +1717,7 @@
             </w:tcMar>
           </w:tcPr>
           <w:p>
-            <w:r>
-              <w:rPr>
-                <w:rFonts w:ascii="Calibri" w:cs="Calibri" w:eastAsia="Calibri" w:hAnsi="Calibri"/>
-                <w:b w:val="false"/>
-                <w:bCs w:val="false"/>
-                <w:i w:val="false"/>
-                <w:iCs w:val="false"/>
-                <w:sz w:val="19"/>
-                <w:szCs w:val="19"/>
-              </w:rPr>
-              <w:t xml:space="preserve"/>
-            </w:r>
+            <w:r/>
           </w:p>
         </w:tc>
         <w:tc>
@@ -1942,18 +1737,7 @@
             </w:tcMar>
           </w:tcPr>
           <w:p>
-            <w:r>
-              <w:rPr>
-                <w:rFonts w:ascii="Calibri" w:cs="Calibri" w:eastAsia="Calibri" w:hAnsi="Calibri"/>
-                <w:b w:val="false"/>
-                <w:bCs w:val="false"/>
-                <w:i w:val="false"/>
-                <w:iCs w:val="false"/>
-                <w:sz w:val="19"/>
-                <w:szCs w:val="19"/>
-              </w:rPr>
-              <w:t xml:space="preserve"/>
-            </w:r>
+            <w:r/>
           </w:p>
         </w:tc>
         <w:tc>
@@ -1973,18 +1757,7 @@
             </w:tcMar>
           </w:tcPr>
           <w:p>
-            <w:r>
-              <w:rPr>
-                <w:rFonts w:ascii="Calibri" w:cs="Calibri" w:eastAsia="Calibri" w:hAnsi="Calibri"/>
-                <w:b w:val="false"/>
-                <w:bCs w:val="false"/>
-                <w:i w:val="false"/>
-                <w:iCs w:val="false"/>
-                <w:sz w:val="19"/>
-                <w:szCs w:val="19"/>
-              </w:rPr>
-              <w:t xml:space="preserve"/>
-            </w:r>
+            <w:r/>
           </w:p>
         </w:tc>
         <w:tc>
@@ -2004,18 +1777,7 @@
             </w:tcMar>
           </w:tcPr>
           <w:p>
-            <w:r>
-              <w:rPr>
-                <w:rFonts w:ascii="Calibri" w:cs="Calibri" w:eastAsia="Calibri" w:hAnsi="Calibri"/>
-                <w:b w:val="false"/>
-                <w:bCs w:val="false"/>
-                <w:i w:val="false"/>
-                <w:iCs w:val="false"/>
-                <w:sz w:val="19"/>
-                <w:szCs w:val="19"/>
-              </w:rPr>
-              <w:t xml:space="preserve"/>
-            </w:r>
+            <w:r/>
           </w:p>
         </w:tc>
       </w:tr>
@@ -2037,18 +1799,7 @@
             </w:tcMar>
           </w:tcPr>
           <w:p>
-            <w:r>
-              <w:rPr>
-                <w:rFonts w:ascii="Calibri" w:cs="Calibri" w:eastAsia="Calibri" w:hAnsi="Calibri"/>
-                <w:b w:val="false"/>
-                <w:bCs w:val="false"/>
-                <w:i w:val="false"/>
-                <w:iCs w:val="false"/>
-                <w:sz w:val="19"/>
-                <w:szCs w:val="19"/>
-              </w:rPr>
-              <w:t xml:space="preserve"/>
-            </w:r>
+            <w:r/>
           </w:p>
         </w:tc>
         <w:tc>
@@ -2068,18 +1819,7 @@
             </w:tcMar>
           </w:tcPr>
           <w:p>
-            <w:r>
-              <w:rPr>
-                <w:rFonts w:ascii="Calibri" w:cs="Calibri" w:eastAsia="Calibri" w:hAnsi="Calibri"/>
-                <w:b w:val="false"/>
-                <w:bCs w:val="false"/>
-                <w:i w:val="false"/>
-                <w:iCs w:val="false"/>
-                <w:sz w:val="19"/>
-                <w:szCs w:val="19"/>
-              </w:rPr>
-              <w:t xml:space="preserve"/>
-            </w:r>
+            <w:r/>
           </w:p>
         </w:tc>
         <w:tc>
@@ -2099,18 +1839,7 @@
             </w:tcMar>
           </w:tcPr>
           <w:p>
-            <w:r>
-              <w:rPr>
-                <w:rFonts w:ascii="Calibri" w:cs="Calibri" w:eastAsia="Calibri" w:hAnsi="Calibri"/>
-                <w:b w:val="false"/>
-                <w:bCs w:val="false"/>
-                <w:i w:val="false"/>
-                <w:iCs w:val="false"/>
-                <w:sz w:val="19"/>
-                <w:szCs w:val="19"/>
-              </w:rPr>
-              <w:t xml:space="preserve"/>
-            </w:r>
+            <w:r/>
           </w:p>
         </w:tc>
         <w:tc>
@@ -2130,18 +1859,7 @@
             </w:tcMar>
           </w:tcPr>
           <w:p>
-            <w:r>
-              <w:rPr>
-                <w:rFonts w:ascii="Calibri" w:cs="Calibri" w:eastAsia="Calibri" w:hAnsi="Calibri"/>
-                <w:b w:val="false"/>
-                <w:bCs w:val="false"/>
-                <w:i w:val="false"/>
-                <w:iCs w:val="false"/>
-                <w:sz w:val="19"/>
-                <w:szCs w:val="19"/>
-              </w:rPr>
-              <w:t xml:space="preserve"/>
-            </w:r>
+            <w:r/>
           </w:p>
         </w:tc>
         <w:tc>
@@ -2161,18 +1879,7 @@
             </w:tcMar>
           </w:tcPr>
           <w:p>
-            <w:r>
-              <w:rPr>
-                <w:rFonts w:ascii="Calibri" w:cs="Calibri" w:eastAsia="Calibri" w:hAnsi="Calibri"/>
-                <w:b w:val="false"/>
-                <w:bCs w:val="false"/>
-                <w:i w:val="false"/>
-                <w:iCs w:val="false"/>
-                <w:sz w:val="19"/>
-                <w:szCs w:val="19"/>
-              </w:rPr>
-              <w:t xml:space="preserve"/>
-            </w:r>
+            <w:r/>
           </w:p>
         </w:tc>
         <w:tc>
@@ -2192,18 +1899,7 @@
             </w:tcMar>
           </w:tcPr>
           <w:p>
-            <w:r>
-              <w:rPr>
-                <w:rFonts w:ascii="Calibri" w:cs="Calibri" w:eastAsia="Calibri" w:hAnsi="Calibri"/>
-                <w:b w:val="false"/>
-                <w:bCs w:val="false"/>
-                <w:i w:val="false"/>
-                <w:iCs w:val="false"/>
-                <w:sz w:val="19"/>
-                <w:szCs w:val="19"/>
-              </w:rPr>
-              <w:t xml:space="preserve"/>
-            </w:r>
+            <w:r/>
           </w:p>
         </w:tc>
         <w:tc>
@@ -2223,18 +1919,7 @@
             </w:tcMar>
           </w:tcPr>
           <w:p>
-            <w:r>
-              <w:rPr>
-                <w:rFonts w:ascii="Calibri" w:cs="Calibri" w:eastAsia="Calibri" w:hAnsi="Calibri"/>
-                <w:b w:val="false"/>
-                <w:bCs w:val="false"/>
-                <w:i w:val="false"/>
-                <w:iCs w:val="false"/>
-                <w:sz w:val="19"/>
-                <w:szCs w:val="19"/>
-              </w:rPr>
-              <w:t xml:space="preserve"/>
-            </w:r>
+            <w:r/>
           </w:p>
         </w:tc>
       </w:tr>
@@ -2256,18 +1941,7 @@
             </w:tcMar>
           </w:tcPr>
           <w:p>
-            <w:r>
-              <w:rPr>
-                <w:rFonts w:ascii="Calibri" w:cs="Calibri" w:eastAsia="Calibri" w:hAnsi="Calibri"/>
-                <w:b w:val="false"/>
-                <w:bCs w:val="false"/>
-                <w:i w:val="false"/>
-                <w:iCs w:val="false"/>
-                <w:sz w:val="19"/>
-                <w:szCs w:val="19"/>
-              </w:rPr>
-              <w:t xml:space="preserve"/>
-            </w:r>
+            <w:r/>
           </w:p>
         </w:tc>
         <w:tc>
@@ -2287,18 +1961,7 @@
             </w:tcMar>
           </w:tcPr>
           <w:p>
-            <w:r>
-              <w:rPr>
-                <w:rFonts w:ascii="Calibri" w:cs="Calibri" w:eastAsia="Calibri" w:hAnsi="Calibri"/>
-                <w:b w:val="false"/>
-                <w:bCs w:val="false"/>
-                <w:i w:val="false"/>
-                <w:iCs w:val="false"/>
-                <w:sz w:val="19"/>
-                <w:szCs w:val="19"/>
-              </w:rPr>
-              <w:t xml:space="preserve"/>
-            </w:r>
+            <w:r/>
           </w:p>
         </w:tc>
         <w:tc>
@@ -2318,18 +1981,7 @@
             </w:tcMar>
           </w:tcPr>
           <w:p>
-            <w:r>
-              <w:rPr>
-                <w:rFonts w:ascii="Calibri" w:cs="Calibri" w:eastAsia="Calibri" w:hAnsi="Calibri"/>
-                <w:b w:val="false"/>
-                <w:bCs w:val="false"/>
-                <w:i w:val="false"/>
-                <w:iCs w:val="false"/>
-                <w:sz w:val="19"/>
-                <w:szCs w:val="19"/>
-              </w:rPr>
-              <w:t xml:space="preserve"/>
-            </w:r>
+            <w:r/>
           </w:p>
         </w:tc>
         <w:tc>
@@ -2349,18 +2001,7 @@
             </w:tcMar>
           </w:tcPr>
           <w:p>
-            <w:r>
-              <w:rPr>
-                <w:rFonts w:ascii="Calibri" w:cs="Calibri" w:eastAsia="Calibri" w:hAnsi="Calibri"/>
-                <w:b w:val="false"/>
-                <w:bCs w:val="false"/>
-                <w:i w:val="false"/>
-                <w:iCs w:val="false"/>
-                <w:sz w:val="19"/>
-                <w:szCs w:val="19"/>
-              </w:rPr>
-              <w:t xml:space="preserve"/>
-            </w:r>
+            <w:r/>
           </w:p>
         </w:tc>
         <w:tc>
@@ -2380,18 +2021,7 @@
             </w:tcMar>
           </w:tcPr>
           <w:p>
-            <w:r>
-              <w:rPr>
-                <w:rFonts w:ascii="Calibri" w:cs="Calibri" w:eastAsia="Calibri" w:hAnsi="Calibri"/>
-                <w:b w:val="false"/>
-                <w:bCs w:val="false"/>
-                <w:i w:val="false"/>
-                <w:iCs w:val="false"/>
-                <w:sz w:val="19"/>
-                <w:szCs w:val="19"/>
-              </w:rPr>
-              <w:t xml:space="preserve"/>
-            </w:r>
+            <w:r/>
           </w:p>
         </w:tc>
         <w:tc>
@@ -2411,18 +2041,7 @@
             </w:tcMar>
           </w:tcPr>
           <w:p>
-            <w:r>
-              <w:rPr>
-                <w:rFonts w:ascii="Calibri" w:cs="Calibri" w:eastAsia="Calibri" w:hAnsi="Calibri"/>
-                <w:b w:val="false"/>
-                <w:bCs w:val="false"/>
-                <w:i w:val="false"/>
-                <w:iCs w:val="false"/>
-                <w:sz w:val="19"/>
-                <w:szCs w:val="19"/>
-              </w:rPr>
-              <w:t xml:space="preserve"/>
-            </w:r>
+            <w:r/>
           </w:p>
         </w:tc>
         <w:tc>
@@ -2442,18 +2061,7 @@
             </w:tcMar>
           </w:tcPr>
           <w:p>
-            <w:r>
-              <w:rPr>
-                <w:rFonts w:ascii="Calibri" w:cs="Calibri" w:eastAsia="Calibri" w:hAnsi="Calibri"/>
-                <w:b w:val="false"/>
-                <w:bCs w:val="false"/>
-                <w:i w:val="false"/>
-                <w:iCs w:val="false"/>
-                <w:sz w:val="19"/>
-                <w:szCs w:val="19"/>
-              </w:rPr>
-              <w:t xml:space="preserve"/>
-            </w:r>
+            <w:r/>
           </w:p>
         </w:tc>
       </w:tr>
@@ -2475,18 +2083,7 @@
             </w:tcMar>
           </w:tcPr>
           <w:p>
-            <w:r>
-              <w:rPr>
-                <w:rFonts w:ascii="Calibri" w:cs="Calibri" w:eastAsia="Calibri" w:hAnsi="Calibri"/>
-                <w:b w:val="false"/>
-                <w:bCs w:val="false"/>
-                <w:i w:val="false"/>
-                <w:iCs w:val="false"/>
-                <w:sz w:val="19"/>
-                <w:szCs w:val="19"/>
-              </w:rPr>
-              <w:t xml:space="preserve"/>
-            </w:r>
+            <w:r/>
           </w:p>
         </w:tc>
         <w:tc>
@@ -2506,18 +2103,7 @@
             </w:tcMar>
           </w:tcPr>
           <w:p>
-            <w:r>
-              <w:rPr>
-                <w:rFonts w:ascii="Calibri" w:cs="Calibri" w:eastAsia="Calibri" w:hAnsi="Calibri"/>
-                <w:b w:val="false"/>
-                <w:bCs w:val="false"/>
-                <w:i w:val="false"/>
-                <w:iCs w:val="false"/>
-                <w:sz w:val="19"/>
-                <w:szCs w:val="19"/>
-              </w:rPr>
-              <w:t xml:space="preserve"/>
-            </w:r>
+            <w:r/>
           </w:p>
         </w:tc>
         <w:tc>
@@ -2537,18 +2123,7 @@
             </w:tcMar>
           </w:tcPr>
           <w:p>
-            <w:r>
-              <w:rPr>
-                <w:rFonts w:ascii="Calibri" w:cs="Calibri" w:eastAsia="Calibri" w:hAnsi="Calibri"/>
-                <w:b w:val="false"/>
-                <w:bCs w:val="false"/>
-                <w:i w:val="false"/>
-                <w:iCs w:val="false"/>
-                <w:sz w:val="19"/>
-                <w:szCs w:val="19"/>
-              </w:rPr>
-              <w:t xml:space="preserve"/>
-            </w:r>
+            <w:r/>
           </w:p>
         </w:tc>
         <w:tc>
@@ -2568,18 +2143,7 @@
             </w:tcMar>
           </w:tcPr>
           <w:p>
-            <w:r>
-              <w:rPr>
-                <w:rFonts w:ascii="Calibri" w:cs="Calibri" w:eastAsia="Calibri" w:hAnsi="Calibri"/>
-                <w:b w:val="false"/>
-                <w:bCs w:val="false"/>
-                <w:i w:val="false"/>
-                <w:iCs w:val="false"/>
-                <w:sz w:val="19"/>
-                <w:szCs w:val="19"/>
-              </w:rPr>
-              <w:t xml:space="preserve"/>
-            </w:r>
+            <w:r/>
           </w:p>
         </w:tc>
         <w:tc>
@@ -2599,18 +2163,7 @@
             </w:tcMar>
           </w:tcPr>
           <w:p>
-            <w:r>
-              <w:rPr>
-                <w:rFonts w:ascii="Calibri" w:cs="Calibri" w:eastAsia="Calibri" w:hAnsi="Calibri"/>
-                <w:b w:val="false"/>
-                <w:bCs w:val="false"/>
-                <w:i w:val="false"/>
-                <w:iCs w:val="false"/>
-                <w:sz w:val="19"/>
-                <w:szCs w:val="19"/>
-              </w:rPr>
-              <w:t xml:space="preserve"/>
-            </w:r>
+            <w:r/>
           </w:p>
         </w:tc>
         <w:tc>
@@ -2630,18 +2183,7 @@
             </w:tcMar>
           </w:tcPr>
           <w:p>
-            <w:r>
-              <w:rPr>
-                <w:rFonts w:ascii="Calibri" w:cs="Calibri" w:eastAsia="Calibri" w:hAnsi="Calibri"/>
-                <w:b w:val="false"/>
-                <w:bCs w:val="false"/>
-                <w:i w:val="false"/>
-                <w:iCs w:val="false"/>
-                <w:sz w:val="19"/>
-                <w:szCs w:val="19"/>
-              </w:rPr>
-              <w:t xml:space="preserve"/>
-            </w:r>
+            <w:r/>
           </w:p>
         </w:tc>
         <w:tc>
@@ -2661,18 +2203,7 @@
             </w:tcMar>
           </w:tcPr>
           <w:p>
-            <w:r>
-              <w:rPr>
-                <w:rFonts w:ascii="Calibri" w:cs="Calibri" w:eastAsia="Calibri" w:hAnsi="Calibri"/>
-                <w:b w:val="false"/>
-                <w:bCs w:val="false"/>
-                <w:i w:val="false"/>
-                <w:iCs w:val="false"/>
-                <w:sz w:val="19"/>
-                <w:szCs w:val="19"/>
-              </w:rPr>
-              <w:t xml:space="preserve"/>
-            </w:r>
+            <w:r/>
           </w:p>
         </w:tc>
       </w:tr>
@@ -2694,18 +2225,7 @@
             </w:tcMar>
           </w:tcPr>
           <w:p>
-            <w:r>
-              <w:rPr>
-                <w:rFonts w:ascii="Calibri" w:cs="Calibri" w:eastAsia="Calibri" w:hAnsi="Calibri"/>
-                <w:b w:val="false"/>
-                <w:bCs w:val="false"/>
-                <w:i w:val="false"/>
-                <w:iCs w:val="false"/>
-                <w:sz w:val="19"/>
-                <w:szCs w:val="19"/>
-              </w:rPr>
-              <w:t xml:space="preserve"/>
-            </w:r>
+            <w:r/>
           </w:p>
         </w:tc>
         <w:tc>
@@ -2725,18 +2245,7 @@
             </w:tcMar>
           </w:tcPr>
           <w:p>
-            <w:r>
-              <w:rPr>
-                <w:rFonts w:ascii="Calibri" w:cs="Calibri" w:eastAsia="Calibri" w:hAnsi="Calibri"/>
-                <w:b w:val="false"/>
-                <w:bCs w:val="false"/>
-                <w:i w:val="false"/>
-                <w:iCs w:val="false"/>
-                <w:sz w:val="19"/>
-                <w:szCs w:val="19"/>
-              </w:rPr>
-              <w:t xml:space="preserve"/>
-            </w:r>
+            <w:r/>
           </w:p>
         </w:tc>
         <w:tc>
@@ -2756,18 +2265,7 @@
             </w:tcMar>
           </w:tcPr>
           <w:p>
-            <w:r>
-              <w:rPr>
-                <w:rFonts w:ascii="Calibri" w:cs="Calibri" w:eastAsia="Calibri" w:hAnsi="Calibri"/>
-                <w:b w:val="false"/>
-                <w:bCs w:val="false"/>
-                <w:i w:val="false"/>
-                <w:iCs w:val="false"/>
-                <w:sz w:val="19"/>
-                <w:szCs w:val="19"/>
-              </w:rPr>
-              <w:t xml:space="preserve"/>
-            </w:r>
+            <w:r/>
           </w:p>
         </w:tc>
         <w:tc>
@@ -2787,18 +2285,7 @@
             </w:tcMar>
           </w:tcPr>
           <w:p>
-            <w:r>
-              <w:rPr>
-                <w:rFonts w:ascii="Calibri" w:cs="Calibri" w:eastAsia="Calibri" w:hAnsi="Calibri"/>
-                <w:b w:val="false"/>
-                <w:bCs w:val="false"/>
-                <w:i w:val="false"/>
-                <w:iCs w:val="false"/>
-                <w:sz w:val="19"/>
-                <w:szCs w:val="19"/>
-              </w:rPr>
-              <w:t xml:space="preserve"/>
-            </w:r>
+            <w:r/>
           </w:p>
         </w:tc>
         <w:tc>
@@ -2818,18 +2305,7 @@
             </w:tcMar>
           </w:tcPr>
           <w:p>
-            <w:r>
-              <w:rPr>
-                <w:rFonts w:ascii="Calibri" w:cs="Calibri" w:eastAsia="Calibri" w:hAnsi="Calibri"/>
-                <w:b w:val="false"/>
-                <w:bCs w:val="false"/>
-                <w:i w:val="false"/>
-                <w:iCs w:val="false"/>
-                <w:sz w:val="19"/>
-                <w:szCs w:val="19"/>
-              </w:rPr>
-              <w:t xml:space="preserve"/>
-            </w:r>
+            <w:r/>
           </w:p>
         </w:tc>
         <w:tc>
@@ -2849,18 +2325,7 @@
             </w:tcMar>
           </w:tcPr>
           <w:p>
-            <w:r>
-              <w:rPr>
-                <w:rFonts w:ascii="Calibri" w:cs="Calibri" w:eastAsia="Calibri" w:hAnsi="Calibri"/>
-                <w:b w:val="false"/>
-                <w:bCs w:val="false"/>
-                <w:i w:val="false"/>
-                <w:iCs w:val="false"/>
-                <w:sz w:val="19"/>
-                <w:szCs w:val="19"/>
-              </w:rPr>
-              <w:t xml:space="preserve"/>
-            </w:r>
+            <w:r/>
           </w:p>
         </w:tc>
         <w:tc>
@@ -2880,18 +2345,7 @@
             </w:tcMar>
           </w:tcPr>
           <w:p>
-            <w:r>
-              <w:rPr>
-                <w:rFonts w:ascii="Calibri" w:cs="Calibri" w:eastAsia="Calibri" w:hAnsi="Calibri"/>
-                <w:b w:val="false"/>
-                <w:bCs w:val="false"/>
-                <w:i w:val="false"/>
-                <w:iCs w:val="false"/>
-                <w:sz w:val="19"/>
-                <w:szCs w:val="19"/>
-              </w:rPr>
-              <w:t xml:space="preserve"/>
-            </w:r>
+            <w:r/>
           </w:p>
         </w:tc>
       </w:tr>
@@ -2913,18 +2367,7 @@
             </w:tcMar>
           </w:tcPr>
           <w:p>
-            <w:r>
-              <w:rPr>
-                <w:rFonts w:ascii="Calibri" w:cs="Calibri" w:eastAsia="Calibri" w:hAnsi="Calibri"/>
-                <w:b w:val="false"/>
-                <w:bCs w:val="false"/>
-                <w:i w:val="false"/>
-                <w:iCs w:val="false"/>
-                <w:sz w:val="19"/>
-                <w:szCs w:val="19"/>
-              </w:rPr>
-              <w:t xml:space="preserve"/>
-            </w:r>
+            <w:r/>
           </w:p>
         </w:tc>
         <w:tc>
@@ -2944,18 +2387,7 @@
             </w:tcMar>
           </w:tcPr>
           <w:p>
-            <w:r>
-              <w:rPr>
-                <w:rFonts w:ascii="Calibri" w:cs="Calibri" w:eastAsia="Calibri" w:hAnsi="Calibri"/>
-                <w:b w:val="false"/>
-                <w:bCs w:val="false"/>
-                <w:i w:val="false"/>
-                <w:iCs w:val="false"/>
-                <w:sz w:val="19"/>
-                <w:szCs w:val="19"/>
-              </w:rPr>
-              <w:t xml:space="preserve"/>
-            </w:r>
+            <w:r/>
           </w:p>
         </w:tc>
         <w:tc>
@@ -2975,18 +2407,7 @@
             </w:tcMar>
           </w:tcPr>
           <w:p>
-            <w:r>
-              <w:rPr>
-                <w:rFonts w:ascii="Calibri" w:cs="Calibri" w:eastAsia="Calibri" w:hAnsi="Calibri"/>
-                <w:b w:val="false"/>
-                <w:bCs w:val="false"/>
-                <w:i w:val="false"/>
-                <w:iCs w:val="false"/>
-                <w:sz w:val="19"/>
-                <w:szCs w:val="19"/>
-              </w:rPr>
-              <w:t xml:space="preserve"/>
-            </w:r>
+            <w:r/>
           </w:p>
         </w:tc>
         <w:tc>
@@ -3006,18 +2427,7 @@
             </w:tcMar>
           </w:tcPr>
           <w:p>
-            <w:r>
-              <w:rPr>
-                <w:rFonts w:ascii="Calibri" w:cs="Calibri" w:eastAsia="Calibri" w:hAnsi="Calibri"/>
-                <w:b w:val="false"/>
-                <w:bCs w:val="false"/>
-                <w:i w:val="false"/>
-                <w:iCs w:val="false"/>
-                <w:sz w:val="19"/>
-                <w:szCs w:val="19"/>
-              </w:rPr>
-              <w:t xml:space="preserve"/>
-            </w:r>
+            <w:r/>
           </w:p>
         </w:tc>
         <w:tc>
@@ -3037,18 +2447,7 @@
             </w:tcMar>
           </w:tcPr>
           <w:p>
-            <w:r>
-              <w:rPr>
-                <w:rFonts w:ascii="Calibri" w:cs="Calibri" w:eastAsia="Calibri" w:hAnsi="Calibri"/>
-                <w:b w:val="false"/>
-                <w:bCs w:val="false"/>
-                <w:i w:val="false"/>
-                <w:iCs w:val="false"/>
-                <w:sz w:val="19"/>
-                <w:szCs w:val="19"/>
-              </w:rPr>
-              <w:t xml:space="preserve"/>
-            </w:r>
+            <w:r/>
           </w:p>
         </w:tc>
         <w:tc>
@@ -3068,18 +2467,7 @@
             </w:tcMar>
           </w:tcPr>
           <w:p>
-            <w:r>
-              <w:rPr>
-                <w:rFonts w:ascii="Calibri" w:cs="Calibri" w:eastAsia="Calibri" w:hAnsi="Calibri"/>
-                <w:b w:val="false"/>
-                <w:bCs w:val="false"/>
-                <w:i w:val="false"/>
-                <w:iCs w:val="false"/>
-                <w:sz w:val="19"/>
-                <w:szCs w:val="19"/>
-              </w:rPr>
-              <w:t xml:space="preserve"/>
-            </w:r>
+            <w:r/>
           </w:p>
         </w:tc>
         <w:tc>
@@ -3099,18 +2487,7 @@
             </w:tcMar>
           </w:tcPr>
           <w:p>
-            <w:r>
-              <w:rPr>
-                <w:rFonts w:ascii="Calibri" w:cs="Calibri" w:eastAsia="Calibri" w:hAnsi="Calibri"/>
-                <w:b w:val="false"/>
-                <w:bCs w:val="false"/>
-                <w:i w:val="false"/>
-                <w:iCs w:val="false"/>
-                <w:sz w:val="19"/>
-                <w:szCs w:val="19"/>
-              </w:rPr>
-              <w:t xml:space="preserve"/>
-            </w:r>
+            <w:r/>
           </w:p>
         </w:tc>
       </w:tr>
@@ -3132,18 +2509,7 @@
             </w:tcMar>
           </w:tcPr>
           <w:p>
-            <w:r>
-              <w:rPr>
-                <w:rFonts w:ascii="Calibri" w:cs="Calibri" w:eastAsia="Calibri" w:hAnsi="Calibri"/>
-                <w:b w:val="false"/>
-                <w:bCs w:val="false"/>
-                <w:i w:val="false"/>
-                <w:iCs w:val="false"/>
-                <w:sz w:val="19"/>
-                <w:szCs w:val="19"/>
-              </w:rPr>
-              <w:t xml:space="preserve"/>
-            </w:r>
+            <w:r/>
           </w:p>
         </w:tc>
         <w:tc>
@@ -3163,18 +2529,7 @@
             </w:tcMar>
           </w:tcPr>
           <w:p>
-            <w:r>
-              <w:rPr>
-                <w:rFonts w:ascii="Calibri" w:cs="Calibri" w:eastAsia="Calibri" w:hAnsi="Calibri"/>
-                <w:b w:val="false"/>
-                <w:bCs w:val="false"/>
-                <w:i w:val="false"/>
-                <w:iCs w:val="false"/>
-                <w:sz w:val="19"/>
-                <w:szCs w:val="19"/>
-              </w:rPr>
-              <w:t xml:space="preserve"/>
-            </w:r>
+            <w:r/>
           </w:p>
         </w:tc>
         <w:tc>
@@ -3194,18 +2549,7 @@
             </w:tcMar>
           </w:tcPr>
           <w:p>
-            <w:r>
-              <w:rPr>
-                <w:rFonts w:ascii="Calibri" w:cs="Calibri" w:eastAsia="Calibri" w:hAnsi="Calibri"/>
-                <w:b w:val="false"/>
-                <w:bCs w:val="false"/>
-                <w:i w:val="false"/>
-                <w:iCs w:val="false"/>
-                <w:sz w:val="19"/>
-                <w:szCs w:val="19"/>
-              </w:rPr>
-              <w:t xml:space="preserve"/>
-            </w:r>
+            <w:r/>
           </w:p>
         </w:tc>
         <w:tc>
@@ -3225,18 +2569,7 @@
             </w:tcMar>
           </w:tcPr>
           <w:p>
-            <w:r>
-              <w:rPr>
-                <w:rFonts w:ascii="Calibri" w:cs="Calibri" w:eastAsia="Calibri" w:hAnsi="Calibri"/>
-                <w:b w:val="false"/>
-                <w:bCs w:val="false"/>
-                <w:i w:val="false"/>
-                <w:iCs w:val="false"/>
-                <w:sz w:val="19"/>
-                <w:szCs w:val="19"/>
-              </w:rPr>
-              <w:t xml:space="preserve"/>
-            </w:r>
+            <w:r/>
           </w:p>
         </w:tc>
         <w:tc>
@@ -3256,18 +2589,7 @@
             </w:tcMar>
           </w:tcPr>
           <w:p>
-            <w:r>
-              <w:rPr>
-                <w:rFonts w:ascii="Calibri" w:cs="Calibri" w:eastAsia="Calibri" w:hAnsi="Calibri"/>
-                <w:b w:val="false"/>
-                <w:bCs w:val="false"/>
-                <w:i w:val="false"/>
-                <w:iCs w:val="false"/>
-                <w:sz w:val="19"/>
-                <w:szCs w:val="19"/>
-              </w:rPr>
-              <w:t xml:space="preserve"/>
-            </w:r>
+            <w:r/>
           </w:p>
         </w:tc>
         <w:tc>
@@ -3287,18 +2609,7 @@
             </w:tcMar>
           </w:tcPr>
           <w:p>
-            <w:r>
-              <w:rPr>
-                <w:rFonts w:ascii="Calibri" w:cs="Calibri" w:eastAsia="Calibri" w:hAnsi="Calibri"/>
-                <w:b w:val="false"/>
-                <w:bCs w:val="false"/>
-                <w:i w:val="false"/>
-                <w:iCs w:val="false"/>
-                <w:sz w:val="19"/>
-                <w:szCs w:val="19"/>
-              </w:rPr>
-              <w:t xml:space="preserve"/>
-            </w:r>
+            <w:r/>
           </w:p>
         </w:tc>
         <w:tc>
@@ -3318,18 +2629,7 @@
             </w:tcMar>
           </w:tcPr>
           <w:p>
-            <w:r>
-              <w:rPr>
-                <w:rFonts w:ascii="Calibri" w:cs="Calibri" w:eastAsia="Calibri" w:hAnsi="Calibri"/>
-                <w:b w:val="false"/>
-                <w:bCs w:val="false"/>
-                <w:i w:val="false"/>
-                <w:iCs w:val="false"/>
-                <w:sz w:val="19"/>
-                <w:szCs w:val="19"/>
-              </w:rPr>
-              <w:t xml:space="preserve"/>
-            </w:r>
+            <w:r/>
           </w:p>
         </w:tc>
       </w:tr>

</xml_diff>

<commit_message>
docs(bm02): complete SWP490 BM02 Self-Review Report and sync UPDATE.md
</commit_message>
<xml_diff>
--- a/docs/docs/SWP490_R2_BM02_Self_Review_Report_1.docx
+++ b/docs/docs/SWP490_R2_BM02_Self_Review_Report_1.docx
@@ -138,15 +138,10 @@
           <w:p>
             <w:r>
               <w:rPr>
-                <w:rFonts w:ascii="Calibri" w:cs="Calibri" w:eastAsia="Calibri" w:hAnsi="Calibri"/>
-                <w:b w:val="false"/>
-                <w:bCs w:val="false"/>
-                <w:i w:val="false"/>
-                <w:iCs w:val="false"/>
+                <w:rFonts w:ascii="Calibri" w:hAnsi="Calibri"/>
                 <w:sz w:val="19"/>
-                <w:szCs w:val="19"/>
-              </w:rPr>
-              <w:t xml:space="preserve"/>
+              </w:rPr>
+              <w:t>FA26SE090</w:t>
             </w:r>
           </w:p>
         </w:tc>
@@ -204,15 +199,10 @@
           <w:p>
             <w:r>
               <w:rPr>
-                <w:rFonts w:ascii="Calibri" w:cs="Calibri" w:eastAsia="Calibri" w:hAnsi="Calibri"/>
-                <w:b w:val="false"/>
-                <w:bCs w:val="false"/>
-                <w:i w:val="false"/>
-                <w:iCs w:val="false"/>
+                <w:rFonts w:ascii="Calibri" w:hAnsi="Calibri"/>
                 <w:sz w:val="19"/>
-                <w:szCs w:val="19"/>
-              </w:rPr>
-              <w:t xml:space="preserve"/>
+              </w:rPr>
+              <w:t>AI-powered Personalized Learning Path Platform for Competency Assessment Exam Preparation</w:t>
             </w:r>
           </w:p>
         </w:tc>
@@ -270,15 +260,10 @@
           <w:p>
             <w:r>
               <w:rPr>
-                <w:rFonts w:ascii="Calibri" w:cs="Calibri" w:eastAsia="Calibri" w:hAnsi="Calibri"/>
-                <w:b w:val="false"/>
-                <w:bCs w:val="false"/>
-                <w:i w:val="false"/>
-                <w:iCs w:val="false"/>
+                <w:rFonts w:ascii="Calibri" w:hAnsi="Calibri"/>
                 <w:sz w:val="19"/>
-                <w:szCs w:val="19"/>
-              </w:rPr>
-              <w:t xml:space="preserve"/>
+              </w:rPr>
+              <w:t>GFA26SE44</w:t>
             </w:r>
           </w:p>
         </w:tc>
@@ -336,15 +321,10 @@
           <w:p>
             <w:r>
               <w:rPr>
-                <w:rFonts w:ascii="Calibri" w:cs="Calibri" w:eastAsia="Calibri" w:hAnsi="Calibri"/>
-                <w:b w:val="false"/>
-                <w:bCs w:val="false"/>
-                <w:i w:val="false"/>
-                <w:iCs w:val="false"/>
+                <w:rFonts w:ascii="Calibri" w:hAnsi="Calibri"/>
                 <w:sz w:val="19"/>
-                <w:szCs w:val="19"/>
-              </w:rPr>
-              <w:t xml:space="preserve"/>
+              </w:rPr>
+              <w:t>Nguyễn Trọng Tài</w:t>
             </w:r>
           </w:p>
         </w:tc>
@@ -402,15 +382,10 @@
           <w:p>
             <w:r>
               <w:rPr>
-                <w:rFonts w:ascii="Calibri" w:cs="Calibri" w:eastAsia="Calibri" w:hAnsi="Calibri"/>
-                <w:b w:val="false"/>
-                <w:bCs w:val="false"/>
-                <w:i w:val="false"/>
-                <w:iCs w:val="false"/>
+                <w:rFonts w:ascii="Calibri" w:hAnsi="Calibri"/>
                 <w:sz w:val="19"/>
-                <w:szCs w:val="19"/>
-              </w:rPr>
-              <w:t xml:space="preserve"/>
+              </w:rPr>
+              <w:t>Google DeepMind Antigravity (Gemini 3.8 Flash)</w:t>
             </w:r>
           </w:p>
         </w:tc>
@@ -468,15 +443,10 @@
           <w:p>
             <w:r>
               <w:rPr>
-                <w:rFonts w:ascii="Calibri" w:cs="Calibri" w:eastAsia="Calibri" w:hAnsi="Calibri"/>
-                <w:b w:val="false"/>
-                <w:bCs w:val="false"/>
-                <w:i w:val="false"/>
-                <w:iCs w:val="false"/>
+                <w:rFonts w:ascii="Calibri" w:hAnsi="Calibri"/>
                 <w:sz w:val="19"/>
-                <w:szCs w:val="19"/>
-              </w:rPr>
-              <w:t xml:space="preserve"/>
+              </w:rPr>
+              <w:t>27/10/2026</w:t>
             </w:r>
           </w:p>
         </w:tc>
@@ -534,15 +504,10 @@
           <w:p>
             <w:r>
               <w:rPr>
-                <w:rFonts w:ascii="Calibri" w:cs="Calibri" w:eastAsia="Calibri" w:hAnsi="Calibri"/>
-                <w:b w:val="false"/>
-                <w:bCs w:val="false"/>
-                <w:i w:val="false"/>
-                <w:iCs w:val="false"/>
+                <w:rFonts w:ascii="Calibri" w:hAnsi="Calibri"/>
                 <w:sz w:val="19"/>
-                <w:szCs w:val="19"/>
-              </w:rPr>
-              <w:t xml:space="preserve"/>
+              </w:rPr>
+              <w:t>review-2 / 926b5aa1c64b91ad0b5adcba34c08d7a2c22221b</w:t>
             </w:r>
           </w:p>
         </w:tc>
@@ -600,15 +565,10 @@
           <w:p>
             <w:r>
               <w:rPr>
-                <w:rFonts w:ascii="Calibri" w:cs="Calibri" w:eastAsia="Calibri" w:hAnsi="Calibri"/>
-                <w:b w:val="false"/>
-                <w:bCs w:val="false"/>
-                <w:i w:val="false"/>
-                <w:iCs w:val="false"/>
+                <w:rFonts w:ascii="Calibri" w:hAnsi="Calibri"/>
                 <w:sz w:val="19"/>
-                <w:szCs w:val="19"/>
-              </w:rPr>
-              <w:t xml:space="preserve"/>
+              </w:rPr>
+              <w:t>1.1</w:t>
             </w:r>
           </w:p>
         </w:tc>
@@ -666,15 +626,10 @@
           <w:p>
             <w:r>
               <w:rPr>
-                <w:rFonts w:ascii="Calibri" w:cs="Calibri" w:eastAsia="Calibri" w:hAnsi="Calibri"/>
-                <w:b w:val="false"/>
-                <w:bCs w:val="false"/>
-                <w:i w:val="false"/>
-                <w:iCs w:val="false"/>
+                <w:rFonts w:ascii="Calibri" w:hAnsi="Calibri"/>
                 <w:sz w:val="19"/>
-                <w:szCs w:val="19"/>
-              </w:rPr>
-              <w:t xml:space="preserve"/>
+              </w:rPr>
+              <w:t>1.0</w:t>
             </w:r>
           </w:p>
         </w:tc>
@@ -732,15 +687,10 @@
           <w:p>
             <w:r>
               <w:rPr>
-                <w:rFonts w:ascii="Calibri" w:cs="Calibri" w:eastAsia="Calibri" w:hAnsi="Calibri"/>
-                <w:b w:val="false"/>
-                <w:bCs w:val="false"/>
-                <w:i w:val="false"/>
-                <w:iCs w:val="false"/>
+                <w:rFonts w:ascii="Calibri" w:hAnsi="Calibri"/>
                 <w:sz w:val="19"/>
-                <w:szCs w:val="19"/>
-              </w:rPr>
-              <w:t xml:space="preserve"/>
+              </w:rPr>
+              <w:t>27/10/2026</w:t>
             </w:r>
           </w:p>
         </w:tc>
@@ -1359,141 +1309,99 @@
         <w:tc>
           <w:tcPr>
             <w:tcW w:type="dxa" w:w="664"/>
-            <w:tcBorders>
-              <w:top w:val="single" w:color="D9D4CA" w:sz="4"/>
-              <w:left w:val="single" w:color="D9D4CA" w:sz="4"/>
-              <w:bottom w:val="single" w:color="D9D4CA" w:sz="4"/>
-              <w:right w:val="single" w:color="D9D4CA" w:sz="4"/>
-            </w:tcBorders>
-            <w:tcMar>
-              <w:top w:type="dxa" w:w="60"/>
-              <w:left w:type="dxa" w:w="80"/>
-              <w:bottom w:type="dxa" w:w="60"/>
-              <w:right w:type="dxa" w:w="80"/>
-            </w:tcMar>
-          </w:tcPr>
-          <w:p>
-            <w:r/>
+          </w:tcPr>
+          <w:p>
+            <w:r>
+              <w:rPr>
+                <w:rFonts w:ascii="Calibri" w:hAnsi="Calibri"/>
+                <w:sz w:val="17"/>
+              </w:rPr>
+              <w:t>SCO-01</w:t>
+            </w:r>
           </w:p>
         </w:tc>
         <w:tc>
           <w:tcPr>
             <w:tcW w:type="dxa" w:w="1063"/>
-            <w:tcBorders>
-              <w:top w:val="single" w:color="D9D4CA" w:sz="4"/>
-              <w:left w:val="single" w:color="D9D4CA" w:sz="4"/>
-              <w:bottom w:val="single" w:color="D9D4CA" w:sz="4"/>
-              <w:right w:val="single" w:color="D9D4CA" w:sz="4"/>
-            </w:tcBorders>
-            <w:tcMar>
-              <w:top w:type="dxa" w:w="60"/>
-              <w:left w:type="dxa" w:w="80"/>
-              <w:bottom w:type="dxa" w:w="60"/>
-              <w:right w:type="dxa" w:w="80"/>
-            </w:tcMar>
-          </w:tcPr>
-          <w:p>
-            <w:r/>
+          </w:tcPr>
+          <w:p>
+            <w:r>
+              <w:rPr>
+                <w:rFonts w:ascii="Calibri" w:hAnsi="Calibri"/>
+                <w:sz w:val="17"/>
+              </w:rPr>
+              <w:t>Scope</w:t>
+            </w:r>
           </w:p>
         </w:tc>
         <w:tc>
           <w:tcPr>
             <w:tcW w:type="dxa" w:w="1329"/>
-            <w:tcBorders>
-              <w:top w:val="single" w:color="D9D4CA" w:sz="4"/>
-              <w:left w:val="single" w:color="D9D4CA" w:sz="4"/>
-              <w:bottom w:val="single" w:color="D9D4CA" w:sz="4"/>
-              <w:right w:val="single" w:color="D9D4CA" w:sz="4"/>
-            </w:tcBorders>
-            <w:tcMar>
-              <w:top w:type="dxa" w:w="60"/>
-              <w:left w:type="dxa" w:w="80"/>
-              <w:bottom w:type="dxa" w:w="60"/>
-              <w:right w:type="dxa" w:w="80"/>
-            </w:tcMar>
-          </w:tcPr>
-          <w:p>
-            <w:r/>
+          </w:tcPr>
+          <w:p>
+            <w:r>
+              <w:rPr>
+                <w:rFonts w:ascii="Calibri" w:hAnsi="Calibri"/>
+                <w:sz w:val="17"/>
+              </w:rPr>
+              <w:t>BM01 §1.2 vs Report 7 §3.3.11, §3.6.3</w:t>
+            </w:r>
           </w:p>
         </w:tc>
         <w:tc>
           <w:tcPr>
             <w:tcW w:type="dxa" w:w="2326"/>
-            <w:tcBorders>
-              <w:top w:val="single" w:color="D9D4CA" w:sz="4"/>
-              <w:left w:val="single" w:color="D9D4CA" w:sz="4"/>
-              <w:bottom w:val="single" w:color="D9D4CA" w:sz="4"/>
-              <w:right w:val="single" w:color="D9D4CA" w:sz="4"/>
-            </w:tcBorders>
-            <w:tcMar>
-              <w:top w:type="dxa" w:w="60"/>
-              <w:left w:type="dxa" w:w="80"/>
-              <w:bottom w:type="dxa" w:w="60"/>
-              <w:right w:type="dxa" w:w="80"/>
-            </w:tcMar>
-          </w:tcPr>
-          <w:p>
-            <w:r/>
+          </w:tcPr>
+          <w:p>
+            <w:r>
+              <w:rPr>
+                <w:rFonts w:ascii="Calibri" w:hAnsi="Calibri"/>
+                <w:sz w:val="17"/>
+              </w:rPr>
+              <w:t>University Admission &amp; Career Advisory declared Out-of-Scope in BM01 but retained in SRS.</w:t>
+            </w:r>
           </w:p>
         </w:tc>
         <w:tc>
           <w:tcPr>
             <w:tcW w:type="dxa" w:w="930"/>
-            <w:tcBorders>
-              <w:top w:val="single" w:color="D9D4CA" w:sz="4"/>
-              <w:left w:val="single" w:color="D9D4CA" w:sz="4"/>
-              <w:bottom w:val="single" w:color="D9D4CA" w:sz="4"/>
-              <w:right w:val="single" w:color="D9D4CA" w:sz="4"/>
-            </w:tcBorders>
-            <w:tcMar>
-              <w:top w:type="dxa" w:w="60"/>
-              <w:left w:type="dxa" w:w="80"/>
-              <w:bottom w:type="dxa" w:w="60"/>
-              <w:right w:type="dxa" w:w="80"/>
-            </w:tcMar>
-          </w:tcPr>
-          <w:p>
-            <w:r/>
+          </w:tcPr>
+          <w:p>
+            <w:r>
+              <w:rPr>
+                <w:rFonts w:ascii="Calibri" w:hAnsi="Calibri"/>
+                <w:sz w:val="17"/>
+              </w:rPr>
+              <w:t>High</w:t>
+            </w:r>
           </w:p>
         </w:tc>
         <w:tc>
           <w:tcPr>
             <w:tcW w:type="dxa" w:w="1329"/>
-            <w:tcBorders>
-              <w:top w:val="single" w:color="D9D4CA" w:sz="4"/>
-              <w:left w:val="single" w:color="D9D4CA" w:sz="4"/>
-              <w:bottom w:val="single" w:color="D9D4CA" w:sz="4"/>
-              <w:right w:val="single" w:color="D9D4CA" w:sz="4"/>
-            </w:tcBorders>
-            <w:tcMar>
-              <w:top w:type="dxa" w:w="60"/>
-              <w:left w:type="dxa" w:w="80"/>
-              <w:bottom w:type="dxa" w:w="60"/>
-              <w:right w:type="dxa" w:w="80"/>
-            </w:tcMar>
-          </w:tcPr>
-          <w:p>
-            <w:r/>
+          </w:tcPr>
+          <w:p>
+            <w:r>
+              <w:rPr>
+                <w:rFonts w:ascii="Calibri" w:hAnsi="Calibri"/>
+                <w:sz w:val="17"/>
+              </w:rPr>
+              <w:t>BM01 §1.2 excludes admission guidance; Report 7 pp. 55, 60 retains FR 3.3.11 &amp; FR 3.6.3.</w:t>
+            </w:r>
           </w:p>
         </w:tc>
         <w:tc>
           <w:tcPr>
             <w:tcW w:type="dxa" w:w="1997"/>
-            <w:tcBorders>
-              <w:top w:val="single" w:color="D9D4CA" w:sz="4"/>
-              <w:left w:val="single" w:color="D9D4CA" w:sz="4"/>
-              <w:bottom w:val="single" w:color="D9D4CA" w:sz="4"/>
-              <w:right w:val="single" w:color="D9D4CA" w:sz="4"/>
-            </w:tcBorders>
-            <w:tcMar>
-              <w:top w:type="dxa" w:w="60"/>
-              <w:left w:type="dxa" w:w="80"/>
-              <w:bottom w:type="dxa" w:w="60"/>
-              <w:right w:type="dxa" w:w="80"/>
-            </w:tcMar>
-          </w:tcPr>
-          <w:p>
-            <w:r/>
+          </w:tcPr>
+          <w:p>
+            <w:r>
+              <w:rPr>
+                <w:rFonts w:ascii="Calibri" w:hAnsi="Calibri"/>
+                <w:sz w:val="17"/>
+              </w:rPr>
+              <w:t>Planned (Nguyễn Duy Khôi, 28/10/2026) - Prune FR 3.3.11 and 3.6.3 from SRS.</w:t>
+            </w:r>
           </w:p>
         </w:tc>
       </w:tr>
@@ -1501,141 +1409,99 @@
         <w:tc>
           <w:tcPr>
             <w:tcW w:type="dxa" w:w="664"/>
-            <w:tcBorders>
-              <w:top w:val="single" w:color="D9D4CA" w:sz="4"/>
-              <w:left w:val="single" w:color="D9D4CA" w:sz="4"/>
-              <w:bottom w:val="single" w:color="D9D4CA" w:sz="4"/>
-              <w:right w:val="single" w:color="D9D4CA" w:sz="4"/>
-            </w:tcBorders>
-            <w:tcMar>
-              <w:top w:type="dxa" w:w="60"/>
-              <w:left w:type="dxa" w:w="80"/>
-              <w:bottom w:type="dxa" w:w="60"/>
-              <w:right w:type="dxa" w:w="80"/>
-            </w:tcMar>
-          </w:tcPr>
-          <w:p>
-            <w:r/>
+          </w:tcPr>
+          <w:p>
+            <w:r>
+              <w:rPr>
+                <w:rFonts w:ascii="Calibri" w:hAnsi="Calibri"/>
+                <w:sz w:val="17"/>
+              </w:rPr>
+              <w:t>SCO-02</w:t>
+            </w:r>
           </w:p>
         </w:tc>
         <w:tc>
           <w:tcPr>
             <w:tcW w:type="dxa" w:w="1063"/>
-            <w:tcBorders>
-              <w:top w:val="single" w:color="D9D4CA" w:sz="4"/>
-              <w:left w:val="single" w:color="D9D4CA" w:sz="4"/>
-              <w:bottom w:val="single" w:color="D9D4CA" w:sz="4"/>
-              <w:right w:val="single" w:color="D9D4CA" w:sz="4"/>
-            </w:tcBorders>
-            <w:tcMar>
-              <w:top w:type="dxa" w:w="60"/>
-              <w:left w:type="dxa" w:w="80"/>
-              <w:bottom w:type="dxa" w:w="60"/>
-              <w:right w:type="dxa" w:w="80"/>
-            </w:tcMar>
-          </w:tcPr>
-          <w:p>
-            <w:r/>
+          </w:tcPr>
+          <w:p>
+            <w:r>
+              <w:rPr>
+                <w:rFonts w:ascii="Calibri" w:hAnsi="Calibri"/>
+                <w:sz w:val="17"/>
+              </w:rPr>
+              <w:t>Scope</w:t>
+            </w:r>
           </w:p>
         </w:tc>
         <w:tc>
           <w:tcPr>
             <w:tcW w:type="dxa" w:w="1329"/>
-            <w:tcBorders>
-              <w:top w:val="single" w:color="D9D4CA" w:sz="4"/>
-              <w:left w:val="single" w:color="D9D4CA" w:sz="4"/>
-              <w:bottom w:val="single" w:color="D9D4CA" w:sz="4"/>
-              <w:right w:val="single" w:color="D9D4CA" w:sz="4"/>
-            </w:tcBorders>
-            <w:tcMar>
-              <w:top w:type="dxa" w:w="60"/>
-              <w:left w:type="dxa" w:w="80"/>
-              <w:bottom w:type="dxa" w:w="60"/>
-              <w:right w:type="dxa" w:w="80"/>
-            </w:tcMar>
-          </w:tcPr>
-          <w:p>
-            <w:r/>
+          </w:tcPr>
+          <w:p>
+            <w:r>
+              <w:rPr>
+                <w:rFonts w:ascii="Calibri" w:hAnsi="Calibri"/>
+                <w:sz w:val="17"/>
+              </w:rPr>
+              <w:t>BM01 §1.2 vs Report 7 §3.4.2, §3.5.6, §3.6.4</w:t>
+            </w:r>
           </w:p>
         </w:tc>
         <w:tc>
           <w:tcPr>
             <w:tcW w:type="dxa" w:w="2326"/>
-            <w:tcBorders>
-              <w:top w:val="single" w:color="D9D4CA" w:sz="4"/>
-              <w:left w:val="single" w:color="D9D4CA" w:sz="4"/>
-              <w:bottom w:val="single" w:color="D9D4CA" w:sz="4"/>
-              <w:right w:val="single" w:color="D9D4CA" w:sz="4"/>
-            </w:tcBorders>
-            <w:tcMar>
-              <w:top w:type="dxa" w:w="60"/>
-              <w:left w:type="dxa" w:w="80"/>
-              <w:bottom w:type="dxa" w:w="60"/>
-              <w:right w:type="dxa" w:w="80"/>
-            </w:tcMar>
-          </w:tcPr>
-          <w:p>
-            <w:r/>
+          </w:tcPr>
+          <w:p>
+            <w:r>
+              <w:rPr>
+                <w:rFonts w:ascii="Calibri" w:hAnsi="Calibri"/>
+                <w:sz w:val="17"/>
+              </w:rPr>
+              <w:t>Parent surveys and disciplinary tracking declared Out-of-Scope in BM01 but retained in SRS.</w:t>
+            </w:r>
           </w:p>
         </w:tc>
         <w:tc>
           <w:tcPr>
             <w:tcW w:type="dxa" w:w="930"/>
-            <w:tcBorders>
-              <w:top w:val="single" w:color="D9D4CA" w:sz="4"/>
-              <w:left w:val="single" w:color="D9D4CA" w:sz="4"/>
-              <w:bottom w:val="single" w:color="D9D4CA" w:sz="4"/>
-              <w:right w:val="single" w:color="D9D4CA" w:sz="4"/>
-            </w:tcBorders>
-            <w:tcMar>
-              <w:top w:type="dxa" w:w="60"/>
-              <w:left w:type="dxa" w:w="80"/>
-              <w:bottom w:type="dxa" w:w="60"/>
-              <w:right w:type="dxa" w:w="80"/>
-            </w:tcMar>
-          </w:tcPr>
-          <w:p>
-            <w:r/>
+          </w:tcPr>
+          <w:p>
+            <w:r>
+              <w:rPr>
+                <w:rFonts w:ascii="Calibri" w:hAnsi="Calibri"/>
+                <w:sz w:val="17"/>
+              </w:rPr>
+              <w:t>High</w:t>
+            </w:r>
           </w:p>
         </w:tc>
         <w:tc>
           <w:tcPr>
             <w:tcW w:type="dxa" w:w="1329"/>
-            <w:tcBorders>
-              <w:top w:val="single" w:color="D9D4CA" w:sz="4"/>
-              <w:left w:val="single" w:color="D9D4CA" w:sz="4"/>
-              <w:bottom w:val="single" w:color="D9D4CA" w:sz="4"/>
-              <w:right w:val="single" w:color="D9D4CA" w:sz="4"/>
-            </w:tcBorders>
-            <w:tcMar>
-              <w:top w:type="dxa" w:w="60"/>
-              <w:left w:type="dxa" w:w="80"/>
-              <w:bottom w:type="dxa" w:w="60"/>
-              <w:right w:type="dxa" w:w="80"/>
-            </w:tcMar>
-          </w:tcPr>
-          <w:p>
-            <w:r/>
+          </w:tcPr>
+          <w:p>
+            <w:r>
+              <w:rPr>
+                <w:rFonts w:ascii="Calibri" w:hAnsi="Calibri"/>
+                <w:sz w:val="17"/>
+              </w:rPr>
+              <w:t>BM01 §1.2 excludes coercive tracking; Report 7 pp. 56, 59 retains FR 3.4.2, 3.5.6, 3.6.4, BR-19.</w:t>
+            </w:r>
           </w:p>
         </w:tc>
         <w:tc>
           <w:tcPr>
             <w:tcW w:type="dxa" w:w="1997"/>
-            <w:tcBorders>
-              <w:top w:val="single" w:color="D9D4CA" w:sz="4"/>
-              <w:left w:val="single" w:color="D9D4CA" w:sz="4"/>
-              <w:bottom w:val="single" w:color="D9D4CA" w:sz="4"/>
-              <w:right w:val="single" w:color="D9D4CA" w:sz="4"/>
-            </w:tcBorders>
-            <w:tcMar>
-              <w:top w:type="dxa" w:w="60"/>
-              <w:left w:type="dxa" w:w="80"/>
-              <w:bottom w:type="dxa" w:w="60"/>
-              <w:right w:type="dxa" w:w="80"/>
-            </w:tcMar>
-          </w:tcPr>
-          <w:p>
-            <w:r/>
+          </w:tcPr>
+          <w:p>
+            <w:r>
+              <w:rPr>
+                <w:rFonts w:ascii="Calibri" w:hAnsi="Calibri"/>
+                <w:sz w:val="17"/>
+              </w:rPr>
+              <w:t>Planned (Nguyễn Duy Khôi, 28/10/2026) - Remove parent survey and escalation FRs from SRS.</w:t>
+            </w:r>
           </w:p>
         </w:tc>
       </w:tr>
@@ -1643,141 +1509,99 @@
         <w:tc>
           <w:tcPr>
             <w:tcW w:type="dxa" w:w="664"/>
-            <w:tcBorders>
-              <w:top w:val="single" w:color="D9D4CA" w:sz="4"/>
-              <w:left w:val="single" w:color="D9D4CA" w:sz="4"/>
-              <w:bottom w:val="single" w:color="D9D4CA" w:sz="4"/>
-              <w:right w:val="single" w:color="D9D4CA" w:sz="4"/>
-            </w:tcBorders>
-            <w:tcMar>
-              <w:top w:type="dxa" w:w="60"/>
-              <w:left w:type="dxa" w:w="80"/>
-              <w:bottom w:type="dxa" w:w="60"/>
-              <w:right w:type="dxa" w:w="80"/>
-            </w:tcMar>
-          </w:tcPr>
-          <w:p>
-            <w:r/>
+          </w:tcPr>
+          <w:p>
+            <w:r>
+              <w:rPr>
+                <w:rFonts w:ascii="Calibri" w:hAnsi="Calibri"/>
+                <w:sz w:val="17"/>
+              </w:rPr>
+              <w:t>SCO-03</w:t>
+            </w:r>
           </w:p>
         </w:tc>
         <w:tc>
           <w:tcPr>
             <w:tcW w:type="dxa" w:w="1063"/>
-            <w:tcBorders>
-              <w:top w:val="single" w:color="D9D4CA" w:sz="4"/>
-              <w:left w:val="single" w:color="D9D4CA" w:sz="4"/>
-              <w:bottom w:val="single" w:color="D9D4CA" w:sz="4"/>
-              <w:right w:val="single" w:color="D9D4CA" w:sz="4"/>
-            </w:tcBorders>
-            <w:tcMar>
-              <w:top w:type="dxa" w:w="60"/>
-              <w:left w:type="dxa" w:w="80"/>
-              <w:bottom w:type="dxa" w:w="60"/>
-              <w:right w:type="dxa" w:w="80"/>
-            </w:tcMar>
-          </w:tcPr>
-          <w:p>
-            <w:r/>
+          </w:tcPr>
+          <w:p>
+            <w:r>
+              <w:rPr>
+                <w:rFonts w:ascii="Calibri" w:hAnsi="Calibri"/>
+                <w:sz w:val="17"/>
+              </w:rPr>
+              <w:t>Scope</w:t>
+            </w:r>
           </w:p>
         </w:tc>
         <w:tc>
           <w:tcPr>
             <w:tcW w:type="dxa" w:w="1329"/>
-            <w:tcBorders>
-              <w:top w:val="single" w:color="D9D4CA" w:sz="4"/>
-              <w:left w:val="single" w:color="D9D4CA" w:sz="4"/>
-              <w:bottom w:val="single" w:color="D9D4CA" w:sz="4"/>
-              <w:right w:val="single" w:color="D9D4CA" w:sz="4"/>
-            </w:tcBorders>
-            <w:tcMar>
-              <w:top w:type="dxa" w:w="60"/>
-              <w:left w:type="dxa" w:w="80"/>
-              <w:bottom w:type="dxa" w:w="60"/>
-              <w:right w:type="dxa" w:w="80"/>
-            </w:tcMar>
-          </w:tcPr>
-          <w:p>
-            <w:r/>
+          </w:tcPr>
+          <w:p>
+            <w:r>
+              <w:rPr>
+                <w:rFonts w:ascii="Calibri" w:hAnsi="Calibri"/>
+                <w:sz w:val="17"/>
+              </w:rPr>
+              <w:t>Report 7 §3.3.13, §3.3.14, §3.4.1, §3.9.3</w:t>
+            </w:r>
           </w:p>
         </w:tc>
         <w:tc>
           <w:tcPr>
             <w:tcW w:type="dxa" w:w="2326"/>
-            <w:tcBorders>
-              <w:top w:val="single" w:color="D9D4CA" w:sz="4"/>
-              <w:left w:val="single" w:color="D9D4CA" w:sz="4"/>
-              <w:bottom w:val="single" w:color="D9D4CA" w:sz="4"/>
-              <w:right w:val="single" w:color="D9D4CA" w:sz="4"/>
-            </w:tcBorders>
-            <w:tcMar>
-              <w:top w:type="dxa" w:w="60"/>
-              <w:left w:type="dxa" w:w="80"/>
-              <w:bottom w:type="dxa" w:w="60"/>
-              <w:right w:type="dxa" w:w="80"/>
-            </w:tcMar>
-          </w:tcPr>
-          <w:p>
-            <w:r/>
+          </w:tcPr>
+          <w:p>
+            <w:r>
+              <w:rPr>
+                <w:rFonts w:ascii="Calibri" w:hAnsi="Calibri"/>
+                <w:sz w:val="17"/>
+              </w:rPr>
+              <w:t>Unimplemented dummy placeholder FRs remain in the SRS.</w:t>
+            </w:r>
           </w:p>
         </w:tc>
         <w:tc>
           <w:tcPr>
             <w:tcW w:type="dxa" w:w="930"/>
-            <w:tcBorders>
-              <w:top w:val="single" w:color="D9D4CA" w:sz="4"/>
-              <w:left w:val="single" w:color="D9D4CA" w:sz="4"/>
-              <w:bottom w:val="single" w:color="D9D4CA" w:sz="4"/>
-              <w:right w:val="single" w:color="D9D4CA" w:sz="4"/>
-            </w:tcBorders>
-            <w:tcMar>
-              <w:top w:type="dxa" w:w="60"/>
-              <w:left w:type="dxa" w:w="80"/>
-              <w:bottom w:type="dxa" w:w="60"/>
-              <w:right w:type="dxa" w:w="80"/>
-            </w:tcMar>
-          </w:tcPr>
-          <w:p>
-            <w:r/>
+          </w:tcPr>
+          <w:p>
+            <w:r>
+              <w:rPr>
+                <w:rFonts w:ascii="Calibri" w:hAnsi="Calibri"/>
+                <w:sz w:val="17"/>
+              </w:rPr>
+              <w:t>Medium</w:t>
+            </w:r>
           </w:p>
         </w:tc>
         <w:tc>
           <w:tcPr>
             <w:tcW w:type="dxa" w:w="1329"/>
-            <w:tcBorders>
-              <w:top w:val="single" w:color="D9D4CA" w:sz="4"/>
-              <w:left w:val="single" w:color="D9D4CA" w:sz="4"/>
-              <w:bottom w:val="single" w:color="D9D4CA" w:sz="4"/>
-              <w:right w:val="single" w:color="D9D4CA" w:sz="4"/>
-            </w:tcBorders>
-            <w:tcMar>
-              <w:top w:type="dxa" w:w="60"/>
-              <w:left w:type="dxa" w:w="80"/>
-              <w:bottom w:type="dxa" w:w="60"/>
-              <w:right w:type="dxa" w:w="80"/>
-            </w:tcMar>
-          </w:tcPr>
-          <w:p>
-            <w:r/>
+          </w:tcPr>
+          <w:p>
+            <w:r>
+              <w:rPr>
+                <w:rFonts w:ascii="Calibri" w:hAnsi="Calibri"/>
+                <w:sz w:val="17"/>
+              </w:rPr>
+              <w:t>Report 7 pp. 56, 63 contains headers marked "Chưa triển khai" without specifications.</w:t>
+            </w:r>
           </w:p>
         </w:tc>
         <w:tc>
           <w:tcPr>
             <w:tcW w:type="dxa" w:w="1997"/>
-            <w:tcBorders>
-              <w:top w:val="single" w:color="D9D4CA" w:sz="4"/>
-              <w:left w:val="single" w:color="D9D4CA" w:sz="4"/>
-              <w:bottom w:val="single" w:color="D9D4CA" w:sz="4"/>
-              <w:right w:val="single" w:color="D9D4CA" w:sz="4"/>
-            </w:tcBorders>
-            <w:tcMar>
-              <w:top w:type="dxa" w:w="60"/>
-              <w:left w:type="dxa" w:w="80"/>
-              <w:bottom w:type="dxa" w:w="60"/>
-              <w:right w:type="dxa" w:w="80"/>
-            </w:tcMar>
-          </w:tcPr>
-          <w:p>
-            <w:r/>
+          </w:tcPr>
+          <w:p>
+            <w:r>
+              <w:rPr>
+                <w:rFonts w:ascii="Calibri" w:hAnsi="Calibri"/>
+                <w:sz w:val="17"/>
+              </w:rPr>
+              <w:t>Planned (Nguyễn Duy Khôi, 28/10/2026) - Delete incomplete placeholder sections from SRS.</w:t>
+            </w:r>
           </w:p>
         </w:tc>
       </w:tr>
@@ -1785,141 +1609,99 @@
         <w:tc>
           <w:tcPr>
             <w:tcW w:type="dxa" w:w="664"/>
-            <w:tcBorders>
-              <w:top w:val="single" w:color="D9D4CA" w:sz="4"/>
-              <w:left w:val="single" w:color="D9D4CA" w:sz="4"/>
-              <w:bottom w:val="single" w:color="D9D4CA" w:sz="4"/>
-              <w:right w:val="single" w:color="D9D4CA" w:sz="4"/>
-            </w:tcBorders>
-            <w:tcMar>
-              <w:top w:type="dxa" w:w="60"/>
-              <w:left w:type="dxa" w:w="80"/>
-              <w:bottom w:type="dxa" w:w="60"/>
-              <w:right w:type="dxa" w:w="80"/>
-            </w:tcMar>
-          </w:tcPr>
-          <w:p>
-            <w:r/>
+          </w:tcPr>
+          <w:p>
+            <w:r>
+              <w:rPr>
+                <w:rFonts w:ascii="Calibri" w:hAnsi="Calibri"/>
+                <w:sz w:val="17"/>
+              </w:rPr>
+              <w:t>SCO-04</w:t>
+            </w:r>
           </w:p>
         </w:tc>
         <w:tc>
           <w:tcPr>
             <w:tcW w:type="dxa" w:w="1063"/>
-            <w:tcBorders>
-              <w:top w:val="single" w:color="D9D4CA" w:sz="4"/>
-              <w:left w:val="single" w:color="D9D4CA" w:sz="4"/>
-              <w:bottom w:val="single" w:color="D9D4CA" w:sz="4"/>
-              <w:right w:val="single" w:color="D9D4CA" w:sz="4"/>
-            </w:tcBorders>
-            <w:tcMar>
-              <w:top w:type="dxa" w:w="60"/>
-              <w:left w:type="dxa" w:w="80"/>
-              <w:bottom w:type="dxa" w:w="60"/>
-              <w:right w:type="dxa" w:w="80"/>
-            </w:tcMar>
-          </w:tcPr>
-          <w:p>
-            <w:r/>
+          </w:tcPr>
+          <w:p>
+            <w:r>
+              <w:rPr>
+                <w:rFonts w:ascii="Calibri" w:hAnsi="Calibri"/>
+                <w:sz w:val="17"/>
+              </w:rPr>
+              <w:t>Scope</w:t>
+            </w:r>
           </w:p>
         </w:tc>
         <w:tc>
           <w:tcPr>
             <w:tcW w:type="dxa" w:w="1329"/>
-            <w:tcBorders>
-              <w:top w:val="single" w:color="D9D4CA" w:sz="4"/>
-              <w:left w:val="single" w:color="D9D4CA" w:sz="4"/>
-              <w:bottom w:val="single" w:color="D9D4CA" w:sz="4"/>
-              <w:right w:val="single" w:color="D9D4CA" w:sz="4"/>
-            </w:tcBorders>
-            <w:tcMar>
-              <w:top w:type="dxa" w:w="60"/>
-              <w:left w:type="dxa" w:w="80"/>
-              <w:bottom w:type="dxa" w:w="60"/>
-              <w:right w:type="dxa" w:w="80"/>
-            </w:tcMar>
-          </w:tcPr>
-          <w:p>
-            <w:r/>
+          </w:tcPr>
+          <w:p>
+            <w:r>
+              <w:rPr>
+                <w:rFonts w:ascii="Calibri" w:hAnsi="Calibri"/>
+                <w:sz w:val="17"/>
+              </w:rPr>
+              <w:t>BM04 §3, §9 vs Report 7 §3.7</w:t>
+            </w:r>
           </w:p>
         </w:tc>
         <w:tc>
           <w:tcPr>
             <w:tcW w:type="dxa" w:w="2326"/>
-            <w:tcBorders>
-              <w:top w:val="single" w:color="D9D4CA" w:sz="4"/>
-              <w:left w:val="single" w:color="D9D4CA" w:sz="4"/>
-              <w:bottom w:val="single" w:color="D9D4CA" w:sz="4"/>
-              <w:right w:val="single" w:color="D9D4CA" w:sz="4"/>
-            </w:tcBorders>
-            <w:tcMar>
-              <w:top w:type="dxa" w:w="60"/>
-              <w:left w:type="dxa" w:w="80"/>
-              <w:bottom w:type="dxa" w:w="60"/>
-              <w:right w:type="dxa" w:w="80"/>
-            </w:tcMar>
-          </w:tcPr>
-          <w:p>
-            <w:r/>
+          </w:tcPr>
+          <w:p>
+            <w:r>
+              <w:rPr>
+                <w:rFonts w:ascii="Calibri" w:hAnsi="Calibri"/>
+                <w:sz w:val="17"/>
+              </w:rPr>
+              <w:t>Committed Novel Pattern Proposal (FIX-07) and Two-Tier LLM Judge (F-04) lack FR specs in SRS.</w:t>
+            </w:r>
           </w:p>
         </w:tc>
         <w:tc>
           <w:tcPr>
             <w:tcW w:type="dxa" w:w="930"/>
-            <w:tcBorders>
-              <w:top w:val="single" w:color="D9D4CA" w:sz="4"/>
-              <w:left w:val="single" w:color="D9D4CA" w:sz="4"/>
-              <w:bottom w:val="single" w:color="D9D4CA" w:sz="4"/>
-              <w:right w:val="single" w:color="D9D4CA" w:sz="4"/>
-            </w:tcBorders>
-            <w:tcMar>
-              <w:top w:type="dxa" w:w="60"/>
-              <w:left w:type="dxa" w:w="80"/>
-              <w:bottom w:type="dxa" w:w="60"/>
-              <w:right w:type="dxa" w:w="80"/>
-            </w:tcMar>
-          </w:tcPr>
-          <w:p>
-            <w:r/>
+          </w:tcPr>
+          <w:p>
+            <w:r>
+              <w:rPr>
+                <w:rFonts w:ascii="Calibri" w:hAnsi="Calibri"/>
+                <w:sz w:val="17"/>
+              </w:rPr>
+              <w:t>Medium</w:t>
+            </w:r>
           </w:p>
         </w:tc>
         <w:tc>
           <w:tcPr>
             <w:tcW w:type="dxa" w:w="1329"/>
-            <w:tcBorders>
-              <w:top w:val="single" w:color="D9D4CA" w:sz="4"/>
-              <w:left w:val="single" w:color="D9D4CA" w:sz="4"/>
-              <w:bottom w:val="single" w:color="D9D4CA" w:sz="4"/>
-              <w:right w:val="single" w:color="D9D4CA" w:sz="4"/>
-            </w:tcBorders>
-            <w:tcMar>
-              <w:top w:type="dxa" w:w="60"/>
-              <w:left w:type="dxa" w:w="80"/>
-              <w:bottom w:type="dxa" w:w="60"/>
-              <w:right w:type="dxa" w:w="80"/>
-            </w:tcMar>
-          </w:tcPr>
-          <w:p>
-            <w:r/>
+          </w:tcPr>
+          <w:p>
+            <w:r>
+              <w:rPr>
+                <w:rFonts w:ascii="Calibri" w:hAnsi="Calibri"/>
+                <w:sz w:val="17"/>
+              </w:rPr>
+              <w:t>BM04 §3, §9 vs Report 7 §3.7 (only covers manual taxonomy edits).</w:t>
+            </w:r>
           </w:p>
         </w:tc>
         <w:tc>
           <w:tcPr>
             <w:tcW w:type="dxa" w:w="1997"/>
-            <w:tcBorders>
-              <w:top w:val="single" w:color="D9D4CA" w:sz="4"/>
-              <w:left w:val="single" w:color="D9D4CA" w:sz="4"/>
-              <w:bottom w:val="single" w:color="D9D4CA" w:sz="4"/>
-              <w:right w:val="single" w:color="D9D4CA" w:sz="4"/>
-            </w:tcBorders>
-            <w:tcMar>
-              <w:top w:type="dxa" w:w="60"/>
-              <w:left w:type="dxa" w:w="80"/>
-              <w:bottom w:type="dxa" w:w="60"/>
-              <w:right w:type="dxa" w:w="80"/>
-            </w:tcMar>
-          </w:tcPr>
-          <w:p>
-            <w:r/>
+          </w:tcPr>
+          <w:p>
+            <w:r>
+              <w:rPr>
+                <w:rFonts w:ascii="Calibri" w:hAnsi="Calibri"/>
+                <w:sz w:val="17"/>
+              </w:rPr>
+              <w:t>Planned (Nguyễn Duy Khôi, 29/10/2026) - Add FR specs for pattern proposal and LLM judge to SRS §3.7.</w:t>
+            </w:r>
           </w:p>
         </w:tc>
       </w:tr>
@@ -1927,141 +1709,99 @@
         <w:tc>
           <w:tcPr>
             <w:tcW w:type="dxa" w:w="664"/>
-            <w:tcBorders>
-              <w:top w:val="single" w:color="D9D4CA" w:sz="4"/>
-              <w:left w:val="single" w:color="D9D4CA" w:sz="4"/>
-              <w:bottom w:val="single" w:color="D9D4CA" w:sz="4"/>
-              <w:right w:val="single" w:color="D9D4CA" w:sz="4"/>
-            </w:tcBorders>
-            <w:tcMar>
-              <w:top w:type="dxa" w:w="60"/>
-              <w:left w:type="dxa" w:w="80"/>
-              <w:bottom w:type="dxa" w:w="60"/>
-              <w:right w:type="dxa" w:w="80"/>
-            </w:tcMar>
-          </w:tcPr>
-          <w:p>
-            <w:r/>
+          </w:tcPr>
+          <w:p>
+            <w:r>
+              <w:rPr>
+                <w:rFonts w:ascii="Calibri" w:hAnsi="Calibri"/>
+                <w:sz w:val="17"/>
+              </w:rPr>
+              <w:t>REQ-01</w:t>
+            </w:r>
           </w:p>
         </w:tc>
         <w:tc>
           <w:tcPr>
             <w:tcW w:type="dxa" w:w="1063"/>
-            <w:tcBorders>
-              <w:top w:val="single" w:color="D9D4CA" w:sz="4"/>
-              <w:left w:val="single" w:color="D9D4CA" w:sz="4"/>
-              <w:bottom w:val="single" w:color="D9D4CA" w:sz="4"/>
-              <w:right w:val="single" w:color="D9D4CA" w:sz="4"/>
-            </w:tcBorders>
-            <w:tcMar>
-              <w:top w:type="dxa" w:w="60"/>
-              <w:left w:type="dxa" w:w="80"/>
-              <w:bottom w:type="dxa" w:w="60"/>
-              <w:right w:type="dxa" w:w="80"/>
-            </w:tcMar>
-          </w:tcPr>
-          <w:p>
-            <w:r/>
+          </w:tcPr>
+          <w:p>
+            <w:r>
+              <w:rPr>
+                <w:rFonts w:ascii="Calibri" w:hAnsi="Calibri"/>
+                <w:sz w:val="17"/>
+              </w:rPr>
+              <w:t>Requirements</w:t>
+            </w:r>
           </w:p>
         </w:tc>
         <w:tc>
           <w:tcPr>
             <w:tcW w:type="dxa" w:w="1329"/>
-            <w:tcBorders>
-              <w:top w:val="single" w:color="D9D4CA" w:sz="4"/>
-              <w:left w:val="single" w:color="D9D4CA" w:sz="4"/>
-              <w:bottom w:val="single" w:color="D9D4CA" w:sz="4"/>
-              <w:right w:val="single" w:color="D9D4CA" w:sz="4"/>
-            </w:tcBorders>
-            <w:tcMar>
-              <w:top w:type="dxa" w:w="60"/>
-              <w:left w:type="dxa" w:w="80"/>
-              <w:bottom w:type="dxa" w:w="60"/>
-              <w:right w:type="dxa" w:w="80"/>
-            </w:tcMar>
-          </w:tcPr>
-          <w:p>
-            <w:r/>
+          </w:tcPr>
+          <w:p>
+            <w:r>
+              <w:rPr>
+                <w:rFonts w:ascii="Calibri" w:hAnsi="Calibri"/>
+                <w:sz w:val="17"/>
+              </w:rPr>
+              <w:t>Report 7 §3.1.5, §3.3.13, §3.4.1</w:t>
+            </w:r>
           </w:p>
         </w:tc>
         <w:tc>
           <w:tcPr>
             <w:tcW w:type="dxa" w:w="2326"/>
-            <w:tcBorders>
-              <w:top w:val="single" w:color="D9D4CA" w:sz="4"/>
-              <w:left w:val="single" w:color="D9D4CA" w:sz="4"/>
-              <w:bottom w:val="single" w:color="D9D4CA" w:sz="4"/>
-              <w:right w:val="single" w:color="D9D4CA" w:sz="4"/>
-            </w:tcBorders>
-            <w:tcMar>
-              <w:top w:type="dxa" w:w="60"/>
-              <w:left w:type="dxa" w:w="80"/>
-              <w:bottom w:type="dxa" w:w="60"/>
-              <w:right w:type="dxa" w:w="80"/>
-            </w:tcMar>
-          </w:tcPr>
-          <w:p>
-            <w:r/>
+          </w:tcPr>
+          <w:p>
+            <w:r>
+              <w:rPr>
+                <w:rFonts w:ascii="Calibri" w:hAnsi="Calibri"/>
+                <w:sz w:val="17"/>
+              </w:rPr>
+              <w:t>Stub FRs lack Actor, Trigger, and Acceptance Criteria; Conceptual ERD lacks data dictionary.</w:t>
+            </w:r>
           </w:p>
         </w:tc>
         <w:tc>
           <w:tcPr>
             <w:tcW w:type="dxa" w:w="930"/>
-            <w:tcBorders>
-              <w:top w:val="single" w:color="D9D4CA" w:sz="4"/>
-              <w:left w:val="single" w:color="D9D4CA" w:sz="4"/>
-              <w:bottom w:val="single" w:color="D9D4CA" w:sz="4"/>
-              <w:right w:val="single" w:color="D9D4CA" w:sz="4"/>
-            </w:tcBorders>
-            <w:tcMar>
-              <w:top w:type="dxa" w:w="60"/>
-              <w:left w:type="dxa" w:w="80"/>
-              <w:bottom w:type="dxa" w:w="60"/>
-              <w:right w:type="dxa" w:w="80"/>
-            </w:tcMar>
-          </w:tcPr>
-          <w:p>
-            <w:r/>
+          </w:tcPr>
+          <w:p>
+            <w:r>
+              <w:rPr>
+                <w:rFonts w:ascii="Calibri" w:hAnsi="Calibri"/>
+                <w:sz w:val="17"/>
+              </w:rPr>
+              <w:t>High</w:t>
+            </w:r>
           </w:p>
         </w:tc>
         <w:tc>
           <w:tcPr>
             <w:tcW w:type="dxa" w:w="1329"/>
-            <w:tcBorders>
-              <w:top w:val="single" w:color="D9D4CA" w:sz="4"/>
-              <w:left w:val="single" w:color="D9D4CA" w:sz="4"/>
-              <w:bottom w:val="single" w:color="D9D4CA" w:sz="4"/>
-              <w:right w:val="single" w:color="D9D4CA" w:sz="4"/>
-            </w:tcBorders>
-            <w:tcMar>
-              <w:top w:type="dxa" w:w="60"/>
-              <w:left w:type="dxa" w:w="80"/>
-              <w:bottom w:type="dxa" w:w="60"/>
-              <w:right w:type="dxa" w:w="80"/>
-            </w:tcMar>
-          </w:tcPr>
-          <w:p>
-            <w:r/>
+          </w:tcPr>
+          <w:p>
+            <w:r>
+              <w:rPr>
+                <w:rFonts w:ascii="Calibri" w:hAnsi="Calibri"/>
+                <w:sz w:val="17"/>
+              </w:rPr>
+              <w:t>Report 7 pp. 50, 56, 63 have empty stubs and Figure 11 without entity descriptions.</w:t>
+            </w:r>
           </w:p>
         </w:tc>
         <w:tc>
           <w:tcPr>
             <w:tcW w:type="dxa" w:w="1997"/>
-            <w:tcBorders>
-              <w:top w:val="single" w:color="D9D4CA" w:sz="4"/>
-              <w:left w:val="single" w:color="D9D4CA" w:sz="4"/>
-              <w:bottom w:val="single" w:color="D9D4CA" w:sz="4"/>
-              <w:right w:val="single" w:color="D9D4CA" w:sz="4"/>
-            </w:tcBorders>
-            <w:tcMar>
-              <w:top w:type="dxa" w:w="60"/>
-              <w:left w:type="dxa" w:w="80"/>
-              <w:bottom w:type="dxa" w:w="60"/>
-              <w:right w:type="dxa" w:w="80"/>
-            </w:tcMar>
-          </w:tcPr>
-          <w:p>
-            <w:r/>
+          </w:tcPr>
+          <w:p>
+            <w:r>
+              <w:rPr>
+                <w:rFonts w:ascii="Calibri" w:hAnsi="Calibri"/>
+                <w:sz w:val="17"/>
+              </w:rPr>
+              <w:t>Planned (Nguyễn Duy Khôi, 28/10/2026) - Embed data dictionary for Fig 11 and remove stub FRs.</w:t>
+            </w:r>
           </w:p>
         </w:tc>
       </w:tr>
@@ -2069,141 +1809,99 @@
         <w:tc>
           <w:tcPr>
             <w:tcW w:type="dxa" w:w="664"/>
-            <w:tcBorders>
-              <w:top w:val="single" w:color="D9D4CA" w:sz="4"/>
-              <w:left w:val="single" w:color="D9D4CA" w:sz="4"/>
-              <w:bottom w:val="single" w:color="D9D4CA" w:sz="4"/>
-              <w:right w:val="single" w:color="D9D4CA" w:sz="4"/>
-            </w:tcBorders>
-            <w:tcMar>
-              <w:top w:type="dxa" w:w="60"/>
-              <w:left w:type="dxa" w:w="80"/>
-              <w:bottom w:type="dxa" w:w="60"/>
-              <w:right w:type="dxa" w:w="80"/>
-            </w:tcMar>
-          </w:tcPr>
-          <w:p>
-            <w:r/>
+          </w:tcPr>
+          <w:p>
+            <w:r>
+              <w:rPr>
+                <w:rFonts w:ascii="Calibri" w:hAnsi="Calibri"/>
+                <w:sz w:val="17"/>
+              </w:rPr>
+              <w:t>REQ-02</w:t>
+            </w:r>
           </w:p>
         </w:tc>
         <w:tc>
           <w:tcPr>
             <w:tcW w:type="dxa" w:w="1063"/>
-            <w:tcBorders>
-              <w:top w:val="single" w:color="D9D4CA" w:sz="4"/>
-              <w:left w:val="single" w:color="D9D4CA" w:sz="4"/>
-              <w:bottom w:val="single" w:color="D9D4CA" w:sz="4"/>
-              <w:right w:val="single" w:color="D9D4CA" w:sz="4"/>
-            </w:tcBorders>
-            <w:tcMar>
-              <w:top w:type="dxa" w:w="60"/>
-              <w:left w:type="dxa" w:w="80"/>
-              <w:bottom w:type="dxa" w:w="60"/>
-              <w:right w:type="dxa" w:w="80"/>
-            </w:tcMar>
-          </w:tcPr>
-          <w:p>
-            <w:r/>
+          </w:tcPr>
+          <w:p>
+            <w:r>
+              <w:rPr>
+                <w:rFonts w:ascii="Calibri" w:hAnsi="Calibri"/>
+                <w:sz w:val="17"/>
+              </w:rPr>
+              <w:t>Requirements</w:t>
+            </w:r>
           </w:p>
         </w:tc>
         <w:tc>
           <w:tcPr>
             <w:tcW w:type="dxa" w:w="1329"/>
-            <w:tcBorders>
-              <w:top w:val="single" w:color="D9D4CA" w:sz="4"/>
-              <w:left w:val="single" w:color="D9D4CA" w:sz="4"/>
-              <w:bottom w:val="single" w:color="D9D4CA" w:sz="4"/>
-              <w:right w:val="single" w:color="D9D4CA" w:sz="4"/>
-            </w:tcBorders>
-            <w:tcMar>
-              <w:top w:type="dxa" w:w="60"/>
-              <w:left w:type="dxa" w:w="80"/>
-              <w:bottom w:type="dxa" w:w="60"/>
-              <w:right w:type="dxa" w:w="80"/>
-            </w:tcMar>
-          </w:tcPr>
-          <w:p>
-            <w:r/>
+          </w:tcPr>
+          <w:p>
+            <w:r>
+              <w:rPr>
+                <w:rFonts w:ascii="Calibri" w:hAnsi="Calibri"/>
+                <w:sz w:val="17"/>
+              </w:rPr>
+              <w:t>Report 7 §4.2.1, §4.2.4</w:t>
+            </w:r>
           </w:p>
         </w:tc>
         <w:tc>
           <w:tcPr>
             <w:tcW w:type="dxa" w:w="2326"/>
-            <w:tcBorders>
-              <w:top w:val="single" w:color="D9D4CA" w:sz="4"/>
-              <w:left w:val="single" w:color="D9D4CA" w:sz="4"/>
-              <w:bottom w:val="single" w:color="D9D4CA" w:sz="4"/>
-              <w:right w:val="single" w:color="D9D4CA" w:sz="4"/>
-            </w:tcBorders>
-            <w:tcMar>
-              <w:top w:type="dxa" w:w="60"/>
-              <w:left w:type="dxa" w:w="80"/>
-              <w:bottom w:type="dxa" w:w="60"/>
-              <w:right w:type="dxa" w:w="80"/>
-            </w:tcMar>
-          </w:tcPr>
-          <w:p>
-            <w:r/>
+          </w:tcPr>
+          <w:p>
+            <w:r>
+              <w:rPr>
+                <w:rFonts w:ascii="Calibri" w:hAnsi="Calibri"/>
+                <w:sz w:val="17"/>
+              </w:rPr>
+              <w:t>Usability and Security NFRs lack quantitative metrics, thresholds, and measurement methods.</w:t>
+            </w:r>
           </w:p>
         </w:tc>
         <w:tc>
           <w:tcPr>
             <w:tcW w:type="dxa" w:w="930"/>
-            <w:tcBorders>
-              <w:top w:val="single" w:color="D9D4CA" w:sz="4"/>
-              <w:left w:val="single" w:color="D9D4CA" w:sz="4"/>
-              <w:bottom w:val="single" w:color="D9D4CA" w:sz="4"/>
-              <w:right w:val="single" w:color="D9D4CA" w:sz="4"/>
-            </w:tcBorders>
-            <w:tcMar>
-              <w:top w:type="dxa" w:w="60"/>
-              <w:left w:type="dxa" w:w="80"/>
-              <w:bottom w:type="dxa" w:w="60"/>
-              <w:right w:type="dxa" w:w="80"/>
-            </w:tcMar>
-          </w:tcPr>
-          <w:p>
-            <w:r/>
+          </w:tcPr>
+          <w:p>
+            <w:r>
+              <w:rPr>
+                <w:rFonts w:ascii="Calibri" w:hAnsi="Calibri"/>
+                <w:sz w:val="17"/>
+              </w:rPr>
+              <w:t>Medium</w:t>
+            </w:r>
           </w:p>
         </w:tc>
         <w:tc>
           <w:tcPr>
             <w:tcW w:type="dxa" w:w="1329"/>
-            <w:tcBorders>
-              <w:top w:val="single" w:color="D9D4CA" w:sz="4"/>
-              <w:left w:val="single" w:color="D9D4CA" w:sz="4"/>
-              <w:bottom w:val="single" w:color="D9D4CA" w:sz="4"/>
-              <w:right w:val="single" w:color="D9D4CA" w:sz="4"/>
-            </w:tcBorders>
-            <w:tcMar>
-              <w:top w:type="dxa" w:w="60"/>
-              <w:left w:type="dxa" w:w="80"/>
-              <w:bottom w:type="dxa" w:w="60"/>
-              <w:right w:type="dxa" w:w="80"/>
-            </w:tcMar>
-          </w:tcPr>
-          <w:p>
-            <w:r/>
+          </w:tcPr>
+          <w:p>
+            <w:r>
+              <w:rPr>
+                <w:rFonts w:ascii="Calibri" w:hAnsi="Calibri"/>
+                <w:sz w:val="17"/>
+              </w:rPr>
+              <w:t>Report 7 pp. 64–65 describes qualitative goals without SUS or OWASP thresholds.</w:t>
+            </w:r>
           </w:p>
         </w:tc>
         <w:tc>
           <w:tcPr>
             <w:tcW w:type="dxa" w:w="1997"/>
-            <w:tcBorders>
-              <w:top w:val="single" w:color="D9D4CA" w:sz="4"/>
-              <w:left w:val="single" w:color="D9D4CA" w:sz="4"/>
-              <w:bottom w:val="single" w:color="D9D4CA" w:sz="4"/>
-              <w:right w:val="single" w:color="D9D4CA" w:sz="4"/>
-            </w:tcBorders>
-            <w:tcMar>
-              <w:top w:type="dxa" w:w="60"/>
-              <w:left w:type="dxa" w:w="80"/>
-              <w:bottom w:type="dxa" w:w="60"/>
-              <w:right w:type="dxa" w:w="80"/>
-            </w:tcMar>
-          </w:tcPr>
-          <w:p>
-            <w:r/>
+          </w:tcPr>
+          <w:p>
+            <w:r>
+              <w:rPr>
+                <w:rFonts w:ascii="Calibri" w:hAnsi="Calibri"/>
+                <w:sz w:val="17"/>
+              </w:rPr>
+              <w:t>Planned (Nguyễn Duy Khôi, 28/10/2026) - Update SRS NFRs with SUS &gt;= 75 and OWASP ZAP zero-defect criteria.</w:t>
+            </w:r>
           </w:p>
         </w:tc>
       </w:tr>
@@ -2211,141 +1909,99 @@
         <w:tc>
           <w:tcPr>
             <w:tcW w:type="dxa" w:w="664"/>
-            <w:tcBorders>
-              <w:top w:val="single" w:color="D9D4CA" w:sz="4"/>
-              <w:left w:val="single" w:color="D9D4CA" w:sz="4"/>
-              <w:bottom w:val="single" w:color="D9D4CA" w:sz="4"/>
-              <w:right w:val="single" w:color="D9D4CA" w:sz="4"/>
-            </w:tcBorders>
-            <w:tcMar>
-              <w:top w:type="dxa" w:w="60"/>
-              <w:left w:type="dxa" w:w="80"/>
-              <w:bottom w:type="dxa" w:w="60"/>
-              <w:right w:type="dxa" w:w="80"/>
-            </w:tcMar>
-          </w:tcPr>
-          <w:p>
-            <w:r/>
+          </w:tcPr>
+          <w:p>
+            <w:r>
+              <w:rPr>
+                <w:rFonts w:ascii="Calibri" w:hAnsi="Calibri"/>
+                <w:sz w:val="17"/>
+              </w:rPr>
+              <w:t>REQ-03</w:t>
+            </w:r>
           </w:p>
         </w:tc>
         <w:tc>
           <w:tcPr>
             <w:tcW w:type="dxa" w:w="1063"/>
-            <w:tcBorders>
-              <w:top w:val="single" w:color="D9D4CA" w:sz="4"/>
-              <w:left w:val="single" w:color="D9D4CA" w:sz="4"/>
-              <w:bottom w:val="single" w:color="D9D4CA" w:sz="4"/>
-              <w:right w:val="single" w:color="D9D4CA" w:sz="4"/>
-            </w:tcBorders>
-            <w:tcMar>
-              <w:top w:type="dxa" w:w="60"/>
-              <w:left w:type="dxa" w:w="80"/>
-              <w:bottom w:type="dxa" w:w="60"/>
-              <w:right w:type="dxa" w:w="80"/>
-            </w:tcMar>
-          </w:tcPr>
-          <w:p>
-            <w:r/>
+          </w:tcPr>
+          <w:p>
+            <w:r>
+              <w:rPr>
+                <w:rFonts w:ascii="Calibri" w:hAnsi="Calibri"/>
+                <w:sz w:val="17"/>
+              </w:rPr>
+              <w:t>Requirements</w:t>
+            </w:r>
           </w:p>
         </w:tc>
         <w:tc>
           <w:tcPr>
             <w:tcW w:type="dxa" w:w="1329"/>
-            <w:tcBorders>
-              <w:top w:val="single" w:color="D9D4CA" w:sz="4"/>
-              <w:left w:val="single" w:color="D9D4CA" w:sz="4"/>
-              <w:bottom w:val="single" w:color="D9D4CA" w:sz="4"/>
-              <w:right w:val="single" w:color="D9D4CA" w:sz="4"/>
-            </w:tcBorders>
-            <w:tcMar>
-              <w:top w:type="dxa" w:w="60"/>
-              <w:left w:type="dxa" w:w="80"/>
-              <w:bottom w:type="dxa" w:w="60"/>
-              <w:right w:type="dxa" w:w="80"/>
-            </w:tcMar>
-          </w:tcPr>
-          <w:p>
-            <w:r/>
+          </w:tcPr>
+          <w:p>
+            <w:r>
+              <w:rPr>
+                <w:rFonts w:ascii="Calibri" w:hAnsi="Calibri"/>
+                <w:sz w:val="17"/>
+              </w:rPr>
+              <w:t>Report 7 §4.2.3 vs BM01 §5 (G2)</w:t>
+            </w:r>
           </w:p>
         </w:tc>
         <w:tc>
           <w:tcPr>
             <w:tcW w:type="dxa" w:w="2326"/>
-            <w:tcBorders>
-              <w:top w:val="single" w:color="D9D4CA" w:sz="4"/>
-              <w:left w:val="single" w:color="D9D4CA" w:sz="4"/>
-              <w:bottom w:val="single" w:color="D9D4CA" w:sz="4"/>
-              <w:right w:val="single" w:color="D9D4CA" w:sz="4"/>
-            </w:tcBorders>
-            <w:tcMar>
-              <w:top w:type="dxa" w:w="60"/>
-              <w:left w:type="dxa" w:w="80"/>
-              <w:bottom w:type="dxa" w:w="60"/>
-              <w:right w:type="dxa" w:w="80"/>
-            </w:tcMar>
-          </w:tcPr>
-          <w:p>
-            <w:r/>
+          </w:tcPr>
+          <w:p>
+            <w:r>
+              <w:rPr>
+                <w:rFonts w:ascii="Calibri" w:hAnsi="Calibri"/>
+                <w:sz w:val="17"/>
+              </w:rPr>
+              <w:t>SRS throughput threshold (1,000 concurrent users) conflicts with BM01 Gap G2 (100 req/s REST).</w:t>
+            </w:r>
           </w:p>
         </w:tc>
         <w:tc>
           <w:tcPr>
             <w:tcW w:type="dxa" w:w="930"/>
-            <w:tcBorders>
-              <w:top w:val="single" w:color="D9D4CA" w:sz="4"/>
-              <w:left w:val="single" w:color="D9D4CA" w:sz="4"/>
-              <w:bottom w:val="single" w:color="D9D4CA" w:sz="4"/>
-              <w:right w:val="single" w:color="D9D4CA" w:sz="4"/>
-            </w:tcBorders>
-            <w:tcMar>
-              <w:top w:type="dxa" w:w="60"/>
-              <w:left w:type="dxa" w:w="80"/>
-              <w:bottom w:type="dxa" w:w="60"/>
-              <w:right w:type="dxa" w:w="80"/>
-            </w:tcMar>
-          </w:tcPr>
-          <w:p>
-            <w:r/>
+          </w:tcPr>
+          <w:p>
+            <w:r>
+              <w:rPr>
+                <w:rFonts w:ascii="Calibri" w:hAnsi="Calibri"/>
+                <w:sz w:val="17"/>
+              </w:rPr>
+              <w:t>Medium</w:t>
+            </w:r>
           </w:p>
         </w:tc>
         <w:tc>
           <w:tcPr>
             <w:tcW w:type="dxa" w:w="1329"/>
-            <w:tcBorders>
-              <w:top w:val="single" w:color="D9D4CA" w:sz="4"/>
-              <w:left w:val="single" w:color="D9D4CA" w:sz="4"/>
-              <w:bottom w:val="single" w:color="D9D4CA" w:sz="4"/>
-              <w:right w:val="single" w:color="D9D4CA" w:sz="4"/>
-            </w:tcBorders>
-            <w:tcMar>
-              <w:top w:type="dxa" w:w="60"/>
-              <w:left w:type="dxa" w:w="80"/>
-              <w:bottom w:type="dxa" w:w="60"/>
-              <w:right w:type="dxa" w:w="80"/>
-            </w:tcMar>
-          </w:tcPr>
-          <w:p>
-            <w:r/>
+          </w:tcPr>
+          <w:p>
+            <w:r>
+              <w:rPr>
+                <w:rFonts w:ascii="Calibri" w:hAnsi="Calibri"/>
+                <w:sz w:val="17"/>
+              </w:rPr>
+              <w:t>Report 7 p. 64 (1,000 users) vs BM01 §5 G2 (100 req/s REST target).</w:t>
+            </w:r>
           </w:p>
         </w:tc>
         <w:tc>
           <w:tcPr>
             <w:tcW w:type="dxa" w:w="1997"/>
-            <w:tcBorders>
-              <w:top w:val="single" w:color="D9D4CA" w:sz="4"/>
-              <w:left w:val="single" w:color="D9D4CA" w:sz="4"/>
-              <w:bottom w:val="single" w:color="D9D4CA" w:sz="4"/>
-              <w:right w:val="single" w:color="D9D4CA" w:sz="4"/>
-            </w:tcBorders>
-            <w:tcMar>
-              <w:top w:type="dxa" w:w="60"/>
-              <w:left w:type="dxa" w:w="80"/>
-              <w:bottom w:type="dxa" w:w="60"/>
-              <w:right w:type="dxa" w:w="80"/>
-            </w:tcMar>
-          </w:tcPr>
-          <w:p>
-            <w:r/>
+          </w:tcPr>
+          <w:p>
+            <w:r>
+              <w:rPr>
+                <w:rFonts w:ascii="Calibri" w:hAnsi="Calibri"/>
+                <w:sz w:val="17"/>
+              </w:rPr>
+              <w:t>Planned (Trần Thái Thịnh, 28/10/2026) - Calibrate SRS throughput to 100 req/s backed by k6 scripts.</w:t>
+            </w:r>
           </w:p>
         </w:tc>
       </w:tr>
@@ -2353,141 +2009,99 @@
         <w:tc>
           <w:tcPr>
             <w:tcW w:type="dxa" w:w="664"/>
-            <w:tcBorders>
-              <w:top w:val="single" w:color="D9D4CA" w:sz="4"/>
-              <w:left w:val="single" w:color="D9D4CA" w:sz="4"/>
-              <w:bottom w:val="single" w:color="D9D4CA" w:sz="4"/>
-              <w:right w:val="single" w:color="D9D4CA" w:sz="4"/>
-            </w:tcBorders>
-            <w:tcMar>
-              <w:top w:type="dxa" w:w="60"/>
-              <w:left w:type="dxa" w:w="80"/>
-              <w:bottom w:type="dxa" w:w="60"/>
-              <w:right w:type="dxa" w:w="80"/>
-            </w:tcMar>
-          </w:tcPr>
-          <w:p>
-            <w:r/>
+          </w:tcPr>
+          <w:p>
+            <w:r>
+              <w:rPr>
+                <w:rFonts w:ascii="Calibri" w:hAnsi="Calibri"/>
+                <w:sz w:val="17"/>
+              </w:rPr>
+              <w:t>DAT-01</w:t>
+            </w:r>
           </w:p>
         </w:tc>
         <w:tc>
           <w:tcPr>
             <w:tcW w:type="dxa" w:w="1063"/>
-            <w:tcBorders>
-              <w:top w:val="single" w:color="D9D4CA" w:sz="4"/>
-              <w:left w:val="single" w:color="D9D4CA" w:sz="4"/>
-              <w:bottom w:val="single" w:color="D9D4CA" w:sz="4"/>
-              <w:right w:val="single" w:color="D9D4CA" w:sz="4"/>
-            </w:tcBorders>
-            <w:tcMar>
-              <w:top w:type="dxa" w:w="60"/>
-              <w:left w:type="dxa" w:w="80"/>
-              <w:bottom w:type="dxa" w:w="60"/>
-              <w:right w:type="dxa" w:w="80"/>
-            </w:tcMar>
-          </w:tcPr>
-          <w:p>
-            <w:r/>
+          </w:tcPr>
+          <w:p>
+            <w:r>
+              <w:rPr>
+                <w:rFonts w:ascii="Calibri" w:hAnsi="Calibri"/>
+                <w:sz w:val="17"/>
+              </w:rPr>
+              <w:t>Data</w:t>
+            </w:r>
           </w:p>
         </w:tc>
         <w:tc>
           <w:tcPr>
             <w:tcW w:type="dxa" w:w="1329"/>
-            <w:tcBorders>
-              <w:top w:val="single" w:color="D9D4CA" w:sz="4"/>
-              <w:left w:val="single" w:color="D9D4CA" w:sz="4"/>
-              <w:bottom w:val="single" w:color="D9D4CA" w:sz="4"/>
-              <w:right w:val="single" w:color="D9D4CA" w:sz="4"/>
-            </w:tcBorders>
-            <w:tcMar>
-              <w:top w:type="dxa" w:w="60"/>
-              <w:left w:type="dxa" w:w="80"/>
-              <w:bottom w:type="dxa" w:w="60"/>
-              <w:right w:type="dxa" w:w="80"/>
-            </w:tcMar>
-          </w:tcPr>
-          <w:p>
-            <w:r/>
+          </w:tcPr>
+          <w:p>
+            <w:r>
+              <w:rPr>
+                <w:rFonts w:ascii="Calibri" w:hAnsi="Calibri"/>
+                <w:sz w:val="17"/>
+              </w:rPr>
+              <w:t>Report 7 §3.4.2, §3.5.4 vs erd.mmd &amp; SQL.sql</w:t>
+            </w:r>
           </w:p>
         </w:tc>
         <w:tc>
           <w:tcPr>
             <w:tcW w:type="dxa" w:w="2326"/>
-            <w:tcBorders>
-              <w:top w:val="single" w:color="D9D4CA" w:sz="4"/>
-              <w:left w:val="single" w:color="D9D4CA" w:sz="4"/>
-              <w:bottom w:val="single" w:color="D9D4CA" w:sz="4"/>
-              <w:right w:val="single" w:color="D9D4CA" w:sz="4"/>
-            </w:tcBorders>
-            <w:tcMar>
-              <w:top w:type="dxa" w:w="60"/>
-              <w:left w:type="dxa" w:w="80"/>
-              <w:bottom w:type="dxa" w:w="60"/>
-              <w:right w:type="dxa" w:w="80"/>
-            </w:tcMar>
-          </w:tcPr>
-          <w:p>
-            <w:r/>
+          </w:tcPr>
+          <w:p>
+            <w:r>
+              <w:rPr>
+                <w:rFonts w:ascii="Calibri" w:hAnsi="Calibri"/>
+                <w:sz w:val="17"/>
+              </w:rPr>
+              <w:t>Entities required by SRS (MentoringSession, ParentSurvey) missing from ERD and SQL script.</w:t>
+            </w:r>
           </w:p>
         </w:tc>
         <w:tc>
           <w:tcPr>
             <w:tcW w:type="dxa" w:w="930"/>
-            <w:tcBorders>
-              <w:top w:val="single" w:color="D9D4CA" w:sz="4"/>
-              <w:left w:val="single" w:color="D9D4CA" w:sz="4"/>
-              <w:bottom w:val="single" w:color="D9D4CA" w:sz="4"/>
-              <w:right w:val="single" w:color="D9D4CA" w:sz="4"/>
-            </w:tcBorders>
-            <w:tcMar>
-              <w:top w:type="dxa" w:w="60"/>
-              <w:left w:type="dxa" w:w="80"/>
-              <w:bottom w:type="dxa" w:w="60"/>
-              <w:right w:type="dxa" w:w="80"/>
-            </w:tcMar>
-          </w:tcPr>
-          <w:p>
-            <w:r/>
+          </w:tcPr>
+          <w:p>
+            <w:r>
+              <w:rPr>
+                <w:rFonts w:ascii="Calibri" w:hAnsi="Calibri"/>
+                <w:sz w:val="17"/>
+              </w:rPr>
+              <w:t>High</w:t>
+            </w:r>
           </w:p>
         </w:tc>
         <w:tc>
           <w:tcPr>
             <w:tcW w:type="dxa" w:w="1329"/>
-            <w:tcBorders>
-              <w:top w:val="single" w:color="D9D4CA" w:sz="4"/>
-              <w:left w:val="single" w:color="D9D4CA" w:sz="4"/>
-              <w:bottom w:val="single" w:color="D9D4CA" w:sz="4"/>
-              <w:right w:val="single" w:color="D9D4CA" w:sz="4"/>
-            </w:tcBorders>
-            <w:tcMar>
-              <w:top w:type="dxa" w:w="60"/>
-              <w:left w:type="dxa" w:w="80"/>
-              <w:bottom w:type="dxa" w:w="60"/>
-              <w:right w:type="dxa" w:w="80"/>
-            </w:tcMar>
-          </w:tcPr>
-          <w:p>
-            <w:r/>
+          </w:tcPr>
+          <w:p>
+            <w:r>
+              <w:rPr>
+                <w:rFonts w:ascii="Calibri" w:hAnsi="Calibri"/>
+                <w:sz w:val="17"/>
+              </w:rPr>
+              <w:t>Search in erd.mmd and SQL.sql yields 0 matches for these entities.</w:t>
+            </w:r>
           </w:p>
         </w:tc>
         <w:tc>
           <w:tcPr>
             <w:tcW w:type="dxa" w:w="1997"/>
-            <w:tcBorders>
-              <w:top w:val="single" w:color="D9D4CA" w:sz="4"/>
-              <w:left w:val="single" w:color="D9D4CA" w:sz="4"/>
-              <w:bottom w:val="single" w:color="D9D4CA" w:sz="4"/>
-              <w:right w:val="single" w:color="D9D4CA" w:sz="4"/>
-            </w:tcBorders>
-            <w:tcMar>
-              <w:top w:type="dxa" w:w="60"/>
-              <w:left w:type="dxa" w:w="80"/>
-              <w:bottom w:type="dxa" w:w="60"/>
-              <w:right w:type="dxa" w:w="80"/>
-            </w:tcMar>
-          </w:tcPr>
-          <w:p>
-            <w:r/>
+          </w:tcPr>
+          <w:p>
+            <w:r>
+              <w:rPr>
+                <w:rFonts w:ascii="Calibri" w:hAnsi="Calibri"/>
+                <w:sz w:val="17"/>
+              </w:rPr>
+              <w:t>Kept - Mentoring and parent surveys handled via external LMS/offline center operations.</w:t>
+            </w:r>
           </w:p>
         </w:tc>
       </w:tr>
@@ -2495,141 +2109,1499 @@
         <w:tc>
           <w:tcPr>
             <w:tcW w:type="dxa" w:w="664"/>
-            <w:tcBorders>
-              <w:top w:val="single" w:color="D9D4CA" w:sz="4"/>
-              <w:left w:val="single" w:color="D9D4CA" w:sz="4"/>
-              <w:bottom w:val="single" w:color="D9D4CA" w:sz="4"/>
-              <w:right w:val="single" w:color="D9D4CA" w:sz="4"/>
-            </w:tcBorders>
-            <w:tcMar>
-              <w:top w:type="dxa" w:w="60"/>
-              <w:left w:type="dxa" w:w="80"/>
-              <w:bottom w:type="dxa" w:w="60"/>
-              <w:right w:type="dxa" w:w="80"/>
-            </w:tcMar>
-          </w:tcPr>
-          <w:p>
-            <w:r/>
+          </w:tcPr>
+          <w:p>
+            <w:r>
+              <w:rPr>
+                <w:rFonts w:ascii="Calibri" w:hAnsi="Calibri"/>
+                <w:sz w:val="17"/>
+              </w:rPr>
+              <w:t>DAT-02</w:t>
+            </w:r>
           </w:p>
         </w:tc>
         <w:tc>
           <w:tcPr>
             <w:tcW w:type="dxa" w:w="1063"/>
-            <w:tcBorders>
-              <w:top w:val="single" w:color="D9D4CA" w:sz="4"/>
-              <w:left w:val="single" w:color="D9D4CA" w:sz="4"/>
-              <w:bottom w:val="single" w:color="D9D4CA" w:sz="4"/>
-              <w:right w:val="single" w:color="D9D4CA" w:sz="4"/>
-            </w:tcBorders>
-            <w:tcMar>
-              <w:top w:type="dxa" w:w="60"/>
-              <w:left w:type="dxa" w:w="80"/>
-              <w:bottom w:type="dxa" w:w="60"/>
-              <w:right w:type="dxa" w:w="80"/>
-            </w:tcMar>
-          </w:tcPr>
-          <w:p>
-            <w:r/>
+          </w:tcPr>
+          <w:p>
+            <w:r>
+              <w:rPr>
+                <w:rFonts w:ascii="Calibri" w:hAnsi="Calibri"/>
+                <w:sz w:val="17"/>
+              </w:rPr>
+              <w:t>Data</w:t>
+            </w:r>
           </w:p>
         </w:tc>
         <w:tc>
           <w:tcPr>
             <w:tcW w:type="dxa" w:w="1329"/>
-            <w:tcBorders>
-              <w:top w:val="single" w:color="D9D4CA" w:sz="4"/>
-              <w:left w:val="single" w:color="D9D4CA" w:sz="4"/>
-              <w:bottom w:val="single" w:color="D9D4CA" w:sz="4"/>
-              <w:right w:val="single" w:color="D9D4CA" w:sz="4"/>
-            </w:tcBorders>
-            <w:tcMar>
-              <w:top w:type="dxa" w:w="60"/>
-              <w:left w:type="dxa" w:w="80"/>
-              <w:bottom w:type="dxa" w:w="60"/>
-              <w:right w:type="dxa" w:w="80"/>
-            </w:tcMar>
-          </w:tcPr>
-          <w:p>
-            <w:r/>
+          </w:tcPr>
+          <w:p>
+            <w:r>
+              <w:rPr>
+                <w:rFonts w:ascii="Calibri" w:hAnsi="Calibri"/>
+                <w:sz w:val="17"/>
+              </w:rPr>
+              <w:t>docs/diagrams/erd.mmd vs docs/SQL/SQL.sql</w:t>
+            </w:r>
           </w:p>
         </w:tc>
         <w:tc>
           <w:tcPr>
             <w:tcW w:type="dxa" w:w="2326"/>
-            <w:tcBorders>
-              <w:top w:val="single" w:color="D9D4CA" w:sz="4"/>
-              <w:left w:val="single" w:color="D9D4CA" w:sz="4"/>
-              <w:bottom w:val="single" w:color="D9D4CA" w:sz="4"/>
-              <w:right w:val="single" w:color="D9D4CA" w:sz="4"/>
-            </w:tcBorders>
-            <w:tcMar>
-              <w:top w:type="dxa" w:w="60"/>
-              <w:left w:type="dxa" w:w="80"/>
-              <w:bottom w:type="dxa" w:w="60"/>
-              <w:right w:type="dxa" w:w="80"/>
-            </w:tcMar>
-          </w:tcPr>
-          <w:p>
-            <w:r/>
+          </w:tcPr>
+          <w:p>
+            <w:r>
+              <w:rPr>
+                <w:rFonts w:ascii="Calibri" w:hAnsi="Calibri"/>
+                <w:sz w:val="17"/>
+              </w:rPr>
+              <w:t>Attribute and column naming mismatches between Logical ERD and PostgreSQL schema.</w:t>
+            </w:r>
           </w:p>
         </w:tc>
         <w:tc>
           <w:tcPr>
             <w:tcW w:type="dxa" w:w="930"/>
-            <w:tcBorders>
-              <w:top w:val="single" w:color="D9D4CA" w:sz="4"/>
-              <w:left w:val="single" w:color="D9D4CA" w:sz="4"/>
-              <w:bottom w:val="single" w:color="D9D4CA" w:sz="4"/>
-              <w:right w:val="single" w:color="D9D4CA" w:sz="4"/>
-            </w:tcBorders>
-            <w:tcMar>
-              <w:top w:type="dxa" w:w="60"/>
-              <w:left w:type="dxa" w:w="80"/>
-              <w:bottom w:type="dxa" w:w="60"/>
-              <w:right w:type="dxa" w:w="80"/>
-            </w:tcMar>
-          </w:tcPr>
-          <w:p>
-            <w:r/>
+          </w:tcPr>
+          <w:p>
+            <w:r>
+              <w:rPr>
+                <w:rFonts w:ascii="Calibri" w:hAnsi="Calibri"/>
+                <w:sz w:val="17"/>
+              </w:rPr>
+              <w:t>High</w:t>
+            </w:r>
           </w:p>
         </w:tc>
         <w:tc>
           <w:tcPr>
             <w:tcW w:type="dxa" w:w="1329"/>
-            <w:tcBorders>
-              <w:top w:val="single" w:color="D9D4CA" w:sz="4"/>
-              <w:left w:val="single" w:color="D9D4CA" w:sz="4"/>
-              <w:bottom w:val="single" w:color="D9D4CA" w:sz="4"/>
-              <w:right w:val="single" w:color="D9D4CA" w:sz="4"/>
-            </w:tcBorders>
-            <w:tcMar>
-              <w:top w:type="dxa" w:w="60"/>
-              <w:left w:type="dxa" w:w="80"/>
-              <w:bottom w:type="dxa" w:w="60"/>
-              <w:right w:type="dxa" w:w="80"/>
-            </w:tcMar>
-          </w:tcPr>
-          <w:p>
-            <w:r/>
+          </w:tcPr>
+          <w:p>
+            <w:r>
+              <w:rPr>
+                <w:rFonts w:ascii="Calibri" w:hAnsi="Calibri"/>
+                <w:sz w:val="17"/>
+              </w:rPr>
+              <w:t>ERD uses discrimination_index, anti_cheat_score; SQL uses option_a..d, integrity_status.</w:t>
+            </w:r>
           </w:p>
         </w:tc>
         <w:tc>
           <w:tcPr>
             <w:tcW w:type="dxa" w:w="1997"/>
-            <w:tcBorders>
-              <w:top w:val="single" w:color="D9D4CA" w:sz="4"/>
-              <w:left w:val="single" w:color="D9D4CA" w:sz="4"/>
-              <w:bottom w:val="single" w:color="D9D4CA" w:sz="4"/>
-              <w:right w:val="single" w:color="D9D4CA" w:sz="4"/>
-            </w:tcBorders>
-            <w:tcMar>
-              <w:top w:type="dxa" w:w="60"/>
-              <w:left w:type="dxa" w:w="80"/>
-              <w:bottom w:type="dxa" w:w="60"/>
-              <w:right w:type="dxa" w:w="80"/>
-            </w:tcMar>
-          </w:tcPr>
-          <w:p>
-            <w:r/>
+          </w:tcPr>
+          <w:p>
+            <w:r>
+              <w:rPr>
+                <w:rFonts w:ascii="Calibri" w:hAnsi="Calibri"/>
+                <w:sz w:val="17"/>
+              </w:rPr>
+              <w:t>Planned (Trần Thái Thịnh, 28/10/2026) - Synchronize erd.mmd attributes with SQL.sql DDL.</w:t>
+            </w:r>
+          </w:p>
+        </w:tc>
+      </w:tr>
+      <w:tr>
+        <w:tc>
+          <w:tcPr>
+            <w:tcW w:type="dxa" w:w="664"/>
+          </w:tcPr>
+          <w:p>
+            <w:r>
+              <w:rPr>
+                <w:rFonts w:ascii="Calibri" w:hAnsi="Calibri"/>
+                <w:sz w:val="17"/>
+              </w:rPr>
+              <w:t>DAT-03</w:t>
+            </w:r>
+          </w:p>
+        </w:tc>
+        <w:tc>
+          <w:tcPr>
+            <w:tcW w:type="dxa" w:w="1063"/>
+          </w:tcPr>
+          <w:p>
+            <w:r>
+              <w:rPr>
+                <w:rFonts w:ascii="Calibri" w:hAnsi="Calibri"/>
+                <w:sz w:val="17"/>
+              </w:rPr>
+              <w:t>Data</w:t>
+            </w:r>
+          </w:p>
+        </w:tc>
+        <w:tc>
+          <w:tcPr>
+            <w:tcW w:type="dxa" w:w="1329"/>
+          </w:tcPr>
+          <w:p>
+            <w:r>
+              <w:rPr>
+                <w:rFonts w:ascii="Calibri" w:hAnsi="Calibri"/>
+                <w:sz w:val="17"/>
+              </w:rPr>
+              <w:t>docs/SQL/SQL.sql vs All Services EF Core</w:t>
+            </w:r>
+          </w:p>
+        </w:tc>
+        <w:tc>
+          <w:tcPr>
+            <w:tcW w:type="dxa" w:w="2326"/>
+          </w:tcPr>
+          <w:p>
+            <w:r>
+              <w:rPr>
+                <w:rFonts w:ascii="Calibri" w:hAnsi="Calibri"/>
+                <w:sz w:val="17"/>
+              </w:rPr>
+              <w:t>Database tables archetype_patterns and novel_pattern_proposals lack C# EF Core mappings.</w:t>
+            </w:r>
+          </w:p>
+        </w:tc>
+        <w:tc>
+          <w:tcPr>
+            <w:tcW w:type="dxa" w:w="930"/>
+          </w:tcPr>
+          <w:p>
+            <w:r>
+              <w:rPr>
+                <w:rFonts w:ascii="Calibri" w:hAnsi="Calibri"/>
+                <w:sz w:val="17"/>
+              </w:rPr>
+              <w:t>Medium</w:t>
+            </w:r>
+          </w:p>
+        </w:tc>
+        <w:tc>
+          <w:tcPr>
+            <w:tcW w:type="dxa" w:w="1329"/>
+          </w:tcPr>
+          <w:p>
+            <w:r>
+              <w:rPr>
+                <w:rFonts w:ascii="Calibri" w:hAnsi="Calibri"/>
+                <w:sz w:val="17"/>
+              </w:rPr>
+              <w:t>Tables exist in SQL.sql but are missing from ContentDbContext and PracticeDbContext.</w:t>
+            </w:r>
+          </w:p>
+        </w:tc>
+        <w:tc>
+          <w:tcPr>
+            <w:tcW w:type="dxa" w:w="1997"/>
+          </w:tcPr>
+          <w:p>
+            <w:r>
+              <w:rPr>
+                <w:rFonts w:ascii="Calibri" w:hAnsi="Calibri"/>
+                <w:sz w:val="17"/>
+              </w:rPr>
+              <w:t>Planned (Trần Thái Thịnh, 28/10/2026) - Add C# Domain Entities and DbSets in ContentDbContext.</w:t>
+            </w:r>
+          </w:p>
+        </w:tc>
+      </w:tr>
+      <w:tr>
+        <w:tc>
+          <w:tcPr>
+            <w:tcW w:type="dxa" w:w="664"/>
+          </w:tcPr>
+          <w:p>
+            <w:r>
+              <w:rPr>
+                <w:rFonts w:ascii="Calibri" w:hAnsi="Calibri"/>
+                <w:sz w:val="17"/>
+              </w:rPr>
+              <w:t>STA-01</w:t>
+            </w:r>
+          </w:p>
+        </w:tc>
+        <w:tc>
+          <w:tcPr>
+            <w:tcW w:type="dxa" w:w="1063"/>
+          </w:tcPr>
+          <w:p>
+            <w:r>
+              <w:rPr>
+                <w:rFonts w:ascii="Calibri" w:hAnsi="Calibri"/>
+                <w:sz w:val="17"/>
+              </w:rPr>
+              <w:t>States</w:t>
+            </w:r>
+          </w:p>
+        </w:tc>
+        <w:tc>
+          <w:tcPr>
+            <w:tcW w:type="dxa" w:w="1329"/>
+          </w:tcPr>
+          <w:p>
+            <w:r>
+              <w:rPr>
+                <w:rFonts w:ascii="Calibri" w:hAnsi="Calibri"/>
+                <w:sz w:val="17"/>
+              </w:rPr>
+              <w:t>V-Eval_Architecture_Plan.md vs ExamSubmission.cs</w:t>
+            </w:r>
+          </w:p>
+        </w:tc>
+        <w:tc>
+          <w:tcPr>
+            <w:tcW w:type="dxa" w:w="2326"/>
+          </w:tcPr>
+          <w:p>
+            <w:r>
+              <w:rPr>
+                <w:rFonts w:ascii="Calibri" w:hAnsi="Calibri"/>
+                <w:sz w:val="17"/>
+              </w:rPr>
+              <w:t>Exam states in code (UNDER_REVIEW, DISQUALIFIED, EXPIRED) missing from architecture state machine.</w:t>
+            </w:r>
+          </w:p>
+        </w:tc>
+        <w:tc>
+          <w:tcPr>
+            <w:tcW w:type="dxa" w:w="930"/>
+          </w:tcPr>
+          <w:p>
+            <w:r>
+              <w:rPr>
+                <w:rFonts w:ascii="Calibri" w:hAnsi="Calibri"/>
+                <w:sz w:val="17"/>
+              </w:rPr>
+              <w:t>High</w:t>
+            </w:r>
+          </w:p>
+        </w:tc>
+        <w:tc>
+          <w:tcPr>
+            <w:tcW w:type="dxa" w:w="1329"/>
+          </w:tcPr>
+          <w:p>
+            <w:r>
+              <w:rPr>
+                <w:rFonts w:ascii="Calibri" w:hAnsi="Calibri"/>
+                <w:sz w:val="17"/>
+              </w:rPr>
+              <w:t>SubmitMockExamCommandHandler.cs sets UNDER_REVIEW; stateDiagram in docs lacks these states.</w:t>
+            </w:r>
+          </w:p>
+        </w:tc>
+        <w:tc>
+          <w:tcPr>
+            <w:tcW w:type="dxa" w:w="1997"/>
+          </w:tcPr>
+          <w:p>
+            <w:r>
+              <w:rPr>
+                <w:rFonts w:ascii="Calibri" w:hAnsi="Calibri"/>
+                <w:sz w:val="17"/>
+              </w:rPr>
+              <w:t>Planned (Mai Thành Nhân, 28/10/2026) - Update stateDiagram in Architecture Plan with full exam lifecycle.</w:t>
+            </w:r>
+          </w:p>
+        </w:tc>
+      </w:tr>
+      <w:tr>
+        <w:tc>
+          <w:tcPr>
+            <w:tcW w:type="dxa" w:w="664"/>
+          </w:tcPr>
+          <w:p>
+            <w:r>
+              <w:rPr>
+                <w:rFonts w:ascii="Calibri" w:hAnsi="Calibri"/>
+                <w:sz w:val="17"/>
+              </w:rPr>
+              <w:t>STA-02</w:t>
+            </w:r>
+          </w:p>
+        </w:tc>
+        <w:tc>
+          <w:tcPr>
+            <w:tcW w:type="dxa" w:w="1063"/>
+          </w:tcPr>
+          <w:p>
+            <w:r>
+              <w:rPr>
+                <w:rFonts w:ascii="Calibri" w:hAnsi="Calibri"/>
+                <w:sz w:val="17"/>
+              </w:rPr>
+              <w:t>States</w:t>
+            </w:r>
+          </w:p>
+        </w:tc>
+        <w:tc>
+          <w:tcPr>
+            <w:tcW w:type="dxa" w:w="1329"/>
+          </w:tcPr>
+          <w:p>
+            <w:r>
+              <w:rPr>
+                <w:rFonts w:ascii="Calibri" w:hAnsi="Calibri"/>
+                <w:sz w:val="17"/>
+              </w:rPr>
+              <w:t>Report 7 §3.5.2 vs GenerateRoadmapCommandHandler.cs</w:t>
+            </w:r>
+          </w:p>
+        </w:tc>
+        <w:tc>
+          <w:tcPr>
+            <w:tcW w:type="dxa" w:w="2326"/>
+          </w:tcPr>
+          <w:p>
+            <w:r>
+              <w:rPr>
+                <w:rFonts w:ascii="Calibri" w:hAnsi="Calibri"/>
+                <w:sz w:val="17"/>
+              </w:rPr>
+              <w:t>SRS requires roadmap created in DRAFT for mentor approval, but code initializes directly as ACTIVE.</w:t>
+            </w:r>
+          </w:p>
+        </w:tc>
+        <w:tc>
+          <w:tcPr>
+            <w:tcW w:type="dxa" w:w="930"/>
+          </w:tcPr>
+          <w:p>
+            <w:r>
+              <w:rPr>
+                <w:rFonts w:ascii="Calibri" w:hAnsi="Calibri"/>
+                <w:sz w:val="17"/>
+              </w:rPr>
+              <w:t>Medium</w:t>
+            </w:r>
+          </w:p>
+        </w:tc>
+        <w:tc>
+          <w:tcPr>
+            <w:tcW w:type="dxa" w:w="1329"/>
+          </w:tcPr>
+          <w:p>
+            <w:r>
+              <w:rPr>
+                <w:rFonts w:ascii="Calibri" w:hAnsi="Calibri"/>
+                <w:sz w:val="17"/>
+              </w:rPr>
+              <w:t>Report 7 p. 57 (FR 3.5.2 requires DRAFT) vs GenerateRoadmapCommandHandler.cs line 123 (ACTIVE).</w:t>
+            </w:r>
+          </w:p>
+        </w:tc>
+        <w:tc>
+          <w:tcPr>
+            <w:tcW w:type="dxa" w:w="1997"/>
+          </w:tcPr>
+          <w:p>
+            <w:r>
+              <w:rPr>
+                <w:rFonts w:ascii="Calibri" w:hAnsi="Calibri"/>
+                <w:sz w:val="17"/>
+              </w:rPr>
+              <w:t>Planned (Trần Thái Thịnh, 28/10/2026) - Implement initial DRAFT state and mentor kickoff endpoint.</w:t>
+            </w:r>
+          </w:p>
+        </w:tc>
+      </w:tr>
+      <w:tr>
+        <w:tc>
+          <w:tcPr>
+            <w:tcW w:type="dxa" w:w="664"/>
+          </w:tcPr>
+          <w:p>
+            <w:r>
+              <w:rPr>
+                <w:rFonts w:ascii="Calibri" w:hAnsi="Calibri"/>
+                <w:sz w:val="17"/>
+              </w:rPr>
+              <w:t>STA-03</w:t>
+            </w:r>
+          </w:p>
+        </w:tc>
+        <w:tc>
+          <w:tcPr>
+            <w:tcW w:type="dxa" w:w="1063"/>
+          </w:tcPr>
+          <w:p>
+            <w:r>
+              <w:rPr>
+                <w:rFonts w:ascii="Calibri" w:hAnsi="Calibri"/>
+                <w:sz w:val="17"/>
+              </w:rPr>
+              <w:t>States</w:t>
+            </w:r>
+          </w:p>
+        </w:tc>
+        <w:tc>
+          <w:tcPr>
+            <w:tcW w:type="dxa" w:w="1329"/>
+          </w:tcPr>
+          <w:p>
+            <w:r>
+              <w:rPr>
+                <w:rFonts w:ascii="Calibri" w:hAnsi="Calibri"/>
+                <w:sz w:val="17"/>
+              </w:rPr>
+              <w:t>Report 7 Chapter IV vs MistakeNotebook.cs</w:t>
+            </w:r>
+          </w:p>
+        </w:tc>
+        <w:tc>
+          <w:tcPr>
+            <w:tcW w:type="dxa" w:w="2326"/>
+          </w:tcPr>
+          <w:p>
+            <w:r>
+              <w:rPr>
+                <w:rFonts w:ascii="Calibri" w:hAnsi="Calibri"/>
+                <w:sz w:val="17"/>
+              </w:rPr>
+              <w:t>6-state lifecycle of MistakeNotebook in code lacks a state machine diagram in SDD.</w:t>
+            </w:r>
+          </w:p>
+        </w:tc>
+        <w:tc>
+          <w:tcPr>
+            <w:tcW w:type="dxa" w:w="930"/>
+          </w:tcPr>
+          <w:p>
+            <w:r>
+              <w:rPr>
+                <w:rFonts w:ascii="Calibri" w:hAnsi="Calibri"/>
+                <w:sz w:val="17"/>
+              </w:rPr>
+              <w:t>Low</w:t>
+            </w:r>
+          </w:p>
+        </w:tc>
+        <w:tc>
+          <w:tcPr>
+            <w:tcW w:type="dxa" w:w="1329"/>
+          </w:tcPr>
+          <w:p>
+            <w:r>
+              <w:rPr>
+                <w:rFonts w:ascii="Calibri" w:hAnsi="Calibri"/>
+                <w:sz w:val="17"/>
+              </w:rPr>
+              <w:t>MistakeNotebook.cs lines 29–37 defines 6 states; Report 7 Chapter IV lacks state diagram.</w:t>
+            </w:r>
+          </w:p>
+        </w:tc>
+        <w:tc>
+          <w:tcPr>
+            <w:tcW w:type="dxa" w:w="1997"/>
+          </w:tcPr>
+          <w:p>
+            <w:r>
+              <w:rPr>
+                <w:rFonts w:ascii="Calibri" w:hAnsi="Calibri"/>
+                <w:sz w:val="17"/>
+              </w:rPr>
+              <w:t>Planned (Phạm Tấn Lộc, 28/10/2026) - Add MistakeNotebook SM-2 state diagram to docs and SDD.</w:t>
+            </w:r>
+          </w:p>
+        </w:tc>
+      </w:tr>
+      <w:tr>
+        <w:tc>
+          <w:tcPr>
+            <w:tcW w:type="dxa" w:w="664"/>
+          </w:tcPr>
+          <w:p>
+            <w:r>
+              <w:rPr>
+                <w:rFonts w:ascii="Calibri" w:hAnsi="Calibri"/>
+                <w:sz w:val="17"/>
+              </w:rPr>
+              <w:t>STA-04</w:t>
+            </w:r>
+          </w:p>
+        </w:tc>
+        <w:tc>
+          <w:tcPr>
+            <w:tcW w:type="dxa" w:w="1063"/>
+          </w:tcPr>
+          <w:p>
+            <w:r>
+              <w:rPr>
+                <w:rFonts w:ascii="Calibri" w:hAnsi="Calibri"/>
+                <w:sz w:val="17"/>
+              </w:rPr>
+              <w:t>States</w:t>
+            </w:r>
+          </w:p>
+        </w:tc>
+        <w:tc>
+          <w:tcPr>
+            <w:tcW w:type="dxa" w:w="1329"/>
+          </w:tcPr>
+          <w:p>
+            <w:r>
+              <w:rPr>
+                <w:rFonts w:ascii="Calibri" w:hAnsi="Calibri"/>
+                <w:sz w:val="17"/>
+              </w:rPr>
+              <w:t>RoadmapNode.cs &amp; GenerateRoadmapCommandHandler.cs</w:t>
+            </w:r>
+          </w:p>
+        </w:tc>
+        <w:tc>
+          <w:tcPr>
+            <w:tcW w:type="dxa" w:w="2326"/>
+          </w:tcPr>
+          <w:p>
+            <w:r>
+              <w:rPr>
+                <w:rFonts w:ascii="Calibri" w:hAnsi="Calibri"/>
+                <w:sz w:val="17"/>
+              </w:rPr>
+              <w:t>RoadmapNode state SKIPPED_PRUNED has no reactivation transition.</w:t>
+            </w:r>
+          </w:p>
+        </w:tc>
+        <w:tc>
+          <w:tcPr>
+            <w:tcW w:type="dxa" w:w="930"/>
+          </w:tcPr>
+          <w:p>
+            <w:r>
+              <w:rPr>
+                <w:rFonts w:ascii="Calibri" w:hAnsi="Calibri"/>
+                <w:sz w:val="17"/>
+              </w:rPr>
+              <w:t>Low</w:t>
+            </w:r>
+          </w:p>
+        </w:tc>
+        <w:tc>
+          <w:tcPr>
+            <w:tcW w:type="dxa" w:w="1329"/>
+          </w:tcPr>
+          <w:p>
+            <w:r>
+              <w:rPr>
+                <w:rFonts w:ascii="Calibri" w:hAnsi="Calibri"/>
+                <w:sz w:val="17"/>
+              </w:rPr>
+              <w:t>Code sets SKIPPED_PRUNED with no handler to unprune nodes.</w:t>
+            </w:r>
+          </w:p>
+        </w:tc>
+        <w:tc>
+          <w:tcPr>
+            <w:tcW w:type="dxa" w:w="1997"/>
+          </w:tcPr>
+          <w:p>
+            <w:r>
+              <w:rPr>
+                <w:rFonts w:ascii="Calibri" w:hAnsi="Calibri"/>
+                <w:sz w:val="17"/>
+              </w:rPr>
+              <w:t>Kept - Full roadmap regeneration recalculates DAG pruning; manual single-node unpruning is restricted.</w:t>
+            </w:r>
+          </w:p>
+        </w:tc>
+      </w:tr>
+      <w:tr>
+        <w:tc>
+          <w:tcPr>
+            <w:tcW w:type="dxa" w:w="664"/>
+          </w:tcPr>
+          <w:p>
+            <w:r>
+              <w:rPr>
+                <w:rFonts w:ascii="Calibri" w:hAnsi="Calibri"/>
+                <w:sz w:val="17"/>
+              </w:rPr>
+              <w:t>FLO-01</w:t>
+            </w:r>
+          </w:p>
+        </w:tc>
+        <w:tc>
+          <w:tcPr>
+            <w:tcW w:type="dxa" w:w="1063"/>
+          </w:tcPr>
+          <w:p>
+            <w:r>
+              <w:rPr>
+                <w:rFonts w:ascii="Calibri" w:hAnsi="Calibri"/>
+                <w:sz w:val="17"/>
+              </w:rPr>
+              <w:t>Flows</w:t>
+            </w:r>
+          </w:p>
+        </w:tc>
+        <w:tc>
+          <w:tcPr>
+            <w:tcW w:type="dxa" w:w="1329"/>
+          </w:tcPr>
+          <w:p>
+            <w:r>
+              <w:rPr>
+                <w:rFonts w:ascii="Calibri" w:hAnsi="Calibri"/>
+                <w:sz w:val="17"/>
+              </w:rPr>
+              <w:t>core4_activity.mmd (Lanes 3–4) vs All Services</w:t>
+            </w:r>
+          </w:p>
+        </w:tc>
+        <w:tc>
+          <w:tcPr>
+            <w:tcW w:type="dxa" w:w="2326"/>
+          </w:tcPr>
+          <w:p>
+            <w:r>
+              <w:rPr>
+                <w:rFonts w:ascii="Calibri" w:hAnsi="Calibri"/>
+                <w:sz w:val="17"/>
+              </w:rPr>
+              <w:t>Activity diagram Core 4 teacher feedback loop (flagging AI responses, pattern proposal) not in backend.</w:t>
+            </w:r>
+          </w:p>
+        </w:tc>
+        <w:tc>
+          <w:tcPr>
+            <w:tcW w:type="dxa" w:w="930"/>
+          </w:tcPr>
+          <w:p>
+            <w:r>
+              <w:rPr>
+                <w:rFonts w:ascii="Calibri" w:hAnsi="Calibri"/>
+                <w:sz w:val="17"/>
+              </w:rPr>
+              <w:t>High</w:t>
+            </w:r>
+          </w:p>
+        </w:tc>
+        <w:tc>
+          <w:tcPr>
+            <w:tcW w:type="dxa" w:w="1329"/>
+          </w:tcPr>
+          <w:p>
+            <w:r>
+              <w:rPr>
+                <w:rFonts w:ascii="Calibri" w:hAnsi="Calibri"/>
+                <w:sz w:val="17"/>
+              </w:rPr>
+              <w:t>core4_activity.mmd nodes Act_ClickFlag, Act_ProposePattern have 0 backend API endpoints.</w:t>
+            </w:r>
+          </w:p>
+        </w:tc>
+        <w:tc>
+          <w:tcPr>
+            <w:tcW w:type="dxa" w:w="1997"/>
+          </w:tcPr>
+          <w:p>
+            <w:r>
+              <w:rPr>
+                <w:rFonts w:ascii="Calibri" w:hAnsi="Calibri"/>
+                <w:sz w:val="17"/>
+              </w:rPr>
+              <w:t>Planned (Phạm Tấn Lộc &amp; Nguyễn Duy Khôi, 29/10/2026) - Implement APIs for AI response flagging and pattern proposal.</w:t>
+            </w:r>
+          </w:p>
+        </w:tc>
+      </w:tr>
+      <w:tr>
+        <w:tc>
+          <w:tcPr>
+            <w:tcW w:type="dxa" w:w="664"/>
+          </w:tcPr>
+          <w:p>
+            <w:r>
+              <w:rPr>
+                <w:rFonts w:ascii="Calibri" w:hAnsi="Calibri"/>
+                <w:sz w:val="17"/>
+              </w:rPr>
+              <w:t>FLO-02</w:t>
+            </w:r>
+          </w:p>
+        </w:tc>
+        <w:tc>
+          <w:tcPr>
+            <w:tcW w:type="dxa" w:w="1063"/>
+          </w:tcPr>
+          <w:p>
+            <w:r>
+              <w:rPr>
+                <w:rFonts w:ascii="Calibri" w:hAnsi="Calibri"/>
+                <w:sz w:val="17"/>
+              </w:rPr>
+              <w:t>Flows</w:t>
+            </w:r>
+          </w:p>
+        </w:tc>
+        <w:tc>
+          <w:tcPr>
+            <w:tcW w:type="dxa" w:w="1329"/>
+          </w:tcPr>
+          <w:p>
+            <w:r>
+              <w:rPr>
+                <w:rFonts w:ascii="Calibri" w:hAnsi="Calibri"/>
+                <w:sz w:val="17"/>
+              </w:rPr>
+              <w:t>core5_activity.mmd (Lane 3) vs All Services</w:t>
+            </w:r>
+          </w:p>
+        </w:tc>
+        <w:tc>
+          <w:tcPr>
+            <w:tcW w:type="dxa" w:w="2326"/>
+          </w:tcPr>
+          <w:p>
+            <w:r>
+              <w:rPr>
+                <w:rFonts w:ascii="Calibri" w:hAnsi="Calibri"/>
+                <w:sz w:val="17"/>
+              </w:rPr>
+              <w:t>Activity diagram Core 5 parent oversight and SMS disciplinary escalation workflow not implemented.</w:t>
+            </w:r>
+          </w:p>
+        </w:tc>
+        <w:tc>
+          <w:tcPr>
+            <w:tcW w:type="dxa" w:w="930"/>
+          </w:tcPr>
+          <w:p>
+            <w:r>
+              <w:rPr>
+                <w:rFonts w:ascii="Calibri" w:hAnsi="Calibri"/>
+                <w:sz w:val="17"/>
+              </w:rPr>
+              <w:t>Medium</w:t>
+            </w:r>
+          </w:p>
+        </w:tc>
+        <w:tc>
+          <w:tcPr>
+            <w:tcW w:type="dxa" w:w="1329"/>
+          </w:tcPr>
+          <w:p>
+            <w:r>
+              <w:rPr>
+                <w:rFonts w:ascii="Calibri" w:hAnsi="Calibri"/>
+                <w:sz w:val="17"/>
+              </w:rPr>
+              <w:t>core5_activity.mmd Lane 3 has no backend controller or SMS service integration.</w:t>
+            </w:r>
+          </w:p>
+        </w:tc>
+        <w:tc>
+          <w:tcPr>
+            <w:tcW w:type="dxa" w:w="1997"/>
+          </w:tcPr>
+          <w:p>
+            <w:r>
+              <w:rPr>
+                <w:rFonts w:ascii="Calibri" w:hAnsi="Calibri"/>
+                <w:sz w:val="17"/>
+              </w:rPr>
+              <w:t>Kept - Excluded per BM01 §1.2; Lane 3 will be updated to student self-monitoring.</w:t>
+            </w:r>
+          </w:p>
+        </w:tc>
+      </w:tr>
+      <w:tr>
+        <w:tc>
+          <w:tcPr>
+            <w:tcW w:type="dxa" w:w="664"/>
+          </w:tcPr>
+          <w:p>
+            <w:r>
+              <w:rPr>
+                <w:rFonts w:ascii="Calibri" w:hAnsi="Calibri"/>
+                <w:sz w:val="17"/>
+              </w:rPr>
+              <w:t>FLO-03</w:t>
+            </w:r>
+          </w:p>
+        </w:tc>
+        <w:tc>
+          <w:tcPr>
+            <w:tcW w:type="dxa" w:w="1063"/>
+          </w:tcPr>
+          <w:p>
+            <w:r>
+              <w:rPr>
+                <w:rFonts w:ascii="Calibri" w:hAnsi="Calibri"/>
+                <w:sz w:val="17"/>
+              </w:rPr>
+              <w:t>Flows</w:t>
+            </w:r>
+          </w:p>
+        </w:tc>
+        <w:tc>
+          <w:tcPr>
+            <w:tcW w:type="dxa" w:w="1329"/>
+          </w:tcPr>
+          <w:p>
+            <w:r>
+              <w:rPr>
+                <w:rFonts w:ascii="Calibri" w:hAnsi="Calibri"/>
+                <w:sz w:val="17"/>
+              </w:rPr>
+              <w:t>BM04 §7–8 vs All Services Tests</w:t>
+            </w:r>
+          </w:p>
+        </w:tc>
+        <w:tc>
+          <w:tcPr>
+            <w:tcW w:type="dxa" w:w="2326"/>
+          </w:tcPr>
+          <w:p>
+            <w:r>
+              <w:rPr>
+                <w:rFonts w:ascii="Calibri" w:hAnsi="Calibri"/>
+                <w:sz w:val="17"/>
+              </w:rPr>
+              <w:t>Test case deficit: BM04 commits 48 tests (34 in CI), but repo contains only 16 C# unit tests.</w:t>
+            </w:r>
+          </w:p>
+        </w:tc>
+        <w:tc>
+          <w:tcPr>
+            <w:tcW w:type="dxa" w:w="930"/>
+          </w:tcPr>
+          <w:p>
+            <w:r>
+              <w:rPr>
+                <w:rFonts w:ascii="Calibri" w:hAnsi="Calibri"/>
+                <w:sz w:val="17"/>
+              </w:rPr>
+              <w:t>High</w:t>
+            </w:r>
+          </w:p>
+        </w:tc>
+        <w:tc>
+          <w:tcPr>
+            <w:tcW w:type="dxa" w:w="1329"/>
+          </w:tcPr>
+          <w:p>
+            <w:r>
+              <w:rPr>
+                <w:rFonts w:ascii="Calibri" w:hAnsi="Calibri"/>
+                <w:sz w:val="17"/>
+              </w:rPr>
+              <w:t>BM04 §7–8 commits 48 tests vs 16 C# test methods across 7 files; 0 E2E and 0 state tests.</w:t>
+            </w:r>
+          </w:p>
+        </w:tc>
+        <w:tc>
+          <w:tcPr>
+            <w:tcW w:type="dxa" w:w="1997"/>
+          </w:tcPr>
+          <w:p>
+            <w:r>
+              <w:rPr>
+                <w:rFonts w:ascii="Calibri" w:hAnsi="Calibri"/>
+                <w:sz w:val="17"/>
+              </w:rPr>
+              <w:t>Planned (Phạm Tấn Lộc &amp; Mai Thành Nhân, 29/10/2026) - Add xUnit tests for WF-01..05 to meet 34 CI test commitment.</w:t>
+            </w:r>
+          </w:p>
+        </w:tc>
+      </w:tr>
+      <w:tr>
+        <w:tc>
+          <w:tcPr>
+            <w:tcW w:type="dxa" w:w="664"/>
+          </w:tcPr>
+          <w:p>
+            <w:r>
+              <w:rPr>
+                <w:rFonts w:ascii="Calibri" w:hAnsi="Calibri"/>
+                <w:sz w:val="17"/>
+              </w:rPr>
+              <w:t>ARC-01</w:t>
+            </w:r>
+          </w:p>
+        </w:tc>
+        <w:tc>
+          <w:tcPr>
+            <w:tcW w:type="dxa" w:w="1063"/>
+          </w:tcPr>
+          <w:p>
+            <w:r>
+              <w:rPr>
+                <w:rFonts w:ascii="Calibri" w:hAnsi="Calibri"/>
+                <w:sz w:val="17"/>
+              </w:rPr>
+              <w:t>Architecture</w:t>
+            </w:r>
+          </w:p>
+        </w:tc>
+        <w:tc>
+          <w:tcPr>
+            <w:tcW w:type="dxa" w:w="1329"/>
+          </w:tcPr>
+          <w:p>
+            <w:r>
+              <w:rPr>
+                <w:rFonts w:ascii="Calibri" w:hAnsi="Calibri"/>
+                <w:sz w:val="17"/>
+              </w:rPr>
+              <w:t>architecture.mmd &amp; Gateway appsettings vs docker-compose.yml</w:t>
+            </w:r>
+          </w:p>
+        </w:tc>
+        <w:tc>
+          <w:tcPr>
+            <w:tcW w:type="dxa" w:w="2326"/>
+          </w:tcPr>
+          <w:p>
+            <w:r>
+              <w:rPr>
+                <w:rFonts w:ascii="Calibri" w:hAnsi="Calibri"/>
+                <w:sz w:val="17"/>
+              </w:rPr>
+              <w:t>Python FastAPI rag-service (port 8000) routed by Gateway but omitted from docker-compose.yml.</w:t>
+            </w:r>
+          </w:p>
+        </w:tc>
+        <w:tc>
+          <w:tcPr>
+            <w:tcW w:type="dxa" w:w="930"/>
+          </w:tcPr>
+          <w:p>
+            <w:r>
+              <w:rPr>
+                <w:rFonts w:ascii="Calibri" w:hAnsi="Calibri"/>
+                <w:sz w:val="17"/>
+              </w:rPr>
+              <w:t>High</w:t>
+            </w:r>
+          </w:p>
+        </w:tc>
+        <w:tc>
+          <w:tcPr>
+            <w:tcW w:type="dxa" w:w="1329"/>
+          </w:tcPr>
+          <w:p>
+            <w:r>
+              <w:rPr>
+                <w:rFonts w:ascii="Calibri" w:hAnsi="Calibri"/>
+                <w:sz w:val="17"/>
+              </w:rPr>
+              <w:t>architecture.mmd &amp; Gateway appsettings route to port 8000; docker-compose.yml defines only 6 services.</w:t>
+            </w:r>
+          </w:p>
+        </w:tc>
+        <w:tc>
+          <w:tcPr>
+            <w:tcW w:type="dxa" w:w="1997"/>
+          </w:tcPr>
+          <w:p>
+            <w:r>
+              <w:rPr>
+                <w:rFonts w:ascii="Calibri" w:hAnsi="Calibri"/>
+                <w:sz w:val="17"/>
+              </w:rPr>
+              <w:t>Planned (Trần Thái Thịnh, 28/10/2026) - Add v-eval-rag-service container into docker-compose.yml.</w:t>
+            </w:r>
+          </w:p>
+        </w:tc>
+      </w:tr>
+      <w:tr>
+        <w:tc>
+          <w:tcPr>
+            <w:tcW w:type="dxa" w:w="664"/>
+          </w:tcPr>
+          <w:p>
+            <w:r>
+              <w:rPr>
+                <w:rFonts w:ascii="Calibri" w:hAnsi="Calibri"/>
+                <w:sz w:val="17"/>
+              </w:rPr>
+              <w:t>ARC-02</w:t>
+            </w:r>
+          </w:p>
+        </w:tc>
+        <w:tc>
+          <w:tcPr>
+            <w:tcW w:type="dxa" w:w="1063"/>
+          </w:tcPr>
+          <w:p>
+            <w:r>
+              <w:rPr>
+                <w:rFonts w:ascii="Calibri" w:hAnsi="Calibri"/>
+                <w:sz w:val="17"/>
+              </w:rPr>
+              <w:t>Architecture</w:t>
+            </w:r>
+          </w:p>
+        </w:tc>
+        <w:tc>
+          <w:tcPr>
+            <w:tcW w:type="dxa" w:w="1329"/>
+          </w:tcPr>
+          <w:p>
+            <w:r>
+              <w:rPr>
+                <w:rFonts w:ascii="Calibri" w:hAnsi="Calibri"/>
+                <w:sz w:val="17"/>
+              </w:rPr>
+              <w:t>Report 7 §4.1 vs architecture.mmd &amp; code</w:t>
+            </w:r>
+          </w:p>
+        </w:tc>
+        <w:tc>
+          <w:tcPr>
+            <w:tcW w:type="dxa" w:w="2326"/>
+          </w:tcPr>
+          <w:p>
+            <w:r>
+              <w:rPr>
+                <w:rFonts w:ascii="Calibri" w:hAnsi="Calibri"/>
+                <w:sz w:val="17"/>
+              </w:rPr>
+              <w:t>Third-party services in SRS (RabbitMQ, FCM, VNPay, Qdrant, Redis) absent from architecture diagram and code.</w:t>
+            </w:r>
+          </w:p>
+        </w:tc>
+        <w:tc>
+          <w:tcPr>
+            <w:tcW w:type="dxa" w:w="930"/>
+          </w:tcPr>
+          <w:p>
+            <w:r>
+              <w:rPr>
+                <w:rFonts w:ascii="Calibri" w:hAnsi="Calibri"/>
+                <w:sz w:val="17"/>
+              </w:rPr>
+              <w:t>Medium</w:t>
+            </w:r>
+          </w:p>
+        </w:tc>
+        <w:tc>
+          <w:tcPr>
+            <w:tcW w:type="dxa" w:w="1329"/>
+          </w:tcPr>
+          <w:p>
+            <w:r>
+              <w:rPr>
+                <w:rFonts w:ascii="Calibri" w:hAnsi="Calibri"/>
+                <w:sz w:val="17"/>
+              </w:rPr>
+              <w:t>Report 7 pp. 19, 63–64 list these services; architecture.mmd and code use pgvector and in-memory caches.</w:t>
+            </w:r>
+          </w:p>
+        </w:tc>
+        <w:tc>
+          <w:tcPr>
+            <w:tcW w:type="dxa" w:w="1997"/>
+          </w:tcPr>
+          <w:p>
+            <w:r>
+              <w:rPr>
+                <w:rFonts w:ascii="Calibri" w:hAnsi="Calibri"/>
+                <w:sz w:val="17"/>
+              </w:rPr>
+              <w:t>Kept - Message broker deferred per Gap G2; pgvector and in-memory cache chosen for demo scope.</w:t>
+            </w:r>
+          </w:p>
+        </w:tc>
+      </w:tr>
+      <w:tr>
+        <w:tc>
+          <w:tcPr>
+            <w:tcW w:type="dxa" w:w="664"/>
+          </w:tcPr>
+          <w:p>
+            <w:r>
+              <w:rPr>
+                <w:rFonts w:ascii="Calibri" w:hAnsi="Calibri"/>
+                <w:sz w:val="17"/>
+              </w:rPr>
+              <w:t>ARC-03</w:t>
+            </w:r>
+          </w:p>
+        </w:tc>
+        <w:tc>
+          <w:tcPr>
+            <w:tcW w:type="dxa" w:w="1063"/>
+          </w:tcPr>
+          <w:p>
+            <w:r>
+              <w:rPr>
+                <w:rFonts w:ascii="Calibri" w:hAnsi="Calibri"/>
+                <w:sz w:val="17"/>
+              </w:rPr>
+              <w:t>Architecture</w:t>
+            </w:r>
+          </w:p>
+        </w:tc>
+        <w:tc>
+          <w:tcPr>
+            <w:tcW w:type="dxa" w:w="1329"/>
+          </w:tcPr>
+          <w:p>
+            <w:r>
+              <w:rPr>
+                <w:rFonts w:ascii="Calibri" w:hAnsi="Calibri"/>
+                <w:sz w:val="17"/>
+              </w:rPr>
+              <w:t>architecture.mmd vs docker-compose.yml vs appsettings.json</w:t>
+            </w:r>
+          </w:p>
+        </w:tc>
+        <w:tc>
+          <w:tcPr>
+            <w:tcW w:type="dxa" w:w="2326"/>
+          </w:tcPr>
+          <w:p>
+            <w:r>
+              <w:rPr>
+                <w:rFonts w:ascii="Calibri" w:hAnsi="Calibri"/>
+                <w:sz w:val="17"/>
+              </w:rPr>
+              <w:t>Port discrepancies between architecture diagram (5000, 5155, 5261) and docker-compose.yml (5212, 5001, 5002).</w:t>
+            </w:r>
+          </w:p>
+        </w:tc>
+        <w:tc>
+          <w:tcPr>
+            <w:tcW w:type="dxa" w:w="930"/>
+          </w:tcPr>
+          <w:p>
+            <w:r>
+              <w:rPr>
+                <w:rFonts w:ascii="Calibri" w:hAnsi="Calibri"/>
+                <w:sz w:val="17"/>
+              </w:rPr>
+              <w:t>Low</w:t>
+            </w:r>
+          </w:p>
+        </w:tc>
+        <w:tc>
+          <w:tcPr>
+            <w:tcW w:type="dxa" w:w="1329"/>
+          </w:tcPr>
+          <w:p>
+            <w:r>
+              <w:rPr>
+                <w:rFonts w:ascii="Calibri" w:hAnsi="Calibri"/>
+                <w:sz w:val="17"/>
+              </w:rPr>
+              <w:t>Mismatched port mappings across launchSettings, docker-compose, and architecture diagram.</w:t>
+            </w:r>
+          </w:p>
+        </w:tc>
+        <w:tc>
+          <w:tcPr>
+            <w:tcW w:type="dxa" w:w="1997"/>
+          </w:tcPr>
+          <w:p>
+            <w:r>
+              <w:rPr>
+                <w:rFonts w:ascii="Calibri" w:hAnsi="Calibri"/>
+                <w:sz w:val="17"/>
+              </w:rPr>
+              <w:t>Fixed (commit 926b5aa) - Ports harmonized across configuration and documentation.</w:t>
+            </w:r>
+          </w:p>
+        </w:tc>
+      </w:tr>
+      <w:tr>
+        <w:tc>
+          <w:tcPr>
+            <w:tcW w:type="dxa" w:w="664"/>
+          </w:tcPr>
+          <w:p>
+            <w:r>
+              <w:rPr>
+                <w:rFonts w:ascii="Calibri" w:hAnsi="Calibri"/>
+                <w:sz w:val="17"/>
+              </w:rPr>
+              <w:t>DES-01</w:t>
+            </w:r>
+          </w:p>
+        </w:tc>
+        <w:tc>
+          <w:tcPr>
+            <w:tcW w:type="dxa" w:w="1063"/>
+          </w:tcPr>
+          <w:p>
+            <w:r>
+              <w:rPr>
+                <w:rFonts w:ascii="Calibri" w:hAnsi="Calibri"/>
+                <w:sz w:val="17"/>
+              </w:rPr>
+              <w:t>Design vs Code</w:t>
+            </w:r>
+          </w:p>
+        </w:tc>
+        <w:tc>
+          <w:tcPr>
+            <w:tcW w:type="dxa" w:w="1329"/>
+          </w:tcPr>
+          <w:p>
+            <w:r>
+              <w:rPr>
+                <w:rFonts w:ascii="Calibri" w:hAnsi="Calibri"/>
+                <w:sz w:val="17"/>
+              </w:rPr>
+              <w:t>Report 7 Chapter IV vs docs/diagrams/</w:t>
+            </w:r>
+          </w:p>
+        </w:tc>
+        <w:tc>
+          <w:tcPr>
+            <w:tcW w:type="dxa" w:w="2326"/>
+          </w:tcPr>
+          <w:p>
+            <w:r>
+              <w:rPr>
+                <w:rFonts w:ascii="Calibri" w:hAnsi="Calibri"/>
+                <w:sz w:val="17"/>
+              </w:rPr>
+              <w:t>SDD Chapter IV in official report Report7_Final Project Report.pdf is empty template text.</w:t>
+            </w:r>
+          </w:p>
+        </w:tc>
+        <w:tc>
+          <w:tcPr>
+            <w:tcW w:type="dxa" w:w="930"/>
+          </w:tcPr>
+          <w:p>
+            <w:r>
+              <w:rPr>
+                <w:rFonts w:ascii="Calibri" w:hAnsi="Calibri"/>
+                <w:sz w:val="17"/>
+              </w:rPr>
+              <w:t>High</w:t>
+            </w:r>
+          </w:p>
+        </w:tc>
+        <w:tc>
+          <w:tcPr>
+            <w:tcW w:type="dxa" w:w="1329"/>
+          </w:tcPr>
+          <w:p>
+            <w:r>
+              <w:rPr>
+                <w:rFonts w:ascii="Calibri" w:hAnsi="Calibri"/>
+                <w:sz w:val="17"/>
+              </w:rPr>
+              <w:t>Report 7 pp. 71–72 contains unfilled template text (&lt;Feature/Function Name1&gt;, [Class Diagram]).</w:t>
+            </w:r>
+          </w:p>
+        </w:tc>
+        <w:tc>
+          <w:tcPr>
+            <w:tcW w:type="dxa" w:w="1997"/>
+          </w:tcPr>
+          <w:p>
+            <w:r>
+              <w:rPr>
+                <w:rFonts w:ascii="Calibri" w:hAnsi="Calibri"/>
+                <w:sz w:val="17"/>
+              </w:rPr>
+              <w:t>Planned (Nguyễn Duy Khôi, 29/10/2026) - Compile and embed diagrams from docs/diagrams into Report 7 Chapter IV.</w:t>
+            </w:r>
+          </w:p>
+        </w:tc>
+      </w:tr>
+      <w:tr>
+        <w:tc>
+          <w:tcPr>
+            <w:tcW w:type="dxa" w:w="664"/>
+          </w:tcPr>
+          <w:p>
+            <w:r>
+              <w:rPr>
+                <w:rFonts w:ascii="Calibri" w:hAnsi="Calibri"/>
+                <w:sz w:val="17"/>
+              </w:rPr>
+              <w:t>DES-02</w:t>
+            </w:r>
+          </w:p>
+        </w:tc>
+        <w:tc>
+          <w:tcPr>
+            <w:tcW w:type="dxa" w:w="1063"/>
+          </w:tcPr>
+          <w:p>
+            <w:r>
+              <w:rPr>
+                <w:rFonts w:ascii="Calibri" w:hAnsi="Calibri"/>
+                <w:sz w:val="17"/>
+              </w:rPr>
+              <w:t>Design vs Code</w:t>
+            </w:r>
+          </w:p>
+        </w:tc>
+        <w:tc>
+          <w:tcPr>
+            <w:tcW w:type="dxa" w:w="1329"/>
+          </w:tcPr>
+          <w:p>
+            <w:r>
+              <w:rPr>
+                <w:rFonts w:ascii="Calibri" w:hAnsi="Calibri"/>
+                <w:sz w:val="17"/>
+              </w:rPr>
+              <w:t>Practice Service vs Content Service vs rag-service</w:t>
+            </w:r>
+          </w:p>
+        </w:tc>
+        <w:tc>
+          <w:tcPr>
+            <w:tcW w:type="dxa" w:w="2326"/>
+          </w:tcPr>
+          <w:p>
+            <w:r>
+              <w:rPr>
+                <w:rFonts w:ascii="Calibri" w:hAnsi="Calibri"/>
+                <w:sz w:val="17"/>
+              </w:rPr>
+              <w:t>Diagnostic test and scoring logic is fragmented across three separate service endpoints.</w:t>
+            </w:r>
+          </w:p>
+        </w:tc>
+        <w:tc>
+          <w:tcPr>
+            <w:tcW w:type="dxa" w:w="930"/>
+          </w:tcPr>
+          <w:p>
+            <w:r>
+              <w:rPr>
+                <w:rFonts w:ascii="Calibri" w:hAnsi="Calibri"/>
+                <w:sz w:val="17"/>
+              </w:rPr>
+              <w:t>Medium</w:t>
+            </w:r>
+          </w:p>
+        </w:tc>
+        <w:tc>
+          <w:tcPr>
+            <w:tcW w:type="dxa" w:w="1329"/>
+          </w:tcPr>
+          <w:p>
+            <w:r>
+              <w:rPr>
+                <w:rFonts w:ascii="Calibri" w:hAnsi="Calibri"/>
+                <w:sz w:val="17"/>
+              </w:rPr>
+              <w:t>Content delivers test, Practice receives submission, rag-service computes 2PL IRT theta.</w:t>
+            </w:r>
+          </w:p>
+        </w:tc>
+        <w:tc>
+          <w:tcPr>
+            <w:tcW w:type="dxa" w:w="1997"/>
+          </w:tcPr>
+          <w:p>
+            <w:r>
+              <w:rPr>
+                <w:rFonts w:ascii="Calibri" w:hAnsi="Calibri"/>
+                <w:sz w:val="17"/>
+              </w:rPr>
+              <w:t>Kept - Decoupled microservice design separating test delivery, attempt handling, and IRT math.</w:t>
+            </w:r>
+          </w:p>
+        </w:tc>
+      </w:tr>
+      <w:tr>
+        <w:tc>
+          <w:tcPr>
+            <w:tcW w:type="dxa" w:w="664"/>
+          </w:tcPr>
+          <w:p>
+            <w:r>
+              <w:rPr>
+                <w:rFonts w:ascii="Calibri" w:hAnsi="Calibri"/>
+                <w:sz w:val="17"/>
+              </w:rPr>
+              <w:t>DES-03</w:t>
+            </w:r>
+          </w:p>
+        </w:tc>
+        <w:tc>
+          <w:tcPr>
+            <w:tcW w:type="dxa" w:w="1063"/>
+          </w:tcPr>
+          <w:p>
+            <w:r>
+              <w:rPr>
+                <w:rFonts w:ascii="Calibri" w:hAnsi="Calibri"/>
+                <w:sz w:val="17"/>
+              </w:rPr>
+              <w:t>Design vs Code</w:t>
+            </w:r>
+          </w:p>
+        </w:tc>
+        <w:tc>
+          <w:tcPr>
+            <w:tcW w:type="dxa" w:w="1329"/>
+          </w:tcPr>
+          <w:p>
+            <w:r>
+              <w:rPr>
+                <w:rFonts w:ascii="Calibri" w:hAnsi="Calibri"/>
+                <w:sz w:val="17"/>
+              </w:rPr>
+              <w:t>PredictionsController.cs vs docs/diagrams/</w:t>
+            </w:r>
+          </w:p>
+        </w:tc>
+        <w:tc>
+          <w:tcPr>
+            <w:tcW w:type="dxa" w:w="2326"/>
+          </w:tcPr>
+          <w:p>
+            <w:r>
+              <w:rPr>
+                <w:rFonts w:ascii="Calibri" w:hAnsi="Calibri"/>
+                <w:sz w:val="17"/>
+              </w:rPr>
+              <w:t>PredictionsController XML doc comments label Knapsack ROI as "Core Flow 6", contradicting system diagrams.</w:t>
+            </w:r>
+          </w:p>
+        </w:tc>
+        <w:tc>
+          <w:tcPr>
+            <w:tcW w:type="dxa" w:w="930"/>
+          </w:tcPr>
+          <w:p>
+            <w:r>
+              <w:rPr>
+                <w:rFonts w:ascii="Calibri" w:hAnsi="Calibri"/>
+                <w:sz w:val="17"/>
+              </w:rPr>
+              <w:t>Low</w:t>
+            </w:r>
+          </w:p>
+        </w:tc>
+        <w:tc>
+          <w:tcPr>
+            <w:tcW w:type="dxa" w:w="1329"/>
+          </w:tcPr>
+          <w:p>
+            <w:r>
+              <w:rPr>
+                <w:rFonts w:ascii="Calibri" w:hAnsi="Calibri"/>
+                <w:sz w:val="17"/>
+              </w:rPr>
+              <w:t>PredictionsController.cs line 16 comments vs core6_activity.mmd (Mistake Notebook SM-2).</w:t>
+            </w:r>
+          </w:p>
+        </w:tc>
+        <w:tc>
+          <w:tcPr>
+            <w:tcW w:type="dxa" w:w="1997"/>
+          </w:tcPr>
+          <w:p>
+            <w:r>
+              <w:rPr>
+                <w:rFonts w:ascii="Calibri" w:hAnsi="Calibri"/>
+                <w:sz w:val="17"/>
+              </w:rPr>
+              <w:t>Planned (Phạm Tấn Lộc, 28/10/2026) - Fix XML comments to refer to Core Flow 5 / F-06.</w:t>
+            </w:r>
           </w:p>
         </w:tc>
       </w:tr>
@@ -2792,15 +3764,10 @@
           <w:p>
             <w:r>
               <w:rPr>
-                <w:rFonts w:ascii="Calibri" w:cs="Calibri" w:eastAsia="Calibri" w:hAnsi="Calibri"/>
-                <w:b w:val="false"/>
-                <w:bCs w:val="false"/>
-                <w:i w:val="false"/>
-                <w:iCs w:val="false"/>
-                <w:sz w:val="19"/>
-                <w:szCs w:val="19"/>
-              </w:rPr>
-              <w:t xml:space="preserve"/>
+                <w:rFonts w:ascii="Calibri" w:hAnsi="Calibri"/>
+                <w:sz w:val="18"/>
+              </w:rPr>
+              <w:t>1</w:t>
             </w:r>
           </w:p>
         </w:tc>
@@ -2823,15 +3790,10 @@
           <w:p>
             <w:r>
               <w:rPr>
-                <w:rFonts w:ascii="Calibri" w:cs="Calibri" w:eastAsia="Calibri" w:hAnsi="Calibri"/>
-                <w:b w:val="false"/>
-                <w:bCs w:val="false"/>
-                <w:i w:val="false"/>
-                <w:iCs w:val="false"/>
-                <w:sz w:val="19"/>
-                <w:szCs w:val="19"/>
-              </w:rPr>
-              <w:t xml:space="preserve"/>
+                <w:rFonts w:ascii="Calibri" w:hAnsi="Calibri"/>
+                <w:sz w:val="18"/>
+              </w:rPr>
+              <w:t>ARC-01</w:t>
             </w:r>
           </w:p>
         </w:tc>
@@ -2854,15 +3816,10 @@
           <w:p>
             <w:r>
               <w:rPr>
-                <w:rFonts w:ascii="Calibri" w:cs="Calibri" w:eastAsia="Calibri" w:hAnsi="Calibri"/>
-                <w:b w:val="false"/>
-                <w:bCs w:val="false"/>
-                <w:i w:val="false"/>
-                <w:iCs w:val="false"/>
-                <w:sz w:val="19"/>
-                <w:szCs w:val="19"/>
-              </w:rPr>
-              <w:t xml:space="preserve"/>
+                <w:rFonts w:ascii="Calibri" w:hAnsi="Calibri"/>
+                <w:sz w:val="18"/>
+              </w:rPr>
+              <w:t>Python FastAPI rag-service (port 8000) omitted from docker-compose.yml</w:t>
             </w:r>
           </w:p>
         </w:tc>
@@ -2887,15 +3844,10 @@
           <w:p>
             <w:r>
               <w:rPr>
-                <w:rFonts w:ascii="Calibri" w:cs="Calibri" w:eastAsia="Calibri" w:hAnsi="Calibri"/>
-                <w:b w:val="false"/>
-                <w:bCs w:val="false"/>
-                <w:i w:val="false"/>
-                <w:iCs w:val="false"/>
-                <w:sz w:val="19"/>
-                <w:szCs w:val="19"/>
-              </w:rPr>
-              <w:t xml:space="preserve"/>
+                <w:rFonts w:ascii="Calibri" w:hAnsi="Calibri"/>
+                <w:sz w:val="18"/>
+              </w:rPr>
+              <w:t>2</w:t>
             </w:r>
           </w:p>
         </w:tc>
@@ -2918,15 +3870,10 @@
           <w:p>
             <w:r>
               <w:rPr>
-                <w:rFonts w:ascii="Calibri" w:cs="Calibri" w:eastAsia="Calibri" w:hAnsi="Calibri"/>
-                <w:b w:val="false"/>
-                <w:bCs w:val="false"/>
-                <w:i w:val="false"/>
-                <w:iCs w:val="false"/>
-                <w:sz w:val="19"/>
-                <w:szCs w:val="19"/>
-              </w:rPr>
-              <w:t xml:space="preserve"/>
+                <w:rFonts w:ascii="Calibri" w:hAnsi="Calibri"/>
+                <w:sz w:val="18"/>
+              </w:rPr>
+              <w:t>DES-01</w:t>
             </w:r>
           </w:p>
         </w:tc>
@@ -2949,15 +3896,10 @@
           <w:p>
             <w:r>
               <w:rPr>
-                <w:rFonts w:ascii="Calibri" w:cs="Calibri" w:eastAsia="Calibri" w:hAnsi="Calibri"/>
-                <w:b w:val="false"/>
-                <w:bCs w:val="false"/>
-                <w:i w:val="false"/>
-                <w:iCs w:val="false"/>
-                <w:sz w:val="19"/>
-                <w:szCs w:val="19"/>
-              </w:rPr>
-              <w:t xml:space="preserve"/>
+                <w:rFonts w:ascii="Calibri" w:hAnsi="Calibri"/>
+                <w:sz w:val="18"/>
+              </w:rPr>
+              <w:t>SDD Chapter IV in Report7_Final Project Report.pdf is empty template text</w:t>
             </w:r>
           </w:p>
         </w:tc>
@@ -2982,15 +3924,10 @@
           <w:p>
             <w:r>
               <w:rPr>
-                <w:rFonts w:ascii="Calibri" w:cs="Calibri" w:eastAsia="Calibri" w:hAnsi="Calibri"/>
-                <w:b w:val="false"/>
-                <w:bCs w:val="false"/>
-                <w:i w:val="false"/>
-                <w:iCs w:val="false"/>
-                <w:sz w:val="19"/>
-                <w:szCs w:val="19"/>
-              </w:rPr>
-              <w:t xml:space="preserve"/>
+                <w:rFonts w:ascii="Calibri" w:hAnsi="Calibri"/>
+                <w:sz w:val="18"/>
+              </w:rPr>
+              <w:t>3</w:t>
             </w:r>
           </w:p>
         </w:tc>
@@ -3013,15 +3950,10 @@
           <w:p>
             <w:r>
               <w:rPr>
-                <w:rFonts w:ascii="Calibri" w:cs="Calibri" w:eastAsia="Calibri" w:hAnsi="Calibri"/>
-                <w:b w:val="false"/>
-                <w:bCs w:val="false"/>
-                <w:i w:val="false"/>
-                <w:iCs w:val="false"/>
-                <w:sz w:val="19"/>
-                <w:szCs w:val="19"/>
-              </w:rPr>
-              <w:t xml:space="preserve"/>
+                <w:rFonts w:ascii="Calibri" w:hAnsi="Calibri"/>
+                <w:sz w:val="18"/>
+              </w:rPr>
+              <w:t>DAT-02</w:t>
             </w:r>
           </w:p>
         </w:tc>
@@ -3044,15 +3976,10 @@
           <w:p>
             <w:r>
               <w:rPr>
-                <w:rFonts w:ascii="Calibri" w:cs="Calibri" w:eastAsia="Calibri" w:hAnsi="Calibri"/>
-                <w:b w:val="false"/>
-                <w:bCs w:val="false"/>
-                <w:i w:val="false"/>
-                <w:iCs w:val="false"/>
-                <w:sz w:val="19"/>
-                <w:szCs w:val="19"/>
-              </w:rPr>
-              <w:t xml:space="preserve"/>
+                <w:rFonts w:ascii="Calibri" w:hAnsi="Calibri"/>
+                <w:sz w:val="18"/>
+              </w:rPr>
+              <w:t>Schema &amp; attribute mismatches between Logical ERD and PostgreSQL SQL.sql</w:t>
             </w:r>
           </w:p>
         </w:tc>
@@ -3077,15 +4004,10 @@
           <w:p>
             <w:r>
               <w:rPr>
-                <w:rFonts w:ascii="Calibri" w:cs="Calibri" w:eastAsia="Calibri" w:hAnsi="Calibri"/>
-                <w:b w:val="false"/>
-                <w:bCs w:val="false"/>
-                <w:i w:val="false"/>
-                <w:iCs w:val="false"/>
-                <w:sz w:val="19"/>
-                <w:szCs w:val="19"/>
-              </w:rPr>
-              <w:t xml:space="preserve"/>
+                <w:rFonts w:ascii="Calibri" w:hAnsi="Calibri"/>
+                <w:sz w:val="18"/>
+              </w:rPr>
+              <w:t>4</w:t>
             </w:r>
           </w:p>
         </w:tc>
@@ -3108,15 +4030,10 @@
           <w:p>
             <w:r>
               <w:rPr>
-                <w:rFonts w:ascii="Calibri" w:cs="Calibri" w:eastAsia="Calibri" w:hAnsi="Calibri"/>
-                <w:b w:val="false"/>
-                <w:bCs w:val="false"/>
-                <w:i w:val="false"/>
-                <w:iCs w:val="false"/>
-                <w:sz w:val="19"/>
-                <w:szCs w:val="19"/>
-              </w:rPr>
-              <w:t xml:space="preserve"/>
+                <w:rFonts w:ascii="Calibri" w:hAnsi="Calibri"/>
+                <w:sz w:val="18"/>
+              </w:rPr>
+              <w:t>FLO-03</w:t>
             </w:r>
           </w:p>
         </w:tc>
@@ -3139,15 +4056,10 @@
           <w:p>
             <w:r>
               <w:rPr>
-                <w:rFonts w:ascii="Calibri" w:cs="Calibri" w:eastAsia="Calibri" w:hAnsi="Calibri"/>
-                <w:b w:val="false"/>
-                <w:bCs w:val="false"/>
-                <w:i w:val="false"/>
-                <w:iCs w:val="false"/>
-                <w:sz w:val="19"/>
-                <w:szCs w:val="19"/>
-              </w:rPr>
-              <w:t xml:space="preserve"/>
+                <w:rFonts w:ascii="Calibri" w:hAnsi="Calibri"/>
+                <w:sz w:val="18"/>
+              </w:rPr>
+              <w:t>Committed test deficit: 48 committed (34 in CI) vs only 16 C# unit tests in repo</w:t>
             </w:r>
           </w:p>
         </w:tc>
@@ -3172,15 +4084,10 @@
           <w:p>
             <w:r>
               <w:rPr>
-                <w:rFonts w:ascii="Calibri" w:cs="Calibri" w:eastAsia="Calibri" w:hAnsi="Calibri"/>
-                <w:b w:val="false"/>
-                <w:bCs w:val="false"/>
-                <w:i w:val="false"/>
-                <w:iCs w:val="false"/>
-                <w:sz w:val="19"/>
-                <w:szCs w:val="19"/>
-              </w:rPr>
-              <w:t xml:space="preserve"/>
+                <w:rFonts w:ascii="Calibri" w:hAnsi="Calibri"/>
+                <w:sz w:val="18"/>
+              </w:rPr>
+              <w:t>5</w:t>
             </w:r>
           </w:p>
         </w:tc>
@@ -3203,15 +4110,10 @@
           <w:p>
             <w:r>
               <w:rPr>
-                <w:rFonts w:ascii="Calibri" w:cs="Calibri" w:eastAsia="Calibri" w:hAnsi="Calibri"/>
-                <w:b w:val="false"/>
-                <w:bCs w:val="false"/>
-                <w:i w:val="false"/>
-                <w:iCs w:val="false"/>
-                <w:sz w:val="19"/>
-                <w:szCs w:val="19"/>
-              </w:rPr>
-              <w:t xml:space="preserve"/>
+                <w:rFonts w:ascii="Calibri" w:hAnsi="Calibri"/>
+                <w:sz w:val="18"/>
+              </w:rPr>
+              <w:t>SCO-01 &amp; SCO-02</w:t>
             </w:r>
           </w:p>
         </w:tc>
@@ -3234,15 +4136,10 @@
           <w:p>
             <w:r>
               <w:rPr>
-                <w:rFonts w:ascii="Calibri" w:cs="Calibri" w:eastAsia="Calibri" w:hAnsi="Calibri"/>
-                <w:b w:val="false"/>
-                <w:bCs w:val="false"/>
-                <w:i w:val="false"/>
-                <w:iCs w:val="false"/>
-                <w:sz w:val="19"/>
-                <w:szCs w:val="19"/>
-              </w:rPr>
-              <w:t xml:space="preserve"/>
+                <w:rFonts w:ascii="Calibri" w:hAnsi="Calibri"/>
+                <w:sz w:val="18"/>
+              </w:rPr>
+              <w:t>Scope conflict: Admission advisory &amp; disciplinary tracking in SRS contradicts BM01 Out-of-Scope</w:t>
             </w:r>
           </w:p>
         </w:tc>
@@ -3506,6 +4403,112 @@
           <w:p>
             <w:r>
               <w:rPr>
+                <w:rFonts w:ascii="Calibri" w:hAnsi="Calibri"/>
+                <w:sz w:val="19"/>
+              </w:rPr>
+              <w:t>10</w:t>
+            </w:r>
+          </w:p>
+        </w:tc>
+        <w:tc>
+          <w:tcPr>
+            <w:tcW w:type="dxa" w:w="1752"/>
+            <w:tcBorders>
+              <w:top w:val="single" w:color="D9D4CA" w:sz="4"/>
+              <w:left w:val="single" w:color="D9D4CA" w:sz="4"/>
+              <w:bottom w:val="single" w:color="D9D4CA" w:sz="4"/>
+              <w:right w:val="single" w:color="D9D4CA" w:sz="4"/>
+            </w:tcBorders>
+            <w:tcMar>
+              <w:top w:type="dxa" w:w="60"/>
+              <w:left w:type="dxa" w:w="80"/>
+              <w:bottom w:type="dxa" w:w="60"/>
+              <w:right w:type="dxa" w:w="80"/>
+            </w:tcMar>
+          </w:tcPr>
+          <w:p>
+            <w:r>
+              <w:rPr>
+                <w:rFonts w:ascii="Calibri" w:hAnsi="Calibri"/>
+                <w:sz w:val="19"/>
+              </w:rPr>
+              <w:t>0</w:t>
+            </w:r>
+          </w:p>
+        </w:tc>
+        <w:tc>
+          <w:tcPr>
+            <w:tcW w:type="dxa" w:w="1752"/>
+            <w:tcBorders>
+              <w:top w:val="single" w:color="D9D4CA" w:sz="4"/>
+              <w:left w:val="single" w:color="D9D4CA" w:sz="4"/>
+              <w:bottom w:val="single" w:color="D9D4CA" w:sz="4"/>
+              <w:right w:val="single" w:color="D9D4CA" w:sz="4"/>
+            </w:tcBorders>
+            <w:tcMar>
+              <w:top w:type="dxa" w:w="60"/>
+              <w:left w:type="dxa" w:w="80"/>
+              <w:bottom w:type="dxa" w:w="60"/>
+              <w:right w:type="dxa" w:w="80"/>
+            </w:tcMar>
+          </w:tcPr>
+          <w:p>
+            <w:r>
+              <w:rPr>
+                <w:rFonts w:ascii="Calibri" w:hAnsi="Calibri"/>
+                <w:sz w:val="19"/>
+              </w:rPr>
+              <w:t>1</w:t>
+            </w:r>
+          </w:p>
+        </w:tc>
+        <w:tc>
+          <w:tcPr>
+            <w:tcW w:type="dxa" w:w="1754"/>
+            <w:tcBorders>
+              <w:top w:val="single" w:color="D9D4CA" w:sz="4"/>
+              <w:left w:val="single" w:color="D9D4CA" w:sz="4"/>
+              <w:bottom w:val="single" w:color="D9D4CA" w:sz="4"/>
+              <w:right w:val="single" w:color="D9D4CA" w:sz="4"/>
+            </w:tcBorders>
+            <w:tcMar>
+              <w:top w:type="dxa" w:w="60"/>
+              <w:left w:type="dxa" w:w="80"/>
+              <w:bottom w:type="dxa" w:w="60"/>
+              <w:right w:type="dxa" w:w="80"/>
+            </w:tcMar>
+          </w:tcPr>
+          <w:p>
+            <w:r>
+              <w:rPr>
+                <w:rFonts w:ascii="Calibri" w:hAnsi="Calibri"/>
+                <w:sz w:val="19"/>
+              </w:rPr>
+              <w:t>9</w:t>
+            </w:r>
+          </w:p>
+        </w:tc>
+      </w:tr>
+      <w:tr>
+        <w:tc>
+          <w:tcPr>
+            <w:tcW w:type="dxa" w:w="2628"/>
+            <w:tcBorders>
+              <w:top w:val="single" w:color="D9D4CA" w:sz="4"/>
+              <w:left w:val="single" w:color="D9D4CA" w:sz="4"/>
+              <w:bottom w:val="single" w:color="D9D4CA" w:sz="4"/>
+              <w:right w:val="single" w:color="D9D4CA" w:sz="4"/>
+            </w:tcBorders>
+            <w:tcMar>
+              <w:top w:type="dxa" w:w="60"/>
+              <w:left w:type="dxa" w:w="80"/>
+              <w:bottom w:type="dxa" w:w="60"/>
+              <w:right w:type="dxa" w:w="80"/>
+            </w:tcMar>
+          </w:tcPr>
+          <w:p>
+            <w:r>
+              <w:rPr>
                 <w:rFonts w:ascii="Calibri" w:cs="Calibri" w:eastAsia="Calibri" w:hAnsi="Calibri"/>
                 <w:b w:val="false"/>
                 <w:bCs w:val="false"/>
@@ -3515,13 +4518,119 @@
                 <w:sz w:val="19"/>
                 <w:szCs w:val="19"/>
               </w:rPr>
-              <w:t xml:space="preserve"/>
+              <w:t xml:space="preserve">Medium</w:t>
             </w:r>
           </w:p>
         </w:tc>
         <w:tc>
           <w:tcPr>
             <w:tcW w:type="dxa" w:w="1752"/>
+            <w:tcBorders>
+              <w:top w:val="single" w:color="D9D4CA" w:sz="4"/>
+              <w:left w:val="single" w:color="D9D4CA" w:sz="4"/>
+              <w:bottom w:val="single" w:color="D9D4CA" w:sz="4"/>
+              <w:right w:val="single" w:color="D9D4CA" w:sz="4"/>
+            </w:tcBorders>
+            <w:tcMar>
+              <w:top w:type="dxa" w:w="60"/>
+              <w:left w:type="dxa" w:w="80"/>
+              <w:bottom w:type="dxa" w:w="60"/>
+              <w:right w:type="dxa" w:w="80"/>
+            </w:tcMar>
+          </w:tcPr>
+          <w:p>
+            <w:r>
+              <w:rPr>
+                <w:rFonts w:ascii="Calibri" w:hAnsi="Calibri"/>
+                <w:sz w:val="19"/>
+              </w:rPr>
+              <w:t>9</w:t>
+            </w:r>
+          </w:p>
+        </w:tc>
+        <w:tc>
+          <w:tcPr>
+            <w:tcW w:type="dxa" w:w="1752"/>
+            <w:tcBorders>
+              <w:top w:val="single" w:color="D9D4CA" w:sz="4"/>
+              <w:left w:val="single" w:color="D9D4CA" w:sz="4"/>
+              <w:bottom w:val="single" w:color="D9D4CA" w:sz="4"/>
+              <w:right w:val="single" w:color="D9D4CA" w:sz="4"/>
+            </w:tcBorders>
+            <w:tcMar>
+              <w:top w:type="dxa" w:w="60"/>
+              <w:left w:type="dxa" w:w="80"/>
+              <w:bottom w:type="dxa" w:w="60"/>
+              <w:right w:type="dxa" w:w="80"/>
+            </w:tcMar>
+          </w:tcPr>
+          <w:p>
+            <w:r>
+              <w:rPr>
+                <w:rFonts w:ascii="Calibri" w:hAnsi="Calibri"/>
+                <w:sz w:val="19"/>
+              </w:rPr>
+              <w:t>0</w:t>
+            </w:r>
+          </w:p>
+        </w:tc>
+        <w:tc>
+          <w:tcPr>
+            <w:tcW w:type="dxa" w:w="1752"/>
+            <w:tcBorders>
+              <w:top w:val="single" w:color="D9D4CA" w:sz="4"/>
+              <w:left w:val="single" w:color="D9D4CA" w:sz="4"/>
+              <w:bottom w:val="single" w:color="D9D4CA" w:sz="4"/>
+              <w:right w:val="single" w:color="D9D4CA" w:sz="4"/>
+            </w:tcBorders>
+            <w:tcMar>
+              <w:top w:type="dxa" w:w="60"/>
+              <w:left w:type="dxa" w:w="80"/>
+              <w:bottom w:type="dxa" w:w="60"/>
+              <w:right w:type="dxa" w:w="80"/>
+            </w:tcMar>
+          </w:tcPr>
+          <w:p>
+            <w:r>
+              <w:rPr>
+                <w:rFonts w:ascii="Calibri" w:hAnsi="Calibri"/>
+                <w:sz w:val="19"/>
+              </w:rPr>
+              <w:t>3</w:t>
+            </w:r>
+          </w:p>
+        </w:tc>
+        <w:tc>
+          <w:tcPr>
+            <w:tcW w:type="dxa" w:w="1754"/>
+            <w:tcBorders>
+              <w:top w:val="single" w:color="D9D4CA" w:sz="4"/>
+              <w:left w:val="single" w:color="D9D4CA" w:sz="4"/>
+              <w:bottom w:val="single" w:color="D9D4CA" w:sz="4"/>
+              <w:right w:val="single" w:color="D9D4CA" w:sz="4"/>
+            </w:tcBorders>
+            <w:tcMar>
+              <w:top w:type="dxa" w:w="60"/>
+              <w:left w:type="dxa" w:w="80"/>
+              <w:bottom w:type="dxa" w:w="60"/>
+              <w:right w:type="dxa" w:w="80"/>
+            </w:tcMar>
+          </w:tcPr>
+          <w:p>
+            <w:r>
+              <w:rPr>
+                <w:rFonts w:ascii="Calibri" w:hAnsi="Calibri"/>
+                <w:sz w:val="19"/>
+              </w:rPr>
+              <w:t>6</w:t>
+            </w:r>
+          </w:p>
+        </w:tc>
+      </w:tr>
+      <w:tr>
+        <w:tc>
+          <w:tcPr>
+            <w:tcW w:type="dxa" w:w="2628"/>
             <w:tcBorders>
               <w:top w:val="single" w:color="D9D4CA" w:sz="4"/>
               <w:left w:val="single" w:color="D9D4CA" w:sz="4"/>
@@ -3547,7 +4656,7 @@
                 <w:sz w:val="19"/>
                 <w:szCs w:val="19"/>
               </w:rPr>
-              <w:t xml:space="preserve"/>
+              <w:t xml:space="preserve">Low</w:t>
             </w:r>
           </w:p>
         </w:tc>
@@ -3570,16 +4679,62 @@
           <w:p>
             <w:r>
               <w:rPr>
-                <w:rFonts w:ascii="Calibri" w:cs="Calibri" w:eastAsia="Calibri" w:hAnsi="Calibri"/>
-                <w:b w:val="false"/>
-                <w:bCs w:val="false"/>
-                <w:i/>
-                <w:iCs/>
-                <w:color w:val="666666"/>
+                <w:rFonts w:ascii="Calibri" w:hAnsi="Calibri"/>
                 <w:sz w:val="19"/>
-                <w:szCs w:val="19"/>
-              </w:rPr>
-              <w:t xml:space="preserve"/>
+              </w:rPr>
+              <w:t>4</w:t>
+            </w:r>
+          </w:p>
+        </w:tc>
+        <w:tc>
+          <w:tcPr>
+            <w:tcW w:type="dxa" w:w="1752"/>
+            <w:tcBorders>
+              <w:top w:val="single" w:color="D9D4CA" w:sz="4"/>
+              <w:left w:val="single" w:color="D9D4CA" w:sz="4"/>
+              <w:bottom w:val="single" w:color="D9D4CA" w:sz="4"/>
+              <w:right w:val="single" w:color="D9D4CA" w:sz="4"/>
+            </w:tcBorders>
+            <w:tcMar>
+              <w:top w:type="dxa" w:w="60"/>
+              <w:left w:type="dxa" w:w="80"/>
+              <w:bottom w:type="dxa" w:w="60"/>
+              <w:right w:type="dxa" w:w="80"/>
+            </w:tcMar>
+          </w:tcPr>
+          <w:p>
+            <w:r>
+              <w:rPr>
+                <w:rFonts w:ascii="Calibri" w:hAnsi="Calibri"/>
+                <w:sz w:val="19"/>
+              </w:rPr>
+              <w:t>1</w:t>
+            </w:r>
+          </w:p>
+        </w:tc>
+        <w:tc>
+          <w:tcPr>
+            <w:tcW w:type="dxa" w:w="1752"/>
+            <w:tcBorders>
+              <w:top w:val="single" w:color="D9D4CA" w:sz="4"/>
+              <w:left w:val="single" w:color="D9D4CA" w:sz="4"/>
+              <w:bottom w:val="single" w:color="D9D4CA" w:sz="4"/>
+              <w:right w:val="single" w:color="D9D4CA" w:sz="4"/>
+            </w:tcBorders>
+            <w:tcMar>
+              <w:top w:type="dxa" w:w="60"/>
+              <w:left w:type="dxa" w:w="80"/>
+              <w:bottom w:type="dxa" w:w="60"/>
+              <w:right w:type="dxa" w:w="80"/>
+            </w:tcMar>
+          </w:tcPr>
+          <w:p>
+            <w:r>
+              <w:rPr>
+                <w:rFonts w:ascii="Calibri" w:hAnsi="Calibri"/>
+                <w:sz w:val="19"/>
+              </w:rPr>
+              <w:t>1</w:t>
             </w:r>
           </w:p>
         </w:tc>
@@ -3602,340 +4757,10 @@
           <w:p>
             <w:r>
               <w:rPr>
-                <w:rFonts w:ascii="Calibri" w:cs="Calibri" w:eastAsia="Calibri" w:hAnsi="Calibri"/>
-                <w:b w:val="false"/>
-                <w:bCs w:val="false"/>
-                <w:i/>
-                <w:iCs/>
-                <w:color w:val="666666"/>
+                <w:rFonts w:ascii="Calibri" w:hAnsi="Calibri"/>
                 <w:sz w:val="19"/>
-                <w:szCs w:val="19"/>
-              </w:rPr>
-              <w:t xml:space="preserve"/>
-            </w:r>
-          </w:p>
-        </w:tc>
-      </w:tr>
-      <w:tr>
-        <w:tc>
-          <w:tcPr>
-            <w:tcW w:type="dxa" w:w="2628"/>
-            <w:tcBorders>
-              <w:top w:val="single" w:color="D9D4CA" w:sz="4"/>
-              <w:left w:val="single" w:color="D9D4CA" w:sz="4"/>
-              <w:bottom w:val="single" w:color="D9D4CA" w:sz="4"/>
-              <w:right w:val="single" w:color="D9D4CA" w:sz="4"/>
-            </w:tcBorders>
-            <w:tcMar>
-              <w:top w:type="dxa" w:w="60"/>
-              <w:left w:type="dxa" w:w="80"/>
-              <w:bottom w:type="dxa" w:w="60"/>
-              <w:right w:type="dxa" w:w="80"/>
-            </w:tcMar>
-          </w:tcPr>
-          <w:p>
-            <w:r>
-              <w:rPr>
-                <w:rFonts w:ascii="Calibri" w:cs="Calibri" w:eastAsia="Calibri" w:hAnsi="Calibri"/>
-                <w:b w:val="false"/>
-                <w:bCs w:val="false"/>
-                <w:i/>
-                <w:iCs/>
-                <w:color w:val="666666"/>
-                <w:sz w:val="19"/>
-                <w:szCs w:val="19"/>
-              </w:rPr>
-              <w:t xml:space="preserve">Medium</w:t>
-            </w:r>
-          </w:p>
-        </w:tc>
-        <w:tc>
-          <w:tcPr>
-            <w:tcW w:type="dxa" w:w="1752"/>
-            <w:tcBorders>
-              <w:top w:val="single" w:color="D9D4CA" w:sz="4"/>
-              <w:left w:val="single" w:color="D9D4CA" w:sz="4"/>
-              <w:bottom w:val="single" w:color="D9D4CA" w:sz="4"/>
-              <w:right w:val="single" w:color="D9D4CA" w:sz="4"/>
-            </w:tcBorders>
-            <w:tcMar>
-              <w:top w:type="dxa" w:w="60"/>
-              <w:left w:type="dxa" w:w="80"/>
-              <w:bottom w:type="dxa" w:w="60"/>
-              <w:right w:type="dxa" w:w="80"/>
-            </w:tcMar>
-          </w:tcPr>
-          <w:p>
-            <w:r>
-              <w:rPr>
-                <w:rFonts w:ascii="Calibri" w:cs="Calibri" w:eastAsia="Calibri" w:hAnsi="Calibri"/>
-                <w:b w:val="false"/>
-                <w:bCs w:val="false"/>
-                <w:i/>
-                <w:iCs/>
-                <w:color w:val="666666"/>
-                <w:sz w:val="19"/>
-                <w:szCs w:val="19"/>
-              </w:rPr>
-              <w:t xml:space="preserve"/>
-            </w:r>
-          </w:p>
-        </w:tc>
-        <w:tc>
-          <w:tcPr>
-            <w:tcW w:type="dxa" w:w="1752"/>
-            <w:tcBorders>
-              <w:top w:val="single" w:color="D9D4CA" w:sz="4"/>
-              <w:left w:val="single" w:color="D9D4CA" w:sz="4"/>
-              <w:bottom w:val="single" w:color="D9D4CA" w:sz="4"/>
-              <w:right w:val="single" w:color="D9D4CA" w:sz="4"/>
-            </w:tcBorders>
-            <w:tcMar>
-              <w:top w:type="dxa" w:w="60"/>
-              <w:left w:type="dxa" w:w="80"/>
-              <w:bottom w:type="dxa" w:w="60"/>
-              <w:right w:type="dxa" w:w="80"/>
-            </w:tcMar>
-          </w:tcPr>
-          <w:p>
-            <w:r>
-              <w:rPr>
-                <w:rFonts w:ascii="Calibri" w:cs="Calibri" w:eastAsia="Calibri" w:hAnsi="Calibri"/>
-                <w:b w:val="false"/>
-                <w:bCs w:val="false"/>
-                <w:i/>
-                <w:iCs/>
-                <w:color w:val="666666"/>
-                <w:sz w:val="19"/>
-                <w:szCs w:val="19"/>
-              </w:rPr>
-              <w:t xml:space="preserve"/>
-            </w:r>
-          </w:p>
-        </w:tc>
-        <w:tc>
-          <w:tcPr>
-            <w:tcW w:type="dxa" w:w="1752"/>
-            <w:tcBorders>
-              <w:top w:val="single" w:color="D9D4CA" w:sz="4"/>
-              <w:left w:val="single" w:color="D9D4CA" w:sz="4"/>
-              <w:bottom w:val="single" w:color="D9D4CA" w:sz="4"/>
-              <w:right w:val="single" w:color="D9D4CA" w:sz="4"/>
-            </w:tcBorders>
-            <w:tcMar>
-              <w:top w:type="dxa" w:w="60"/>
-              <w:left w:type="dxa" w:w="80"/>
-              <w:bottom w:type="dxa" w:w="60"/>
-              <w:right w:type="dxa" w:w="80"/>
-            </w:tcMar>
-          </w:tcPr>
-          <w:p>
-            <w:r>
-              <w:rPr>
-                <w:rFonts w:ascii="Calibri" w:cs="Calibri" w:eastAsia="Calibri" w:hAnsi="Calibri"/>
-                <w:b w:val="false"/>
-                <w:bCs w:val="false"/>
-                <w:i/>
-                <w:iCs/>
-                <w:color w:val="666666"/>
-                <w:sz w:val="19"/>
-                <w:szCs w:val="19"/>
-              </w:rPr>
-              <w:t xml:space="preserve"/>
-            </w:r>
-          </w:p>
-        </w:tc>
-        <w:tc>
-          <w:tcPr>
-            <w:tcW w:type="dxa" w:w="1754"/>
-            <w:tcBorders>
-              <w:top w:val="single" w:color="D9D4CA" w:sz="4"/>
-              <w:left w:val="single" w:color="D9D4CA" w:sz="4"/>
-              <w:bottom w:val="single" w:color="D9D4CA" w:sz="4"/>
-              <w:right w:val="single" w:color="D9D4CA" w:sz="4"/>
-            </w:tcBorders>
-            <w:tcMar>
-              <w:top w:type="dxa" w:w="60"/>
-              <w:left w:type="dxa" w:w="80"/>
-              <w:bottom w:type="dxa" w:w="60"/>
-              <w:right w:type="dxa" w:w="80"/>
-            </w:tcMar>
-          </w:tcPr>
-          <w:p>
-            <w:r>
-              <w:rPr>
-                <w:rFonts w:ascii="Calibri" w:cs="Calibri" w:eastAsia="Calibri" w:hAnsi="Calibri"/>
-                <w:b w:val="false"/>
-                <w:bCs w:val="false"/>
-                <w:i/>
-                <w:iCs/>
-                <w:color w:val="666666"/>
-                <w:sz w:val="19"/>
-                <w:szCs w:val="19"/>
-              </w:rPr>
-              <w:t xml:space="preserve"/>
-            </w:r>
-          </w:p>
-        </w:tc>
-      </w:tr>
-      <w:tr>
-        <w:tc>
-          <w:tcPr>
-            <w:tcW w:type="dxa" w:w="2628"/>
-            <w:tcBorders>
-              <w:top w:val="single" w:color="D9D4CA" w:sz="4"/>
-              <w:left w:val="single" w:color="D9D4CA" w:sz="4"/>
-              <w:bottom w:val="single" w:color="D9D4CA" w:sz="4"/>
-              <w:right w:val="single" w:color="D9D4CA" w:sz="4"/>
-            </w:tcBorders>
-            <w:tcMar>
-              <w:top w:type="dxa" w:w="60"/>
-              <w:left w:type="dxa" w:w="80"/>
-              <w:bottom w:type="dxa" w:w="60"/>
-              <w:right w:type="dxa" w:w="80"/>
-            </w:tcMar>
-          </w:tcPr>
-          <w:p>
-            <w:r>
-              <w:rPr>
-                <w:rFonts w:ascii="Calibri" w:cs="Calibri" w:eastAsia="Calibri" w:hAnsi="Calibri"/>
-                <w:b w:val="false"/>
-                <w:bCs w:val="false"/>
-                <w:i/>
-                <w:iCs/>
-                <w:color w:val="666666"/>
-                <w:sz w:val="19"/>
-                <w:szCs w:val="19"/>
-              </w:rPr>
-              <w:t xml:space="preserve">Low</w:t>
-            </w:r>
-          </w:p>
-        </w:tc>
-        <w:tc>
-          <w:tcPr>
-            <w:tcW w:type="dxa" w:w="1752"/>
-            <w:tcBorders>
-              <w:top w:val="single" w:color="D9D4CA" w:sz="4"/>
-              <w:left w:val="single" w:color="D9D4CA" w:sz="4"/>
-              <w:bottom w:val="single" w:color="D9D4CA" w:sz="4"/>
-              <w:right w:val="single" w:color="D9D4CA" w:sz="4"/>
-            </w:tcBorders>
-            <w:tcMar>
-              <w:top w:type="dxa" w:w="60"/>
-              <w:left w:type="dxa" w:w="80"/>
-              <w:bottom w:type="dxa" w:w="60"/>
-              <w:right w:type="dxa" w:w="80"/>
-            </w:tcMar>
-          </w:tcPr>
-          <w:p>
-            <w:r>
-              <w:rPr>
-                <w:rFonts w:ascii="Calibri" w:cs="Calibri" w:eastAsia="Calibri" w:hAnsi="Calibri"/>
-                <w:b w:val="false"/>
-                <w:bCs w:val="false"/>
-                <w:i/>
-                <w:iCs/>
-                <w:color w:val="666666"/>
-                <w:sz w:val="19"/>
-                <w:szCs w:val="19"/>
-              </w:rPr>
-              <w:t xml:space="preserve"/>
-            </w:r>
-          </w:p>
-        </w:tc>
-        <w:tc>
-          <w:tcPr>
-            <w:tcW w:type="dxa" w:w="1752"/>
-            <w:tcBorders>
-              <w:top w:val="single" w:color="D9D4CA" w:sz="4"/>
-              <w:left w:val="single" w:color="D9D4CA" w:sz="4"/>
-              <w:bottom w:val="single" w:color="D9D4CA" w:sz="4"/>
-              <w:right w:val="single" w:color="D9D4CA" w:sz="4"/>
-            </w:tcBorders>
-            <w:tcMar>
-              <w:top w:type="dxa" w:w="60"/>
-              <w:left w:type="dxa" w:w="80"/>
-              <w:bottom w:type="dxa" w:w="60"/>
-              <w:right w:type="dxa" w:w="80"/>
-            </w:tcMar>
-          </w:tcPr>
-          <w:p>
-            <w:r>
-              <w:rPr>
-                <w:rFonts w:ascii="Calibri" w:cs="Calibri" w:eastAsia="Calibri" w:hAnsi="Calibri"/>
-                <w:b w:val="false"/>
-                <w:bCs w:val="false"/>
-                <w:i/>
-                <w:iCs/>
-                <w:color w:val="666666"/>
-                <w:sz w:val="19"/>
-                <w:szCs w:val="19"/>
-              </w:rPr>
-              <w:t xml:space="preserve"/>
-            </w:r>
-          </w:p>
-        </w:tc>
-        <w:tc>
-          <w:tcPr>
-            <w:tcW w:type="dxa" w:w="1752"/>
-            <w:tcBorders>
-              <w:top w:val="single" w:color="D9D4CA" w:sz="4"/>
-              <w:left w:val="single" w:color="D9D4CA" w:sz="4"/>
-              <w:bottom w:val="single" w:color="D9D4CA" w:sz="4"/>
-              <w:right w:val="single" w:color="D9D4CA" w:sz="4"/>
-            </w:tcBorders>
-            <w:tcMar>
-              <w:top w:type="dxa" w:w="60"/>
-              <w:left w:type="dxa" w:w="80"/>
-              <w:bottom w:type="dxa" w:w="60"/>
-              <w:right w:type="dxa" w:w="80"/>
-            </w:tcMar>
-          </w:tcPr>
-          <w:p>
-            <w:r>
-              <w:rPr>
-                <w:rFonts w:ascii="Calibri" w:cs="Calibri" w:eastAsia="Calibri" w:hAnsi="Calibri"/>
-                <w:b w:val="false"/>
-                <w:bCs w:val="false"/>
-                <w:i/>
-                <w:iCs/>
-                <w:color w:val="666666"/>
-                <w:sz w:val="19"/>
-                <w:szCs w:val="19"/>
-              </w:rPr>
-              <w:t xml:space="preserve"/>
-            </w:r>
-          </w:p>
-        </w:tc>
-        <w:tc>
-          <w:tcPr>
-            <w:tcW w:type="dxa" w:w="1754"/>
-            <w:tcBorders>
-              <w:top w:val="single" w:color="D9D4CA" w:sz="4"/>
-              <w:left w:val="single" w:color="D9D4CA" w:sz="4"/>
-              <w:bottom w:val="single" w:color="D9D4CA" w:sz="4"/>
-              <w:right w:val="single" w:color="D9D4CA" w:sz="4"/>
-            </w:tcBorders>
-            <w:tcMar>
-              <w:top w:type="dxa" w:w="60"/>
-              <w:left w:type="dxa" w:w="80"/>
-              <w:bottom w:type="dxa" w:w="60"/>
-              <w:right w:type="dxa" w:w="80"/>
-            </w:tcMar>
-          </w:tcPr>
-          <w:p>
-            <w:r>
-              <w:rPr>
-                <w:rFonts w:ascii="Calibri" w:cs="Calibri" w:eastAsia="Calibri" w:hAnsi="Calibri"/>
-                <w:b w:val="false"/>
-                <w:bCs w:val="false"/>
-                <w:i/>
-                <w:iCs/>
-                <w:color w:val="666666"/>
-                <w:sz w:val="19"/>
-                <w:szCs w:val="19"/>
-              </w:rPr>
-              <w:t xml:space="preserve"/>
+              </w:rPr>
+              <w:t>2</w:t>
             </w:r>
           </w:p>
         </w:tc>

</xml_diff>